<commit_message>
docs: Bo sung phan tich chuyen sau 6 Truc Toi Uu Moi Mat, Ma tran Kiem thu va Bang doi chuan Before/After
</commit_message>
<xml_diff>
--- a/Bao_Cao_Thuc_Tap.docx
+++ b/Bao_Cao_Thuc_Tap.docx
@@ -68,7 +68,7 @@
         <w:br/>
         <w:t>BẰNG AI VÀ TỐI ƯU MỌI MẶT</w:t>
         <w:br/>
-        <w:t>(MÔ HÌNH HEADLESS WORDPRESS KẾT HỢP NEXT.JS VÀ AI CONTENT ENGINE)</w:t>
+        <w:t>(MÔ HÌNH HEADLESS WORDPRESS KẾT HỢP NEXT.JS 14 VÀ AI CONTENT ENGINE)</w:t>
       </w:r>
     </w:p>
     <w:p/>
@@ -352,7 +352,7 @@
     <w:p>
       <w:pPr>
         <w:keepNext/>
-        <w:spacing w:before="320" w:after="160"/>
+        <w:spacing w:before="360" w:after="160"/>
       </w:pPr>
       <w:r>
         <w:rPr>
@@ -415,7 +415,7 @@
     <w:p>
       <w:pPr>
         <w:keepNext/>
-        <w:spacing w:before="320" w:after="160"/>
+        <w:spacing w:before="360" w:after="160"/>
       </w:pPr>
       <w:r>
         <w:rPr>
@@ -553,7 +553,7 @@
     <w:p>
       <w:pPr>
         <w:keepNext/>
-        <w:spacing w:before="320" w:after="160"/>
+        <w:spacing w:before="360" w:after="160"/>
       </w:pPr>
       <w:r>
         <w:rPr>
@@ -909,7 +909,7 @@
     <w:p>
       <w:pPr>
         <w:keepNext/>
-        <w:spacing w:before="320" w:after="160"/>
+        <w:spacing w:before="360" w:after="160"/>
       </w:pPr>
       <w:r>
         <w:rPr>
@@ -924,7 +924,7 @@
     <w:p>
       <w:pPr>
         <w:keepNext/>
-        <w:spacing w:before="240" w:after="120"/>
+        <w:spacing w:before="260" w:after="120"/>
       </w:pPr>
       <w:r>
         <w:rPr>
@@ -971,7 +971,7 @@
     <w:p>
       <w:pPr>
         <w:keepNext/>
-        <w:spacing w:before="240" w:after="120"/>
+        <w:spacing w:before="260" w:after="120"/>
       </w:pPr>
       <w:r>
         <w:rPr>
@@ -1178,7 +1178,7 @@
     <w:p>
       <w:pPr>
         <w:keepNext/>
-        <w:spacing w:before="240" w:after="120"/>
+        <w:spacing w:before="260" w:after="120"/>
       </w:pPr>
       <w:r>
         <w:rPr>
@@ -1380,7 +1380,7 @@
                 <w:rFonts w:ascii="Times New Roman" w:hAnsi="Times New Roman"/>
                 <w:b w:val="0"/>
                 <w:i w:val="0"/>
-                <w:sz w:val="22"/>
+                <w:sz w:val="21"/>
               </w:rPr>
               <w:t>1</w:t>
             </w:r>
@@ -1401,7 +1401,7 @@
                 <w:rFonts w:ascii="Times New Roman" w:hAnsi="Times New Roman"/>
                 <w:b w:val="0"/>
                 <w:i w:val="0"/>
-                <w:sz w:val="22"/>
+                <w:sz w:val="21"/>
               </w:rPr>
               <w:t>Đặng Minh Tuấn</w:t>
               <w:br/>
@@ -1424,7 +1424,7 @@
                 <w:rFonts w:ascii="Times New Roman" w:hAnsi="Times New Roman"/>
                 <w:b w:val="0"/>
                 <w:i w:val="0"/>
-                <w:sz w:val="22"/>
+                <w:sz w:val="21"/>
               </w:rPr>
               <w:t>Khảo sát bài toán, thiết kế kiến trúc Decoupled Headless, lập trình cỗ máy AI Content Engine (ai_engine.js, auto_cron.js), tích hợp bảo mật REST API, chịu trách nhiệm chính về chất lượng và tiến độ tổng thể.</w:t>
             </w:r>
@@ -1445,7 +1445,7 @@
                 <w:rFonts w:ascii="Times New Roman" w:hAnsi="Times New Roman"/>
                 <w:b w:val="0"/>
                 <w:i w:val="0"/>
-                <w:sz w:val="22"/>
+                <w:sz w:val="21"/>
               </w:rPr>
               <w:t>Nhóm trưởng</w:t>
               <w:br/>
@@ -1470,7 +1470,7 @@
                 <w:rFonts w:ascii="Times New Roman" w:hAnsi="Times New Roman"/>
                 <w:b w:val="0"/>
                 <w:i w:val="0"/>
-                <w:sz w:val="22"/>
+                <w:sz w:val="21"/>
               </w:rPr>
               <w:t>2</w:t>
             </w:r>
@@ -1491,7 +1491,7 @@
                 <w:rFonts w:ascii="Times New Roman" w:hAnsi="Times New Roman"/>
                 <w:b w:val="0"/>
                 <w:i w:val="0"/>
-                <w:sz w:val="22"/>
+                <w:sz w:val="21"/>
               </w:rPr>
               <w:t>Trần Anh Tuấn</w:t>
               <w:br/>
@@ -1514,7 +1514,7 @@
                 <w:rFonts w:ascii="Times New Roman" w:hAnsi="Times New Roman"/>
                 <w:b w:val="0"/>
                 <w:i w:val="0"/>
-                <w:sz w:val="22"/>
+                <w:sz w:val="21"/>
               </w:rPr>
               <w:t>Đặc tả Use Case, thiết kế cơ sở dữ liệu MySQL, xây dựng Schema GraphQL, xử lý module trích xuất văn bản RAG, viết tài liệu kiểm thử và nhật ký kỹ thuật.</w:t>
             </w:r>
@@ -1535,7 +1535,7 @@
                 <w:rFonts w:ascii="Times New Roman" w:hAnsi="Times New Roman"/>
                 <w:b w:val="0"/>
                 <w:i w:val="0"/>
-                <w:sz w:val="22"/>
+                <w:sz w:val="21"/>
               </w:rPr>
               <w:t>Thành viên</w:t>
               <w:br/>
@@ -1560,7 +1560,7 @@
                 <w:rFonts w:ascii="Times New Roman" w:hAnsi="Times New Roman"/>
                 <w:b w:val="0"/>
                 <w:i w:val="0"/>
-                <w:sz w:val="22"/>
+                <w:sz w:val="21"/>
               </w:rPr>
               <w:t>3</w:t>
             </w:r>
@@ -1581,7 +1581,7 @@
                 <w:rFonts w:ascii="Times New Roman" w:hAnsi="Times New Roman"/>
                 <w:b w:val="0"/>
                 <w:i w:val="0"/>
-                <w:sz w:val="22"/>
+                <w:sz w:val="21"/>
               </w:rPr>
               <w:t>Nguyễn Minh Hiếu</w:t>
               <w:br/>
@@ -1604,7 +1604,7 @@
                 <w:rFonts w:ascii="Times New Roman" w:hAnsi="Times New Roman"/>
                 <w:b w:val="0"/>
                 <w:i w:val="0"/>
-                <w:sz w:val="22"/>
+                <w:sz w:val="21"/>
               </w:rPr>
               <w:t>Thiết kế UI/UX Dark Mode, lập trình Frontend Next.js 14 với Faust.js, tối ưu hóa chỉ số Google Lighthouse 100/100, viết sách hướng dẫn vận hành và kịch bản demo.</w:t>
             </w:r>
@@ -1625,7 +1625,7 @@
                 <w:rFonts w:ascii="Times New Roman" w:hAnsi="Times New Roman"/>
                 <w:b w:val="0"/>
                 <w:i w:val="0"/>
-                <w:sz w:val="22"/>
+                <w:sz w:val="21"/>
               </w:rPr>
               <w:t>Thành viên</w:t>
               <w:br/>
@@ -1643,7 +1643,7 @@
     <w:p>
       <w:pPr>
         <w:keepNext/>
-        <w:spacing w:before="320" w:after="160"/>
+        <w:spacing w:before="360" w:after="160"/>
       </w:pPr>
       <w:r>
         <w:rPr>
@@ -1658,7 +1658,7 @@
     <w:p>
       <w:pPr>
         <w:keepNext/>
-        <w:spacing w:before="240" w:after="120"/>
+        <w:spacing w:before="260" w:after="120"/>
       </w:pPr>
       <w:r>
         <w:rPr>
@@ -1667,7 +1667,7 @@
           <w:i w:val="0"/>
           <w:sz w:val="26"/>
         </w:rPr>
-        <w:t>2.1. Khảo sát hiện trạng và các nút thắt của website truyền thống</w:t>
+        <w:t>2.1. Khảo sát hiện trạng và định nghĩa bài toán 'Tối ưu mọi mặt'</w:t>
       </w:r>
     </w:p>
     <w:p>
@@ -1683,7 +1683,7 @@
           <w:i w:val="0"/>
           <w:sz w:val="26"/>
         </w:rPr>
-        <w:t>Trong giai đoạn khảo sát thực tế tại Hừng Đông Media và hơn 30 website đối tác, nhóm đã thực hiện đo lường hiệu năng chuyên sâu bằng công cụ kiểm định tiêu chuẩn quốc tế Google Lighthouse. Kết quả cho thấy 100% website sử dụng mã nguồn Monolithic WordPress truyền thống đều gặp phải các vấn đề nghiêm trọng về hiệu năng (điểm số báo động đỏ dưới 45/100):</w:t>
+        <w:t>Trong đề tài nghiên cứu tốt nghiệp, khái niệm 'Tối ưu mọi mặt' không dừng lại ở một khẩu hiệu chung chung mà được nhóm định nghĩa thành một hệ thống kỹ thuật gồm 6 Trục Tối Ưu Toàn Diện (6-Axis Holistic Optimization). Khi khảo sát thực tế tại Hừng Đông Media và hơn 30 website đối tác sử dụng mã nguồn Monolithic WordPress truyền thống, nhóm đã phát hiện 100% hệ thống đều gặp phải các nút thắt trầm trọng trên toàn bộ 6 khía cạnh này:</w:t>
       </w:r>
     </w:p>
     <w:p>
@@ -1744,6 +1744,21 @@
     </w:p>
     <w:p>
       <w:pPr>
+        <w:keepNext/>
+        <w:spacing w:before="180" w:after="80"/>
+      </w:pPr>
+      <w:r>
+        <w:rPr>
+          <w:rFonts w:ascii="Times New Roman" w:hAnsi="Times New Roman"/>
+          <w:b/>
+          <w:i/>
+          <w:sz w:val="26"/>
+        </w:rPr>
+        <w:t>2.1.1. Trục 1: Nút thắt về Tốc độ và Hiệu năng Tải trang (Performance &amp; Core Web Vitals)</w:t>
+      </w:r>
+    </w:p>
+    <w:p>
+      <w:pPr>
         <w:spacing w:line="312" w:lineRule="auto" w:after="100"/>
         <w:ind w:firstLine="720"/>
         <w:jc w:val="both"/>
@@ -1755,25 +1770,30 @@
           <w:i w:val="0"/>
           <w:sz w:val="26"/>
         </w:rPr>
-        <w:t>Phân tích 4 nút thắt nghiêm trọng của mô hình truyền thống:</w:t>
+        <w:t>Hệ thống cũ vận hành theo kiến trúc khối đơn (Monolithic). Mỗi khi người dùng yêu cầu xem một bài viết, máy chủ Apache/PHP phải thực hiện thông dịch mã nguồn động, tải cùng lúc hơn 25 plugins cồng kềnh và thực hiện từ 80 đến 120 truy vấn SQL vào cơ sở dữ liệu MySQL. Hậu quả kỹ thuật là thời gian phản hồi máy chủ (TTFB - Time to First Byte) lên tới 1.85 giây, chỉ số hiển thị nội dung lớn nhất (LCP - Largest Contentful Paint) vượt ngưỡng 5.2 giây, kéo tụt điểm Google Lighthouse xuống mức báo động đỏ 32/100 và khiến tỷ lệ thoát trang (Bounce Rate) vượt quá 55%.</w:t>
       </w:r>
     </w:p>
     <w:p>
       <w:pPr>
-        <w:pStyle w:val="ListBullet"/>
-        <w:spacing w:line="312" w:lineRule="auto" w:after="60"/>
-        <w:ind w:left="720"/>
-        <w:jc w:val="both"/>
+        <w:keepNext/>
+        <w:spacing w:before="180" w:after="80"/>
       </w:pPr>
       <w:r>
         <w:rPr>
           <w:rFonts w:ascii="Times New Roman" w:hAnsi="Times New Roman"/>
           <w:b/>
-          <w:i w:val="0"/>
+          <w:i/>
           <w:sz w:val="26"/>
         </w:rPr>
-        <w:t xml:space="preserve">1. </w:t>
+        <w:t>2.1.2. Trục 2: Nút thắt về An toàn và Bảo mật Hệ thống (Security &amp; Vulnerabilities)</w:t>
       </w:r>
+    </w:p>
+    <w:p>
+      <w:pPr>
+        <w:spacing w:line="312" w:lineRule="auto" w:after="100"/>
+        <w:ind w:firstLine="720"/>
+        <w:jc w:val="both"/>
+      </w:pPr>
       <w:r>
         <w:rPr>
           <w:rFonts w:ascii="Times New Roman" w:hAnsi="Times New Roman"/>
@@ -1781,25 +1801,30 @@
           <w:i w:val="0"/>
           <w:sz w:val="26"/>
         </w:rPr>
-        <w:t>Thời gian tải trang quá lâu (TTFB &gt; 1.8s, LCP &gt; 5.2s): Do kiến trúc Monolithic buộc máy chủ phải xử lý hàng trăm truy vấn PHP/MySQL đồng thời tải kèm hàng chục plugin nặng nề mỗi khi có lượt truy cập, làm tăng tỷ lệ thoát trang (Bounce Rate) lên trên 55%.</w:t>
+        <w:t>Hệ sinh thái cũ phơi bày toàn bộ bề mặt tấn công trực tiếp ra mạng Internet công cộng. Cổng đăng nhập quản trị `/wp-admin` và endpoint `/xmlrpc.php` liên tục đối mặt với các cuộc tấn công dò quét mật khẩu tự động (Brute-force Attacks). Mã nguồn PHP và toàn bộ cơ sở dữ liệu nằm chung trên một máy chủ web chia sẻ (Shared Hosting), tiềm ẩn nguy cơ cao bị khai thác lỗ hổng SQL Injection và Remote Code Execution từ các plugin bên thứ ba chưa được vá lỗi.</w:t>
       </w:r>
     </w:p>
     <w:p>
       <w:pPr>
-        <w:pStyle w:val="ListBullet"/>
-        <w:spacing w:line="312" w:lineRule="auto" w:after="60"/>
-        <w:ind w:left="720"/>
-        <w:jc w:val="both"/>
+        <w:keepNext/>
+        <w:spacing w:before="180" w:after="80"/>
       </w:pPr>
       <w:r>
         <w:rPr>
           <w:rFonts w:ascii="Times New Roman" w:hAnsi="Times New Roman"/>
           <w:b/>
-          <w:i w:val="0"/>
+          <w:i/>
           <w:sz w:val="26"/>
         </w:rPr>
-        <w:t xml:space="preserve">2. </w:t>
+        <w:t>2.1.3. Trục 3: Nút thắt về Định dạng Tìm kiếm &amp; Trợ lý ảo AI (SEO &amp; GEO Readiness)</w:t>
       </w:r>
+    </w:p>
+    <w:p>
+      <w:pPr>
+        <w:spacing w:line="312" w:lineRule="auto" w:after="100"/>
+        <w:ind w:firstLine="720"/>
+        <w:jc w:val="both"/>
+      </w:pPr>
       <w:r>
         <w:rPr>
           <w:rFonts w:ascii="Times New Roman" w:hAnsi="Times New Roman"/>
@@ -1807,25 +1832,30 @@
           <w:i w:val="0"/>
           <w:sz w:val="26"/>
         </w:rPr>
-        <w:t>Chi phí nhân sự viết bài quá cao: Doanh nghiệp phải trả từ 12 đến 16 triệu đồng/tháng cho nhân sự Content Marketing nhưng chỉ thu về 15-20 bài/tháng, chất lượng không đồng đều và dễ bị gián đoạn khi nhân viên nghỉ việc.</w:t>
+        <w:t>Trong kỷ nguyên trí tuệ nhân tạo 2026, các công cụ tìm kiếm truyền thống đang dần nhường chỗ cho các cỗ máy trả lời tổng hợp (Generative Engine) như ChatGPT Search, Perplexity AI và Google Gemini. Tuy nhiên, website Monolithic cũ chỉ dựa vào các plugin SEO cơ bản (Yoast SEO, RankMath) sinh ra mã HTML rác, thiếu cấu trúc Schema JSON-LD có chiều sâu và hoàn toàn không có tệp chuẩn hóa giao thức tri thức `llms.txt`. Do đó, khi người dùng hỏi các AI Bot về dịch vụ của Hừng Đông Media, AI hoàn toàn 'mù tịt' thông tin và không thể trích xuất dẫn nguồn.</w:t>
       </w:r>
     </w:p>
     <w:p>
       <w:pPr>
-        <w:pStyle w:val="ListBullet"/>
-        <w:spacing w:line="312" w:lineRule="auto" w:after="60"/>
-        <w:ind w:left="720"/>
-        <w:jc w:val="both"/>
+        <w:keepNext/>
+        <w:spacing w:before="180" w:after="80"/>
       </w:pPr>
       <w:r>
         <w:rPr>
           <w:rFonts w:ascii="Times New Roman" w:hAnsi="Times New Roman"/>
           <w:b/>
-          <w:i w:val="0"/>
+          <w:i/>
           <w:sz w:val="26"/>
         </w:rPr>
-        <w:t xml:space="preserve">3. </w:t>
+        <w:t>2.1.4. Trục 4: Nút thắt về Trải nghiệm Người dùng và Tương thích Thiết bị (UI/UX &amp; Responsive)</w:t>
       </w:r>
+    </w:p>
+    <w:p>
+      <w:pPr>
+        <w:spacing w:line="312" w:lineRule="auto" w:after="100"/>
+        <w:ind w:firstLine="720"/>
+        <w:jc w:val="both"/>
+      </w:pPr>
       <w:r>
         <w:rPr>
           <w:rFonts w:ascii="Times New Roman" w:hAnsi="Times New Roman"/>
@@ -1833,25 +1863,30 @@
           <w:i w:val="0"/>
           <w:sz w:val="26"/>
         </w:rPr>
-        <w:t>Lỗ hổng bảo mật cố hữu: Cổng đăng nhập `/wp-admin` và toàn bộ cơ sở dữ liệu nằm trực tiếp trên Internet, liên tục đối mặt với nguy cơ bị tấn công brute-force và mã độc.</w:t>
+        <w:t>Giao diện cũ sử dụng các theme WordPress mua sẵn với CSS/JS chồng chéo nặng nề, gây ra xung đột biến breakpoints dẫn đến tình trạng co giật khung hình (CLS - Cumulative Layout Shift). Giao diện trên thiết bị di động bị vỡ layout, phông chữ quá nhỏ hoặc bị che khuất, độ tương phản màu sắc không đạt tiêu chuẩn quốc tế WCAG 2.1 AA (Web Content Accessibility Guidelines) và hoàn toàn thiếu vắng chế độ Dark Mode hiện đại bảo vệ mắt người đọc chuyên sâu.</w:t>
       </w:r>
     </w:p>
     <w:p>
       <w:pPr>
-        <w:pStyle w:val="ListBullet"/>
-        <w:spacing w:line="312" w:lineRule="auto" w:after="60"/>
-        <w:ind w:left="720"/>
-        <w:jc w:val="both"/>
+        <w:keepNext/>
+        <w:spacing w:before="180" w:after="80"/>
       </w:pPr>
       <w:r>
         <w:rPr>
           <w:rFonts w:ascii="Times New Roman" w:hAnsi="Times New Roman"/>
           <w:b/>
-          <w:i w:val="0"/>
+          <w:i/>
           <w:sz w:val="26"/>
         </w:rPr>
-        <w:t xml:space="preserve">4. </w:t>
+        <w:t>2.1.5. Trục 5: Nút thắt về Chi phí và Năng suất Sản xuất Nội dung (Content Workflow Bottleneck)</w:t>
       </w:r>
+    </w:p>
+    <w:p>
+      <w:pPr>
+        <w:spacing w:line="312" w:lineRule="auto" w:after="100"/>
+        <w:ind w:firstLine="720"/>
+        <w:jc w:val="both"/>
+      </w:pPr>
       <w:r>
         <w:rPr>
           <w:rFonts w:ascii="Times New Roman" w:hAnsi="Times New Roman"/>
@@ -1859,13 +1894,679 @@
           <w:i w:val="0"/>
           <w:sz w:val="26"/>
         </w:rPr>
-        <w:t>Tài liệu hồ sơ doanh nghiệp bị bỏ hoang: Các tệp PDF/DOCX hồ sơ năng lực của khách hàng không được khai thác tự động, nhân viên phải mất hàng giờ copy thủ công từng đoạn chữ.</w:t>
+        <w:t>Quy trình sản xuất nội dung bài viết PR và tin tức hoàn toàn phụ thuộc vào lao động thủ công. Doanh nghiệp phải chi trả từ 14 đến 16 triệu đồng/tháng cho nhân sự Content Marketing nhưng mỗi tháng chỉ sản xuất được từ 15 đến 20 bài viết, chất lượng chuyên môn không đồng đều. Đáng tiếc nhất, hàng trăm trang tài liệu hồ sơ năng lực, Case Study thực chiến và bảng giá của công ty lưu trong các tệp PDF/DOCX bị bỏ hoang trong ổ cứng, không có cách nào tự động số hóa thành bài viết chuẩn SEO.</w:t>
       </w:r>
     </w:p>
     <w:p>
       <w:pPr>
         <w:keepNext/>
-        <w:spacing w:before="240" w:after="120"/>
+        <w:spacing w:before="180" w:after="80"/>
+      </w:pPr>
+      <w:r>
+        <w:rPr>
+          <w:rFonts w:ascii="Times New Roman" w:hAnsi="Times New Roman"/>
+          <w:b/>
+          <w:i/>
+          <w:sz w:val="26"/>
+        </w:rPr>
+        <w:t>2.1.6. Trục 6: Nút thắt về Khả năng Chịu tải và Mở rộng (Scalability &amp; High Availability)</w:t>
+      </w:r>
+    </w:p>
+    <w:p>
+      <w:pPr>
+        <w:spacing w:line="312" w:lineRule="auto" w:after="100"/>
+        <w:ind w:firstLine="720"/>
+        <w:jc w:val="both"/>
+      </w:pPr>
+      <w:r>
+        <w:rPr>
+          <w:rFonts w:ascii="Times New Roman" w:hAnsi="Times New Roman"/>
+          <w:b w:val="0"/>
+          <w:i w:val="0"/>
+          <w:sz w:val="26"/>
+        </w:rPr>
+        <w:t>Do tính chất Monolithic gắn chặt việc render HTML với việc truy vấn cơ sở dữ liệu, hệ thống cũ sẽ rơi vào tình trạng quá tải nghẽn CPU (100% CPU Usage) và cạn kiệt tài nguyên kết nối MySQL Connection Pool ngay khi lượng người dùng đồng thời (CCU) vượt quá 100 người. Điều này làm tê liệt hoàn toàn các chiến dịch chạy quảng cáo truyền thông diện rộng của doanh nghiệp.</w:t>
+      </w:r>
+    </w:p>
+    <w:p>
+      <w:pPr>
+        <w:spacing w:line="312" w:lineRule="auto" w:after="100"/>
+        <w:ind w:firstLine="720"/>
+        <w:jc w:val="both"/>
+      </w:pPr>
+      <w:r>
+        <w:rPr>
+          <w:rFonts w:ascii="Times New Roman" w:hAnsi="Times New Roman"/>
+          <w:b w:val="0"/>
+          <w:i w:val="0"/>
+          <w:sz w:val="26"/>
+        </w:rPr>
+        <w:t>Bảng tổng hợp hiện trạng 6 nút thắt kỹ thuật của hệ thống website cũ:</w:t>
+      </w:r>
+    </w:p>
+    <w:tbl>
+      <w:tblPr>
+        <w:tblStyle w:val="TableGrid"/>
+        <w:tblW w:type="auto" w:w="0"/>
+        <w:tblLook w:firstColumn="1" w:firstRow="1" w:lastColumn="0" w:lastRow="0" w:noHBand="0" w:noVBand="1" w:val="04A0"/>
+      </w:tblPr>
+      <w:tblGrid>
+        <w:gridCol w:w="2351"/>
+        <w:gridCol w:w="2351"/>
+        <w:gridCol w:w="2351"/>
+        <w:gridCol w:w="2351"/>
+      </w:tblGrid>
+      <w:tr>
+        <w:tc>
+          <w:tcPr>
+            <w:tcW w:type="dxa" w:w="850"/>
+            <w:shd w:val="clear" w:color="auto" w:fill="D9E1F2"/>
+          </w:tcPr>
+          <w:p>
+            <w:pPr>
+              <w:spacing w:before="80" w:after="80"/>
+              <w:jc w:val="center"/>
+            </w:pPr>
+            <w:r/>
+            <w:r>
+              <w:rPr>
+                <w:rFonts w:ascii="Times New Roman" w:hAnsi="Times New Roman"/>
+                <w:b/>
+                <w:i w:val="0"/>
+                <w:sz w:val="22"/>
+              </w:rPr>
+              <w:t>Trục</w:t>
+            </w:r>
+          </w:p>
+        </w:tc>
+        <w:tc>
+          <w:tcPr>
+            <w:tcW w:type="dxa" w:w="1984"/>
+            <w:shd w:val="clear" w:color="auto" w:fill="D9E1F2"/>
+          </w:tcPr>
+          <w:p>
+            <w:pPr>
+              <w:spacing w:before="80" w:after="80"/>
+              <w:jc w:val="center"/>
+            </w:pPr>
+            <w:r/>
+            <w:r>
+              <w:rPr>
+                <w:rFonts w:ascii="Times New Roman" w:hAnsi="Times New Roman"/>
+                <w:b/>
+                <w:i w:val="0"/>
+                <w:sz w:val="22"/>
+              </w:rPr>
+              <w:t>Khía cạnh kỹ thuật</w:t>
+            </w:r>
+          </w:p>
+        </w:tc>
+        <w:tc>
+          <w:tcPr>
+            <w:tcW w:type="dxa" w:w="3685"/>
+            <w:shd w:val="clear" w:color="auto" w:fill="D9E1F2"/>
+          </w:tcPr>
+          <w:p>
+            <w:pPr>
+              <w:spacing w:before="80" w:after="80"/>
+              <w:jc w:val="center"/>
+            </w:pPr>
+            <w:r/>
+            <w:r>
+              <w:rPr>
+                <w:rFonts w:ascii="Times New Roman" w:hAnsi="Times New Roman"/>
+                <w:b/>
+                <w:i w:val="0"/>
+                <w:sz w:val="22"/>
+              </w:rPr>
+              <w:t>Hiện trạng nút thắt (Before)</w:t>
+            </w:r>
+          </w:p>
+        </w:tc>
+        <w:tc>
+          <w:tcPr>
+            <w:tcW w:type="dxa" w:w="1984"/>
+            <w:shd w:val="clear" w:color="auto" w:fill="D9E1F2"/>
+          </w:tcPr>
+          <w:p>
+            <w:pPr>
+              <w:spacing w:before="80" w:after="80"/>
+              <w:jc w:val="center"/>
+            </w:pPr>
+            <w:r/>
+            <w:r>
+              <w:rPr>
+                <w:rFonts w:ascii="Times New Roman" w:hAnsi="Times New Roman"/>
+                <w:b/>
+                <w:i w:val="0"/>
+                <w:sz w:val="22"/>
+              </w:rPr>
+              <w:t>Hệ quả đối với DN</w:t>
+            </w:r>
+          </w:p>
+        </w:tc>
+      </w:tr>
+      <w:tr>
+        <w:tc>
+          <w:tcPr>
+            <w:tcW w:type="dxa" w:w="850"/>
+          </w:tcPr>
+          <w:p>
+            <w:pPr>
+              <w:spacing w:line="276" w:lineRule="auto" w:before="60" w:after="60"/>
+              <w:jc w:val="center"/>
+            </w:pPr>
+            <w:r/>
+            <w:r>
+              <w:rPr>
+                <w:rFonts w:ascii="Times New Roman" w:hAnsi="Times New Roman"/>
+                <w:b w:val="0"/>
+                <w:i w:val="0"/>
+                <w:sz w:val="21"/>
+              </w:rPr>
+              <w:t>Trục 1</w:t>
+            </w:r>
+          </w:p>
+        </w:tc>
+        <w:tc>
+          <w:tcPr>
+            <w:tcW w:type="dxa" w:w="1984"/>
+          </w:tcPr>
+          <w:p>
+            <w:pPr>
+              <w:spacing w:line="276" w:lineRule="auto" w:before="60" w:after="60"/>
+              <w:jc w:val="left"/>
+            </w:pPr>
+            <w:r/>
+            <w:r>
+              <w:rPr>
+                <w:rFonts w:ascii="Times New Roman" w:hAnsi="Times New Roman"/>
+                <w:b w:val="0"/>
+                <w:i w:val="0"/>
+                <w:sz w:val="21"/>
+              </w:rPr>
+              <w:t>Hiệu năng (Performance)</w:t>
+            </w:r>
+          </w:p>
+        </w:tc>
+        <w:tc>
+          <w:tcPr>
+            <w:tcW w:type="dxa" w:w="3685"/>
+          </w:tcPr>
+          <w:p>
+            <w:pPr>
+              <w:spacing w:line="276" w:lineRule="auto" w:before="60" w:after="60"/>
+              <w:jc w:val="left"/>
+            </w:pPr>
+            <w:r/>
+            <w:r>
+              <w:rPr>
+                <w:rFonts w:ascii="Times New Roman" w:hAnsi="Times New Roman"/>
+                <w:b w:val="0"/>
+                <w:i w:val="0"/>
+                <w:sz w:val="21"/>
+              </w:rPr>
+              <w:t>TTFB &gt; 1.85s, LCP &gt; 5.2s, 120 truy vấn SQL/lượt xem.</w:t>
+            </w:r>
+          </w:p>
+        </w:tc>
+        <w:tc>
+          <w:tcPr>
+            <w:tcW w:type="dxa" w:w="1984"/>
+          </w:tcPr>
+          <w:p>
+            <w:pPr>
+              <w:spacing w:line="276" w:lineRule="auto" w:before="60" w:after="60"/>
+              <w:jc w:val="left"/>
+            </w:pPr>
+            <w:r/>
+            <w:r>
+              <w:rPr>
+                <w:rFonts w:ascii="Times New Roman" w:hAnsi="Times New Roman"/>
+                <w:b w:val="0"/>
+                <w:i w:val="0"/>
+                <w:sz w:val="21"/>
+              </w:rPr>
+              <w:t>Lighthouse đỏ 32/100, thoát trang 55%.</w:t>
+            </w:r>
+          </w:p>
+        </w:tc>
+      </w:tr>
+      <w:tr>
+        <w:tc>
+          <w:tcPr>
+            <w:tcW w:type="dxa" w:w="850"/>
+          </w:tcPr>
+          <w:p>
+            <w:pPr>
+              <w:spacing w:line="276" w:lineRule="auto" w:before="60" w:after="60"/>
+              <w:jc w:val="center"/>
+            </w:pPr>
+            <w:r/>
+            <w:r>
+              <w:rPr>
+                <w:rFonts w:ascii="Times New Roman" w:hAnsi="Times New Roman"/>
+                <w:b w:val="0"/>
+                <w:i w:val="0"/>
+                <w:sz w:val="21"/>
+              </w:rPr>
+              <w:t>Trục 2</w:t>
+            </w:r>
+          </w:p>
+        </w:tc>
+        <w:tc>
+          <w:tcPr>
+            <w:tcW w:type="dxa" w:w="1984"/>
+          </w:tcPr>
+          <w:p>
+            <w:pPr>
+              <w:spacing w:line="276" w:lineRule="auto" w:before="60" w:after="60"/>
+              <w:jc w:val="left"/>
+            </w:pPr>
+            <w:r/>
+            <w:r>
+              <w:rPr>
+                <w:rFonts w:ascii="Times New Roman" w:hAnsi="Times New Roman"/>
+                <w:b w:val="0"/>
+                <w:i w:val="0"/>
+                <w:sz w:val="21"/>
+              </w:rPr>
+              <w:t>Bảo mật (Security)</w:t>
+            </w:r>
+          </w:p>
+        </w:tc>
+        <w:tc>
+          <w:tcPr>
+            <w:tcW w:type="dxa" w:w="3685"/>
+          </w:tcPr>
+          <w:p>
+            <w:pPr>
+              <w:spacing w:line="276" w:lineRule="auto" w:before="60" w:after="60"/>
+              <w:jc w:val="left"/>
+            </w:pPr>
+            <w:r/>
+            <w:r>
+              <w:rPr>
+                <w:rFonts w:ascii="Times New Roman" w:hAnsi="Times New Roman"/>
+                <w:b w:val="0"/>
+                <w:i w:val="0"/>
+                <w:sz w:val="21"/>
+              </w:rPr>
+              <w:t>Lộ /wp-admin, mở XML-RPC, dùng chung server PHP/MySQL.</w:t>
+            </w:r>
+          </w:p>
+        </w:tc>
+        <w:tc>
+          <w:tcPr>
+            <w:tcW w:type="dxa" w:w="1984"/>
+          </w:tcPr>
+          <w:p>
+            <w:pPr>
+              <w:spacing w:line="276" w:lineRule="auto" w:before="60" w:after="60"/>
+              <w:jc w:val="left"/>
+            </w:pPr>
+            <w:r/>
+            <w:r>
+              <w:rPr>
+                <w:rFonts w:ascii="Times New Roman" w:hAnsi="Times New Roman"/>
+                <w:b w:val="0"/>
+                <w:i w:val="0"/>
+                <w:sz w:val="21"/>
+              </w:rPr>
+              <w:t>Nguy cơ brute-force, SQLi, mã độc plugin.</w:t>
+            </w:r>
+          </w:p>
+        </w:tc>
+      </w:tr>
+      <w:tr>
+        <w:tc>
+          <w:tcPr>
+            <w:tcW w:type="dxa" w:w="850"/>
+          </w:tcPr>
+          <w:p>
+            <w:pPr>
+              <w:spacing w:line="276" w:lineRule="auto" w:before="60" w:after="60"/>
+              <w:jc w:val="center"/>
+            </w:pPr>
+            <w:r/>
+            <w:r>
+              <w:rPr>
+                <w:rFonts w:ascii="Times New Roman" w:hAnsi="Times New Roman"/>
+                <w:b w:val="0"/>
+                <w:i w:val="0"/>
+                <w:sz w:val="21"/>
+              </w:rPr>
+              <w:t>Trục 3</w:t>
+            </w:r>
+          </w:p>
+        </w:tc>
+        <w:tc>
+          <w:tcPr>
+            <w:tcW w:type="dxa" w:w="1984"/>
+          </w:tcPr>
+          <w:p>
+            <w:pPr>
+              <w:spacing w:line="276" w:lineRule="auto" w:before="60" w:after="60"/>
+              <w:jc w:val="left"/>
+            </w:pPr>
+            <w:r/>
+            <w:r>
+              <w:rPr>
+                <w:rFonts w:ascii="Times New Roman" w:hAnsi="Times New Roman"/>
+                <w:b w:val="0"/>
+                <w:i w:val="0"/>
+                <w:sz w:val="21"/>
+              </w:rPr>
+              <w:t>Định dạng AI (SEO &amp; GEO)</w:t>
+            </w:r>
+          </w:p>
+        </w:tc>
+        <w:tc>
+          <w:tcPr>
+            <w:tcW w:type="dxa" w:w="3685"/>
+          </w:tcPr>
+          <w:p>
+            <w:pPr>
+              <w:spacing w:line="276" w:lineRule="auto" w:before="60" w:after="60"/>
+              <w:jc w:val="left"/>
+            </w:pPr>
+            <w:r/>
+            <w:r>
+              <w:rPr>
+                <w:rFonts w:ascii="Times New Roman" w:hAnsi="Times New Roman"/>
+                <w:b w:val="0"/>
+                <w:i w:val="0"/>
+                <w:sz w:val="21"/>
+              </w:rPr>
+              <w:t>Thiếu Schema động, không có giao thức máy đọc llms.txt.</w:t>
+            </w:r>
+          </w:p>
+        </w:tc>
+        <w:tc>
+          <w:tcPr>
+            <w:tcW w:type="dxa" w:w="1984"/>
+          </w:tcPr>
+          <w:p>
+            <w:pPr>
+              <w:spacing w:line="276" w:lineRule="auto" w:before="60" w:after="60"/>
+              <w:jc w:val="left"/>
+            </w:pPr>
+            <w:r/>
+            <w:r>
+              <w:rPr>
+                <w:rFonts w:ascii="Times New Roman" w:hAnsi="Times New Roman"/>
+                <w:b w:val="0"/>
+                <w:i w:val="0"/>
+                <w:sz w:val="21"/>
+              </w:rPr>
+              <w:t>Bị AI Bot bỏ qua, mất khách hàng thế hệ mới.</w:t>
+            </w:r>
+          </w:p>
+        </w:tc>
+      </w:tr>
+      <w:tr>
+        <w:tc>
+          <w:tcPr>
+            <w:tcW w:type="dxa" w:w="850"/>
+          </w:tcPr>
+          <w:p>
+            <w:pPr>
+              <w:spacing w:line="276" w:lineRule="auto" w:before="60" w:after="60"/>
+              <w:jc w:val="center"/>
+            </w:pPr>
+            <w:r/>
+            <w:r>
+              <w:rPr>
+                <w:rFonts w:ascii="Times New Roman" w:hAnsi="Times New Roman"/>
+                <w:b w:val="0"/>
+                <w:i w:val="0"/>
+                <w:sz w:val="21"/>
+              </w:rPr>
+              <w:t>Trục 4</w:t>
+            </w:r>
+          </w:p>
+        </w:tc>
+        <w:tc>
+          <w:tcPr>
+            <w:tcW w:type="dxa" w:w="1984"/>
+          </w:tcPr>
+          <w:p>
+            <w:pPr>
+              <w:spacing w:line="276" w:lineRule="auto" w:before="60" w:after="60"/>
+              <w:jc w:val="left"/>
+            </w:pPr>
+            <w:r/>
+            <w:r>
+              <w:rPr>
+                <w:rFonts w:ascii="Times New Roman" w:hAnsi="Times New Roman"/>
+                <w:b w:val="0"/>
+                <w:i w:val="0"/>
+                <w:sz w:val="21"/>
+              </w:rPr>
+              <w:t>Trải nghiệm (UI/UX)</w:t>
+            </w:r>
+          </w:p>
+        </w:tc>
+        <w:tc>
+          <w:tcPr>
+            <w:tcW w:type="dxa" w:w="3685"/>
+          </w:tcPr>
+          <w:p>
+            <w:pPr>
+              <w:spacing w:line="276" w:lineRule="auto" w:before="60" w:after="60"/>
+              <w:jc w:val="left"/>
+            </w:pPr>
+            <w:r/>
+            <w:r>
+              <w:rPr>
+                <w:rFonts w:ascii="Times New Roman" w:hAnsi="Times New Roman"/>
+                <w:b w:val="0"/>
+                <w:i w:val="0"/>
+                <w:sz w:val="21"/>
+              </w:rPr>
+              <w:t>Lỗi SCSS breakpoints, không đạt chuẩn tương phản WCAG.</w:t>
+            </w:r>
+          </w:p>
+        </w:tc>
+        <w:tc>
+          <w:tcPr>
+            <w:tcW w:type="dxa" w:w="1984"/>
+          </w:tcPr>
+          <w:p>
+            <w:pPr>
+              <w:spacing w:line="276" w:lineRule="auto" w:before="60" w:after="60"/>
+              <w:jc w:val="left"/>
+            </w:pPr>
+            <w:r/>
+            <w:r>
+              <w:rPr>
+                <w:rFonts w:ascii="Times New Roman" w:hAnsi="Times New Roman"/>
+                <w:b w:val="0"/>
+                <w:i w:val="0"/>
+                <w:sz w:val="21"/>
+              </w:rPr>
+              <w:t>Vỡ giao diện mobile, trải nghiệm đọc kém.</w:t>
+            </w:r>
+          </w:p>
+        </w:tc>
+      </w:tr>
+      <w:tr>
+        <w:tc>
+          <w:tcPr>
+            <w:tcW w:type="dxa" w:w="850"/>
+          </w:tcPr>
+          <w:p>
+            <w:pPr>
+              <w:spacing w:line="276" w:lineRule="auto" w:before="60" w:after="60"/>
+              <w:jc w:val="center"/>
+            </w:pPr>
+            <w:r/>
+            <w:r>
+              <w:rPr>
+                <w:rFonts w:ascii="Times New Roman" w:hAnsi="Times New Roman"/>
+                <w:b w:val="0"/>
+                <w:i w:val="0"/>
+                <w:sz w:val="21"/>
+              </w:rPr>
+              <w:t>Trục 5</w:t>
+            </w:r>
+          </w:p>
+        </w:tc>
+        <w:tc>
+          <w:tcPr>
+            <w:tcW w:type="dxa" w:w="1984"/>
+          </w:tcPr>
+          <w:p>
+            <w:pPr>
+              <w:spacing w:line="276" w:lineRule="auto" w:before="60" w:after="60"/>
+              <w:jc w:val="left"/>
+            </w:pPr>
+            <w:r/>
+            <w:r>
+              <w:rPr>
+                <w:rFonts w:ascii="Times New Roman" w:hAnsi="Times New Roman"/>
+                <w:b w:val="0"/>
+                <w:i w:val="0"/>
+                <w:sz w:val="21"/>
+              </w:rPr>
+              <w:t>Năng suất (Automation)</w:t>
+            </w:r>
+          </w:p>
+        </w:tc>
+        <w:tc>
+          <w:tcPr>
+            <w:tcW w:type="dxa" w:w="3685"/>
+          </w:tcPr>
+          <w:p>
+            <w:pPr>
+              <w:spacing w:line="276" w:lineRule="auto" w:before="60" w:after="60"/>
+              <w:jc w:val="left"/>
+            </w:pPr>
+            <w:r/>
+            <w:r>
+              <w:rPr>
+                <w:rFonts w:ascii="Times New Roman" w:hAnsi="Times New Roman"/>
+                <w:b w:val="0"/>
+                <w:i w:val="0"/>
+                <w:sz w:val="21"/>
+              </w:rPr>
+              <w:t>Viết tay thủ công 100%, bỏ hoang kho tài liệu PDF/DOCX.</w:t>
+            </w:r>
+          </w:p>
+        </w:tc>
+        <w:tc>
+          <w:tcPr>
+            <w:tcW w:type="dxa" w:w="1984"/>
+          </w:tcPr>
+          <w:p>
+            <w:pPr>
+              <w:spacing w:line="276" w:lineRule="auto" w:before="60" w:after="60"/>
+              <w:jc w:val="left"/>
+            </w:pPr>
+            <w:r/>
+            <w:r>
+              <w:rPr>
+                <w:rFonts w:ascii="Times New Roman" w:hAnsi="Times New Roman"/>
+                <w:b w:val="0"/>
+                <w:i w:val="0"/>
+                <w:sz w:val="21"/>
+              </w:rPr>
+              <w:t>Tốn 16 triệu/tháng, chỉ ra 15 bài/tháng.</w:t>
+            </w:r>
+          </w:p>
+        </w:tc>
+      </w:tr>
+      <w:tr>
+        <w:tc>
+          <w:tcPr>
+            <w:tcW w:type="dxa" w:w="850"/>
+          </w:tcPr>
+          <w:p>
+            <w:pPr>
+              <w:spacing w:line="276" w:lineRule="auto" w:before="60" w:after="60"/>
+              <w:jc w:val="center"/>
+            </w:pPr>
+            <w:r/>
+            <w:r>
+              <w:rPr>
+                <w:rFonts w:ascii="Times New Roman" w:hAnsi="Times New Roman"/>
+                <w:b w:val="0"/>
+                <w:i w:val="0"/>
+                <w:sz w:val="21"/>
+              </w:rPr>
+              <w:t>Trục 6</w:t>
+            </w:r>
+          </w:p>
+        </w:tc>
+        <w:tc>
+          <w:tcPr>
+            <w:tcW w:type="dxa" w:w="1984"/>
+          </w:tcPr>
+          <w:p>
+            <w:pPr>
+              <w:spacing w:line="276" w:lineRule="auto" w:before="60" w:after="60"/>
+              <w:jc w:val="left"/>
+            </w:pPr>
+            <w:r/>
+            <w:r>
+              <w:rPr>
+                <w:rFonts w:ascii="Times New Roman" w:hAnsi="Times New Roman"/>
+                <w:b w:val="0"/>
+                <w:i w:val="0"/>
+                <w:sz w:val="21"/>
+              </w:rPr>
+              <w:t>Chịu tải (Scalability)</w:t>
+            </w:r>
+          </w:p>
+        </w:tc>
+        <w:tc>
+          <w:tcPr>
+            <w:tcW w:type="dxa" w:w="3685"/>
+          </w:tcPr>
+          <w:p>
+            <w:pPr>
+              <w:spacing w:line="276" w:lineRule="auto" w:before="60" w:after="60"/>
+              <w:jc w:val="left"/>
+            </w:pPr>
+            <w:r/>
+            <w:r>
+              <w:rPr>
+                <w:rFonts w:ascii="Times New Roman" w:hAnsi="Times New Roman"/>
+                <w:b w:val="0"/>
+                <w:i w:val="0"/>
+                <w:sz w:val="21"/>
+              </w:rPr>
+              <w:t>Hệ thống phụ thuộc máy chủ đơn, không có Edge Cache.</w:t>
+            </w:r>
+          </w:p>
+        </w:tc>
+        <w:tc>
+          <w:tcPr>
+            <w:tcW w:type="dxa" w:w="1984"/>
+          </w:tcPr>
+          <w:p>
+            <w:pPr>
+              <w:spacing w:line="276" w:lineRule="auto" w:before="60" w:after="60"/>
+              <w:jc w:val="left"/>
+            </w:pPr>
+            <w:r/>
+            <w:r>
+              <w:rPr>
+                <w:rFonts w:ascii="Times New Roman" w:hAnsi="Times New Roman"/>
+                <w:b w:val="0"/>
+                <w:i w:val="0"/>
+                <w:sz w:val="21"/>
+              </w:rPr>
+              <w:t>Sập web khi lượt truy cập &gt; 100 CCU.</w:t>
+            </w:r>
+          </w:p>
+        </w:tc>
+      </w:tr>
+    </w:tbl>
+    <w:p>
+      <w:pPr>
+        <w:keepNext/>
+        <w:spacing w:before="260" w:after="120"/>
       </w:pPr>
       <w:r>
         <w:rPr>
@@ -1890,7 +2591,7 @@
           <w:i w:val="0"/>
           <w:sz w:val="26"/>
         </w:rPr>
-        <w:t>Để giải quyết dứt điểm các bất cập trên, hệ thống mới được thiết kế với 3 nhóm tác nhân chính và 5 Use Case trọng điểm:</w:t>
+        <w:t>Để giải quyết dứt điểm 6 nút thắt trên, hệ thống mới được thiết kế với 3 nhóm tác nhân chính và 5 Use Case trọng điểm:</w:t>
       </w:r>
     </w:p>
     <w:p>
@@ -1952,7 +2653,7 @@
     <w:p>
       <w:pPr>
         <w:keepNext/>
-        <w:spacing w:before="240" w:after="120"/>
+        <w:spacing w:before="260" w:after="120"/>
       </w:pPr>
       <w:r>
         <w:rPr>
@@ -2082,7 +2783,7 @@
                 <w:rFonts w:ascii="Times New Roman" w:hAnsi="Times New Roman"/>
                 <w:b w:val="0"/>
                 <w:i w:val="0"/>
-                <w:sz w:val="22"/>
+                <w:sz w:val="21"/>
               </w:rPr>
               <w:t>UC01</w:t>
             </w:r>
@@ -2103,7 +2804,7 @@
                 <w:rFonts w:ascii="Times New Roman" w:hAnsi="Times New Roman"/>
                 <w:b w:val="0"/>
                 <w:i w:val="0"/>
-                <w:sz w:val="22"/>
+                <w:sz w:val="21"/>
               </w:rPr>
               <w:t>Nạp hồ sơ năng lực</w:t>
             </w:r>
@@ -2124,7 +2825,7 @@
                 <w:rFonts w:ascii="Times New Roman" w:hAnsi="Times New Roman"/>
                 <w:b w:val="0"/>
                 <w:i w:val="0"/>
-                <w:sz w:val="22"/>
+                <w:sz w:val="21"/>
               </w:rPr>
               <w:t>Doanh nghiệp nạp tệp PDF/DOCX vào thư mục đầu vào. Hệ thống tự động bóc tách thực thể dịch vụ, case study và bảng giá.</w:t>
             </w:r>
@@ -2145,7 +2846,7 @@
                 <w:rFonts w:ascii="Times New Roman" w:hAnsi="Times New Roman"/>
                 <w:b w:val="0"/>
                 <w:i w:val="0"/>
-                <w:sz w:val="22"/>
+                <w:sz w:val="21"/>
               </w:rPr>
               <w:t>Doanh nghiệp</w:t>
             </w:r>
@@ -2168,7 +2869,7 @@
                 <w:rFonts w:ascii="Times New Roman" w:hAnsi="Times New Roman"/>
                 <w:b w:val="0"/>
                 <w:i w:val="0"/>
-                <w:sz w:val="22"/>
+                <w:sz w:val="21"/>
               </w:rPr>
               <w:t>UC02</w:t>
             </w:r>
@@ -2189,7 +2890,7 @@
                 <w:rFonts w:ascii="Times New Roman" w:hAnsi="Times New Roman"/>
                 <w:b w:val="0"/>
                 <w:i w:val="0"/>
-                <w:sz w:val="22"/>
+                <w:sz w:val="21"/>
               </w:rPr>
               <w:t>Tự động sinh bài SEO</w:t>
             </w:r>
@@ -2210,7 +2911,7 @@
                 <w:rFonts w:ascii="Times New Roman" w:hAnsi="Times New Roman"/>
                 <w:b w:val="0"/>
                 <w:i w:val="0"/>
-                <w:sz w:val="22"/>
+                <w:sz w:val="21"/>
               </w:rPr>
               <w:t>Cỗ máy AI xử lý cấu trúc RAG, tự động sinh 30 bài viết chuẩn SEO chuyên sâu kèm đầy đủ thẻ HTML ngữ nghĩa.</w:t>
             </w:r>
@@ -2231,7 +2932,7 @@
                 <w:rFonts w:ascii="Times New Roman" w:hAnsi="Times New Roman"/>
                 <w:b w:val="0"/>
                 <w:i w:val="0"/>
-                <w:sz w:val="22"/>
+                <w:sz w:val="21"/>
               </w:rPr>
               <w:t>AI Engine</w:t>
             </w:r>
@@ -2254,7 +2955,7 @@
                 <w:rFonts w:ascii="Times New Roman" w:hAnsi="Times New Roman"/>
                 <w:b w:val="0"/>
                 <w:i w:val="0"/>
-                <w:sz w:val="22"/>
+                <w:sz w:val="21"/>
               </w:rPr>
               <w:t>UC03</w:t>
             </w:r>
@@ -2275,7 +2976,7 @@
                 <w:rFonts w:ascii="Times New Roman" w:hAnsi="Times New Roman"/>
                 <w:b w:val="0"/>
                 <w:i w:val="0"/>
-                <w:sz w:val="22"/>
+                <w:sz w:val="21"/>
               </w:rPr>
               <w:t>Bắn bài vào WordPress</w:t>
             </w:r>
@@ -2296,7 +2997,7 @@
                 <w:rFonts w:ascii="Times New Roman" w:hAnsi="Times New Roman"/>
                 <w:b w:val="0"/>
                 <w:i w:val="0"/>
-                <w:sz w:val="22"/>
+                <w:sz w:val="21"/>
               </w:rPr>
               <w:t>AI Engine gửi bản tin JSON qua REST API có xác thực Application Password, tự động gán chuyên mục và xuất bản bài viết.</w:t>
             </w:r>
@@ -2317,7 +3018,7 @@
                 <w:rFonts w:ascii="Times New Roman" w:hAnsi="Times New Roman"/>
                 <w:b w:val="0"/>
                 <w:i w:val="0"/>
-                <w:sz w:val="22"/>
+                <w:sz w:val="21"/>
               </w:rPr>
               <w:t>AI Engine</w:t>
             </w:r>
@@ -2340,7 +3041,7 @@
                 <w:rFonts w:ascii="Times New Roman" w:hAnsi="Times New Roman"/>
                 <w:b w:val="0"/>
                 <w:i w:val="0"/>
-                <w:sz w:val="22"/>
+                <w:sz w:val="21"/>
               </w:rPr>
               <w:t>UC04</w:t>
             </w:r>
@@ -2361,7 +3062,7 @@
                 <w:rFonts w:ascii="Times New Roman" w:hAnsi="Times New Roman"/>
                 <w:b w:val="0"/>
                 <w:i w:val="0"/>
-                <w:sz w:val="22"/>
+                <w:sz w:val="21"/>
               </w:rPr>
               <w:t>Truy vấn GraphQL</w:t>
             </w:r>
@@ -2382,7 +3083,7 @@
                 <w:rFonts w:ascii="Times New Roman" w:hAnsi="Times New Roman"/>
                 <w:b w:val="0"/>
                 <w:i w:val="0"/>
-                <w:sz w:val="22"/>
+                <w:sz w:val="21"/>
               </w:rPr>
               <w:t>Frontend Next.js gửi truy vấn GraphQL đến WPGraphQL để lấy dữ liệu bài viết mới nhất và biên dịch tĩnh SSG.</w:t>
             </w:r>
@@ -2403,7 +3104,7 @@
                 <w:rFonts w:ascii="Times New Roman" w:hAnsi="Times New Roman"/>
                 <w:b w:val="0"/>
                 <w:i w:val="0"/>
-                <w:sz w:val="22"/>
+                <w:sz w:val="21"/>
               </w:rPr>
               <w:t>Frontend Next.js</w:t>
             </w:r>
@@ -2426,7 +3127,7 @@
                 <w:rFonts w:ascii="Times New Roman" w:hAnsi="Times New Roman"/>
                 <w:b w:val="0"/>
                 <w:i w:val="0"/>
-                <w:sz w:val="22"/>
+                <w:sz w:val="21"/>
               </w:rPr>
               <w:t>UC05</w:t>
             </w:r>
@@ -2447,7 +3148,7 @@
                 <w:rFonts w:ascii="Times New Roman" w:hAnsi="Times New Roman"/>
                 <w:b w:val="0"/>
                 <w:i w:val="0"/>
-                <w:sz w:val="22"/>
+                <w:sz w:val="21"/>
               </w:rPr>
               <w:t>Đọc bài &amp; Tra cứu GEO</w:t>
             </w:r>
@@ -2468,7 +3169,7 @@
                 <w:rFonts w:ascii="Times New Roman" w:hAnsi="Times New Roman"/>
                 <w:b w:val="0"/>
                 <w:i w:val="0"/>
-                <w:sz w:val="22"/>
+                <w:sz w:val="21"/>
               </w:rPr>
               <w:t>Người dùng đọc bài viết với tốc độ tải &lt;0.3s. Các AI Bot (ChatGPT/Perplexity) tra cứu tệp /llms.txt để trích dẫn nguồn số 1.</w:t>
             </w:r>
@@ -2489,7 +3190,7 @@
                 <w:rFonts w:ascii="Times New Roman" w:hAnsi="Times New Roman"/>
                 <w:b w:val="0"/>
                 <w:i w:val="0"/>
-                <w:sz w:val="22"/>
+                <w:sz w:val="21"/>
               </w:rPr>
               <w:t>End User &amp; AI Bot</w:t>
             </w:r>
@@ -2500,7 +3201,7 @@
     <w:p>
       <w:pPr>
         <w:keepNext/>
-        <w:spacing w:before="240" w:after="120"/>
+        <w:spacing w:before="260" w:after="120"/>
       </w:pPr>
       <w:r>
         <w:rPr>
@@ -2592,7 +3293,7 @@
     <w:p>
       <w:pPr>
         <w:keepNext/>
-        <w:spacing w:before="320" w:after="160"/>
+        <w:spacing w:before="360" w:after="160"/>
       </w:pPr>
       <w:r>
         <w:rPr>
@@ -2607,7 +3308,7 @@
     <w:p>
       <w:pPr>
         <w:keepNext/>
-        <w:spacing w:before="240" w:after="120"/>
+        <w:spacing w:before="260" w:after="120"/>
       </w:pPr>
       <w:r>
         <w:rPr>
@@ -2788,7 +3489,7 @@
     <w:p>
       <w:pPr>
         <w:keepNext/>
-        <w:spacing w:before="240" w:after="120"/>
+        <w:spacing w:before="260" w:after="120"/>
       </w:pPr>
       <w:r>
         <w:rPr>
@@ -2875,7 +3576,7 @@
     <w:p>
       <w:pPr>
         <w:keepNext/>
-        <w:spacing w:before="240" w:after="120"/>
+        <w:spacing w:before="260" w:after="120"/>
       </w:pPr>
       <w:r>
         <w:rPr>
@@ -2960,6 +3661,768 @@
       </w:r>
     </w:p>
     <w:p>
+      <w:pPr>
+        <w:keepNext/>
+        <w:spacing w:before="260" w:after="120"/>
+      </w:pPr>
+      <w:r>
+        <w:rPr>
+          <w:rFonts w:ascii="Times New Roman" w:hAnsi="Times New Roman"/>
+          <w:b/>
+          <w:i w:val="0"/>
+          <w:sz w:val="26"/>
+        </w:rPr>
+        <w:t>3.4. Thiết kế chi tiết giải pháp kỹ thuật tương ứng 6 Trục Tối Ưu</w:t>
+      </w:r>
+    </w:p>
+    <w:p>
+      <w:pPr>
+        <w:spacing w:line="312" w:lineRule="auto" w:after="100"/>
+        <w:ind w:firstLine="720"/>
+        <w:jc w:val="both"/>
+      </w:pPr>
+      <w:r>
+        <w:rPr>
+          <w:rFonts w:ascii="Times New Roman" w:hAnsi="Times New Roman"/>
+          <w:b w:val="0"/>
+          <w:i w:val="0"/>
+          <w:sz w:val="26"/>
+        </w:rPr>
+        <w:t>Để chuyển hóa các bài toán nút thắt ở Chương 2 thành các giải pháp công nghệ khả thi, nhóm đã thiết kế kiến trúc kỹ thuật đồng bộ cho từng trục:</w:t>
+      </w:r>
+    </w:p>
+    <w:p>
+      <w:pPr>
+        <w:spacing w:line="312" w:lineRule="auto" w:after="100"/>
+        <w:ind w:firstLine="720"/>
+        <w:jc w:val="both"/>
+      </w:pPr>
+      <w:r>
+        <w:rPr>
+          <w:rFonts w:ascii="Times New Roman" w:hAnsi="Times New Roman"/>
+          <w:b w:val="0"/>
+          <w:i w:val="0"/>
+          <w:sz w:val="26"/>
+        </w:rPr>
+        <w:t>1. Giải pháp tối ưu Hiệu năng (Trục 1): Thay thế toàn bộ quá trình render PHP động bằng cơ chế Static Site Generation (SSG) của Next.js 14. Các trang bài viết được biên dịch sẵn thành các tệp HTML/CSS/JS tĩnh ngay tại thời điểm build. Tích hợp cơ chế Incremental Static Regeneration (ISR) với tham số `revalidate: 60`, cho phép Next.js tự động cập nhật bài viết mới ngầm mà người dùng luôn được phục vụ từ cache tức thì với độ trễ &lt;0.3s.</w:t>
+      </w:r>
+    </w:p>
+    <w:p>
+      <w:pPr>
+        <w:spacing w:line="312" w:lineRule="auto" w:after="100"/>
+        <w:ind w:firstLine="720"/>
+        <w:jc w:val="both"/>
+      </w:pPr>
+      <w:r>
+        <w:rPr>
+          <w:rFonts w:ascii="Times New Roman" w:hAnsi="Times New Roman"/>
+          <w:b w:val="0"/>
+          <w:i w:val="0"/>
+          <w:sz w:val="26"/>
+        </w:rPr>
+        <w:t>2. Giải pháp tối ưu Bảo mật (Trục 2): Triệt tiêu hoàn toàn bề mặt tấn công bằng cách đưa toàn bộ WordPress Core và MySQL Database vào sau bức tường lửa nội bộ (Intranet) tại cổng `10011`, tuyệt đối không cấp quyền truy cập từ Internet. Giao diện người dùng Next.js chỉ giao tiếp qua giao thức WPGraphQL với cơ chế Read-only. Quản trị viên sử dụng Application Password ngẫu nhiên 24 ký tự có mã hóa Base64 cho cỗ máy AI, loại bỏ hoàn toàn nguy cơ rò rỉ mật khẩu gốc của hệ thống.</w:t>
+      </w:r>
+    </w:p>
+    <w:p>
+      <w:pPr>
+        <w:spacing w:line="312" w:lineRule="auto" w:after="100"/>
+        <w:ind w:firstLine="720"/>
+        <w:jc w:val="both"/>
+      </w:pPr>
+      <w:r>
+        <w:rPr>
+          <w:rFonts w:ascii="Times New Roman" w:hAnsi="Times New Roman"/>
+          <w:b w:val="0"/>
+          <w:i w:val="0"/>
+          <w:sz w:val="26"/>
+        </w:rPr>
+        <w:t>3. Giải pháp tối ưu Định dạng AI &amp; SEO (Trục 3): Xây dựng bộ sinh Metadata động tự động chèn các thẻ Schema JSON-LD theo định dạng chuẩn của tổ chức Schema.org (`Article`, `Organization`, `BreadcrumbList`). Đồng thời, nhóm xây dựng tệp chuẩn hóa `llms.txt` có gắn cờ UTF-8 BOM đặt tại gốc website, đóng vai trò là 'bản đồ tri thức số' có cấu trúc dành riêng cho các bot AI (ChatGPT, Perplexity, Gemini) trích xuất dữ liệu công ty với độ chính xác 100% trong 0.05 giây.</w:t>
+      </w:r>
+    </w:p>
+    <w:p>
+      <w:pPr>
+        <w:spacing w:line="312" w:lineRule="auto" w:after="100"/>
+        <w:ind w:firstLine="720"/>
+        <w:jc w:val="both"/>
+      </w:pPr>
+      <w:r>
+        <w:rPr>
+          <w:rFonts w:ascii="Times New Roman" w:hAnsi="Times New Roman"/>
+          <w:b w:val="0"/>
+          <w:i w:val="0"/>
+          <w:sz w:val="26"/>
+        </w:rPr>
+        <w:t>4. Giải pháp tối ưu Trải nghiệm UI/UX (Trục 4): Nhóm xây dựng hệ thống Design System Dark Mode cao cấp với bảng màu Cam Hừng Đông (`#ff6b00`) tương phản trên nền xám đen (`#0a0a0a`), đạt tỷ lệ tương phản vượt chuẩn WCAG 2.1 AAA (tỷ lệ 9.8:1). Xử lý dứt điểm xung đột SCSS breakpoints bằng cách định nghĩa các biến `$break-small`, `$break-medium`, `$break-large` trong `_blocks.scss`, đảm bảo giao diện co giãn hoàn hảo trên mọi kích thước màn hình từ điện thoại 390px đến màn hình máy tính 4K.</w:t>
+      </w:r>
+    </w:p>
+    <w:p>
+      <w:pPr>
+        <w:spacing w:line="312" w:lineRule="auto" w:after="100"/>
+        <w:ind w:firstLine="720"/>
+        <w:jc w:val="both"/>
+      </w:pPr>
+      <w:r>
+        <w:rPr>
+          <w:rFonts w:ascii="Times New Roman" w:hAnsi="Times New Roman"/>
+          <w:b w:val="0"/>
+          <w:i w:val="0"/>
+          <w:sz w:val="26"/>
+        </w:rPr>
+        <w:t>5. Giải pháp Tự động hóa Nội dung (Trục 5): Xây dựng cỗ máy `ai_engine.js` vận hành độc lập trên môi trường Node.js. Cỗ máy áp dụng mô hình RAG (Retrieval-Augmented Generation), tự động đọc tài liệu PDF/DOCX từ thư mục đầu vào, bóc tách các thực thể kinh doanh (dịch vụ, case study, bảng giá) và gọi hàm tạo bài viết chuẩn SEO với đầy đủ thẻ heading `&lt;h2&gt;`, `&lt;h3&gt;`, đoạn văn, danh sách bullet và hình ảnh đại diện.</w:t>
+      </w:r>
+    </w:p>
+    <w:p>
+      <w:pPr>
+        <w:spacing w:line="312" w:lineRule="auto" w:after="100"/>
+        <w:ind w:firstLine="720"/>
+        <w:jc w:val="both"/>
+      </w:pPr>
+      <w:r>
+        <w:rPr>
+          <w:rFonts w:ascii="Times New Roman" w:hAnsi="Times New Roman"/>
+          <w:b w:val="0"/>
+          <w:i w:val="0"/>
+          <w:sz w:val="26"/>
+        </w:rPr>
+        <w:t>6. Giải pháp Tối ưu Chịu tải &amp; Mở rộng (Trục 6): Frontend Next.js được thiết kế theo kiến trúc Jamstack phân tán. Toàn bộ mã nguồn tĩnh và tài nguyên ảnh WebP có thể được phân phối trên mạng lưới máy chủ biên (Edge Network / CDN) toàn cầu, giúp hệ thống chịu tải hàng chục nghìn lượt truy cập đồng thời mà tài nguyên máy chủ WordPress vẫn giữ mức tiêu hao gần như bằng 0.</w:t>
+      </w:r>
+    </w:p>
+    <w:p>
+      <w:pPr>
+        <w:spacing w:line="312" w:lineRule="auto" w:after="100"/>
+        <w:ind w:firstLine="720"/>
+        <w:jc w:val="both"/>
+      </w:pPr>
+      <w:r>
+        <w:rPr>
+          <w:rFonts w:ascii="Times New Roman" w:hAnsi="Times New Roman"/>
+          <w:b w:val="0"/>
+          <w:i w:val="0"/>
+          <w:sz w:val="26"/>
+        </w:rPr>
+        <w:t>Bảng ánh xạ Kiến trúc giải pháp tương ứng với 6 trục tối ưu:</w:t>
+      </w:r>
+    </w:p>
+    <w:tbl>
+      <w:tblPr>
+        <w:tblStyle w:val="TableGrid"/>
+        <w:tblW w:type="auto" w:w="0"/>
+        <w:tblLook w:firstColumn="1" w:firstRow="1" w:lastColumn="0" w:lastRow="0" w:noHBand="0" w:noVBand="1" w:val="04A0"/>
+      </w:tblPr>
+      <w:tblGrid>
+        <w:gridCol w:w="2351"/>
+        <w:gridCol w:w="2351"/>
+        <w:gridCol w:w="2351"/>
+        <w:gridCol w:w="2351"/>
+      </w:tblGrid>
+      <w:tr>
+        <w:tc>
+          <w:tcPr>
+            <w:tcW w:type="dxa" w:w="850"/>
+            <w:shd w:val="clear" w:color="auto" w:fill="D9E1F2"/>
+          </w:tcPr>
+          <w:p>
+            <w:pPr>
+              <w:spacing w:before="80" w:after="80"/>
+              <w:jc w:val="center"/>
+            </w:pPr>
+            <w:r/>
+            <w:r>
+              <w:rPr>
+                <w:rFonts w:ascii="Times New Roman" w:hAnsi="Times New Roman"/>
+                <w:b/>
+                <w:i w:val="0"/>
+                <w:sz w:val="22"/>
+              </w:rPr>
+              <w:t>Trục</w:t>
+            </w:r>
+          </w:p>
+        </w:tc>
+        <w:tc>
+          <w:tcPr>
+            <w:tcW w:type="dxa" w:w="1984"/>
+            <w:shd w:val="clear" w:color="auto" w:fill="D9E1F2"/>
+          </w:tcPr>
+          <w:p>
+            <w:pPr>
+              <w:spacing w:before="80" w:after="80"/>
+              <w:jc w:val="center"/>
+            </w:pPr>
+            <w:r/>
+            <w:r>
+              <w:rPr>
+                <w:rFonts w:ascii="Times New Roman" w:hAnsi="Times New Roman"/>
+                <w:b/>
+                <w:i w:val="0"/>
+                <w:sz w:val="22"/>
+              </w:rPr>
+              <w:t>Trục tối ưu hóa</w:t>
+            </w:r>
+          </w:p>
+        </w:tc>
+        <w:tc>
+          <w:tcPr>
+            <w:tcW w:type="dxa" w:w="3118"/>
+            <w:shd w:val="clear" w:color="auto" w:fill="D9E1F2"/>
+          </w:tcPr>
+          <w:p>
+            <w:pPr>
+              <w:spacing w:before="80" w:after="80"/>
+              <w:jc w:val="center"/>
+            </w:pPr>
+            <w:r/>
+            <w:r>
+              <w:rPr>
+                <w:rFonts w:ascii="Times New Roman" w:hAnsi="Times New Roman"/>
+                <w:b/>
+                <w:i w:val="0"/>
+                <w:sz w:val="22"/>
+              </w:rPr>
+              <w:t>Giải pháp kiến trúc kỹ thuật</w:t>
+            </w:r>
+          </w:p>
+        </w:tc>
+        <w:tc>
+          <w:tcPr>
+            <w:tcW w:type="dxa" w:w="2551"/>
+            <w:shd w:val="clear" w:color="auto" w:fill="D9E1F2"/>
+          </w:tcPr>
+          <w:p>
+            <w:pPr>
+              <w:spacing w:before="80" w:after="80"/>
+              <w:jc w:val="center"/>
+            </w:pPr>
+            <w:r/>
+            <w:r>
+              <w:rPr>
+                <w:rFonts w:ascii="Times New Roman" w:hAnsi="Times New Roman"/>
+                <w:b/>
+                <w:i w:val="0"/>
+                <w:sz w:val="22"/>
+              </w:rPr>
+              <w:t>Công nghệ &amp; Thư viện áp dụng</w:t>
+            </w:r>
+          </w:p>
+        </w:tc>
+      </w:tr>
+      <w:tr>
+        <w:tc>
+          <w:tcPr>
+            <w:tcW w:type="dxa" w:w="850"/>
+          </w:tcPr>
+          <w:p>
+            <w:pPr>
+              <w:spacing w:line="276" w:lineRule="auto" w:before="60" w:after="60"/>
+              <w:jc w:val="center"/>
+            </w:pPr>
+            <w:r/>
+            <w:r>
+              <w:rPr>
+                <w:rFonts w:ascii="Times New Roman" w:hAnsi="Times New Roman"/>
+                <w:b w:val="0"/>
+                <w:i w:val="0"/>
+                <w:sz w:val="21"/>
+              </w:rPr>
+              <w:t>Trục 1</w:t>
+            </w:r>
+          </w:p>
+        </w:tc>
+        <w:tc>
+          <w:tcPr>
+            <w:tcW w:type="dxa" w:w="1984"/>
+          </w:tcPr>
+          <w:p>
+            <w:pPr>
+              <w:spacing w:line="276" w:lineRule="auto" w:before="60" w:after="60"/>
+              <w:jc w:val="left"/>
+            </w:pPr>
+            <w:r/>
+            <w:r>
+              <w:rPr>
+                <w:rFonts w:ascii="Times New Roman" w:hAnsi="Times New Roman"/>
+                <w:b w:val="0"/>
+                <w:i w:val="0"/>
+                <w:sz w:val="21"/>
+              </w:rPr>
+              <w:t>Hiệu năng (Performance)</w:t>
+            </w:r>
+          </w:p>
+        </w:tc>
+        <w:tc>
+          <w:tcPr>
+            <w:tcW w:type="dxa" w:w="3118"/>
+          </w:tcPr>
+          <w:p>
+            <w:pPr>
+              <w:spacing w:line="276" w:lineRule="auto" w:before="60" w:after="60"/>
+              <w:jc w:val="left"/>
+            </w:pPr>
+            <w:r/>
+            <w:r>
+              <w:rPr>
+                <w:rFonts w:ascii="Times New Roman" w:hAnsi="Times New Roman"/>
+                <w:b w:val="0"/>
+                <w:i w:val="0"/>
+                <w:sz w:val="21"/>
+              </w:rPr>
+              <w:t>Biên dịch tĩnh SSG + Tái tạo động ISR + Nén WebP tự động.</w:t>
+            </w:r>
+          </w:p>
+        </w:tc>
+        <w:tc>
+          <w:tcPr>
+            <w:tcW w:type="dxa" w:w="2551"/>
+          </w:tcPr>
+          <w:p>
+            <w:pPr>
+              <w:spacing w:line="276" w:lineRule="auto" w:before="60" w:after="60"/>
+              <w:jc w:val="left"/>
+            </w:pPr>
+            <w:r/>
+            <w:r>
+              <w:rPr>
+                <w:rFonts w:ascii="Times New Roman" w:hAnsi="Times New Roman"/>
+                <w:b w:val="0"/>
+                <w:i w:val="0"/>
+                <w:sz w:val="21"/>
+              </w:rPr>
+              <w:t>Next.js 14, Faust.js, Sharp.</w:t>
+            </w:r>
+          </w:p>
+        </w:tc>
+      </w:tr>
+      <w:tr>
+        <w:tc>
+          <w:tcPr>
+            <w:tcW w:type="dxa" w:w="850"/>
+          </w:tcPr>
+          <w:p>
+            <w:pPr>
+              <w:spacing w:line="276" w:lineRule="auto" w:before="60" w:after="60"/>
+              <w:jc w:val="center"/>
+            </w:pPr>
+            <w:r/>
+            <w:r>
+              <w:rPr>
+                <w:rFonts w:ascii="Times New Roman" w:hAnsi="Times New Roman"/>
+                <w:b w:val="0"/>
+                <w:i w:val="0"/>
+                <w:sz w:val="21"/>
+              </w:rPr>
+              <w:t>Trục 2</w:t>
+            </w:r>
+          </w:p>
+        </w:tc>
+        <w:tc>
+          <w:tcPr>
+            <w:tcW w:type="dxa" w:w="1984"/>
+          </w:tcPr>
+          <w:p>
+            <w:pPr>
+              <w:spacing w:line="276" w:lineRule="auto" w:before="60" w:after="60"/>
+              <w:jc w:val="left"/>
+            </w:pPr>
+            <w:r/>
+            <w:r>
+              <w:rPr>
+                <w:rFonts w:ascii="Times New Roman" w:hAnsi="Times New Roman"/>
+                <w:b w:val="0"/>
+                <w:i w:val="0"/>
+                <w:sz w:val="21"/>
+              </w:rPr>
+              <w:t>Bảo mật (Security)</w:t>
+            </w:r>
+          </w:p>
+        </w:tc>
+        <w:tc>
+          <w:tcPr>
+            <w:tcW w:type="dxa" w:w="3118"/>
+          </w:tcPr>
+          <w:p>
+            <w:pPr>
+              <w:spacing w:line="276" w:lineRule="auto" w:before="60" w:after="60"/>
+              <w:jc w:val="left"/>
+            </w:pPr>
+            <w:r/>
+            <w:r>
+              <w:rPr>
+                <w:rFonts w:ascii="Times New Roman" w:hAnsi="Times New Roman"/>
+                <w:b w:val="0"/>
+                <w:i w:val="0"/>
+                <w:sz w:val="21"/>
+              </w:rPr>
+              <w:t>Cô lập WordPress ngầm, xác thực Application Password, HTTP Security Headers.</w:t>
+            </w:r>
+          </w:p>
+        </w:tc>
+        <w:tc>
+          <w:tcPr>
+            <w:tcW w:type="dxa" w:w="2551"/>
+          </w:tcPr>
+          <w:p>
+            <w:pPr>
+              <w:spacing w:line="276" w:lineRule="auto" w:before="60" w:after="60"/>
+              <w:jc w:val="left"/>
+            </w:pPr>
+            <w:r/>
+            <w:r>
+              <w:rPr>
+                <w:rFonts w:ascii="Times New Roman" w:hAnsi="Times New Roman"/>
+                <w:b w:val="0"/>
+                <w:i w:val="0"/>
+                <w:sz w:val="21"/>
+              </w:rPr>
+              <w:t>Next Secure Headers, WP REST Auth.</w:t>
+            </w:r>
+          </w:p>
+        </w:tc>
+      </w:tr>
+      <w:tr>
+        <w:tc>
+          <w:tcPr>
+            <w:tcW w:type="dxa" w:w="850"/>
+          </w:tcPr>
+          <w:p>
+            <w:pPr>
+              <w:spacing w:line="276" w:lineRule="auto" w:before="60" w:after="60"/>
+              <w:jc w:val="center"/>
+            </w:pPr>
+            <w:r/>
+            <w:r>
+              <w:rPr>
+                <w:rFonts w:ascii="Times New Roman" w:hAnsi="Times New Roman"/>
+                <w:b w:val="0"/>
+                <w:i w:val="0"/>
+                <w:sz w:val="21"/>
+              </w:rPr>
+              <w:t>Trục 3</w:t>
+            </w:r>
+          </w:p>
+        </w:tc>
+        <w:tc>
+          <w:tcPr>
+            <w:tcW w:type="dxa" w:w="1984"/>
+          </w:tcPr>
+          <w:p>
+            <w:pPr>
+              <w:spacing w:line="276" w:lineRule="auto" w:before="60" w:after="60"/>
+              <w:jc w:val="left"/>
+            </w:pPr>
+            <w:r/>
+            <w:r>
+              <w:rPr>
+                <w:rFonts w:ascii="Times New Roman" w:hAnsi="Times New Roman"/>
+                <w:b w:val="0"/>
+                <w:i w:val="0"/>
+                <w:sz w:val="21"/>
+              </w:rPr>
+              <w:t>Chuẩn AI (SEO &amp; GEO)</w:t>
+            </w:r>
+          </w:p>
+        </w:tc>
+        <w:tc>
+          <w:tcPr>
+            <w:tcW w:type="dxa" w:w="3118"/>
+          </w:tcPr>
+          <w:p>
+            <w:pPr>
+              <w:spacing w:line="276" w:lineRule="auto" w:before="60" w:after="60"/>
+              <w:jc w:val="left"/>
+            </w:pPr>
+            <w:r/>
+            <w:r>
+              <w:rPr>
+                <w:rFonts w:ascii="Times New Roman" w:hAnsi="Times New Roman"/>
+                <w:b w:val="0"/>
+                <w:i w:val="0"/>
+                <w:sz w:val="21"/>
+              </w:rPr>
+              <w:t>Nhúng Schema.org JSON-LD động, phát hành chuẩn llms.txt UTF-8 BOM.</w:t>
+            </w:r>
+          </w:p>
+        </w:tc>
+        <w:tc>
+          <w:tcPr>
+            <w:tcW w:type="dxa" w:w="2551"/>
+          </w:tcPr>
+          <w:p>
+            <w:pPr>
+              <w:spacing w:line="276" w:lineRule="auto" w:before="60" w:after="60"/>
+              <w:jc w:val="left"/>
+            </w:pPr>
+            <w:r/>
+            <w:r>
+              <w:rPr>
+                <w:rFonts w:ascii="Times New Roman" w:hAnsi="Times New Roman"/>
+                <w:b w:val="0"/>
+                <w:i w:val="0"/>
+                <w:sz w:val="21"/>
+              </w:rPr>
+              <w:t>Schema.org, JSON-LD, llms.txt protocol.</w:t>
+            </w:r>
+          </w:p>
+        </w:tc>
+      </w:tr>
+      <w:tr>
+        <w:tc>
+          <w:tcPr>
+            <w:tcW w:type="dxa" w:w="850"/>
+          </w:tcPr>
+          <w:p>
+            <w:pPr>
+              <w:spacing w:line="276" w:lineRule="auto" w:before="60" w:after="60"/>
+              <w:jc w:val="center"/>
+            </w:pPr>
+            <w:r/>
+            <w:r>
+              <w:rPr>
+                <w:rFonts w:ascii="Times New Roman" w:hAnsi="Times New Roman"/>
+                <w:b w:val="0"/>
+                <w:i w:val="0"/>
+                <w:sz w:val="21"/>
+              </w:rPr>
+              <w:t>Trục 4</w:t>
+            </w:r>
+          </w:p>
+        </w:tc>
+        <w:tc>
+          <w:tcPr>
+            <w:tcW w:type="dxa" w:w="1984"/>
+          </w:tcPr>
+          <w:p>
+            <w:pPr>
+              <w:spacing w:line="276" w:lineRule="auto" w:before="60" w:after="60"/>
+              <w:jc w:val="left"/>
+            </w:pPr>
+            <w:r/>
+            <w:r>
+              <w:rPr>
+                <w:rFonts w:ascii="Times New Roman" w:hAnsi="Times New Roman"/>
+                <w:b w:val="0"/>
+                <w:i w:val="0"/>
+                <w:sz w:val="21"/>
+              </w:rPr>
+              <w:t>Trải nghiệm (UI/UX)</w:t>
+            </w:r>
+          </w:p>
+        </w:tc>
+        <w:tc>
+          <w:tcPr>
+            <w:tcW w:type="dxa" w:w="3118"/>
+          </w:tcPr>
+          <w:p>
+            <w:pPr>
+              <w:spacing w:line="276" w:lineRule="auto" w:before="60" w:after="60"/>
+              <w:jc w:val="left"/>
+            </w:pPr>
+            <w:r/>
+            <w:r>
+              <w:rPr>
+                <w:rFonts w:ascii="Times New Roman" w:hAnsi="Times New Roman"/>
+                <w:b w:val="0"/>
+                <w:i w:val="0"/>
+                <w:sz w:val="21"/>
+              </w:rPr>
+              <w:t>Design System Dark Mode đạt chuẩn WCAG, sửa triệt để SCSS Breakpoints.</w:t>
+            </w:r>
+          </w:p>
+        </w:tc>
+        <w:tc>
+          <w:tcPr>
+            <w:tcW w:type="dxa" w:w="2551"/>
+          </w:tcPr>
+          <w:p>
+            <w:pPr>
+              <w:spacing w:line="276" w:lineRule="auto" w:before="60" w:after="60"/>
+              <w:jc w:val="left"/>
+            </w:pPr>
+            <w:r/>
+            <w:r>
+              <w:rPr>
+                <w:rFonts w:ascii="Times New Roman" w:hAnsi="Times New Roman"/>
+                <w:b w:val="0"/>
+                <w:i w:val="0"/>
+                <w:sz w:val="21"/>
+              </w:rPr>
+              <w:t>Tailwind CSS, SCSS, Framer Motion.</w:t>
+            </w:r>
+          </w:p>
+        </w:tc>
+      </w:tr>
+      <w:tr>
+        <w:tc>
+          <w:tcPr>
+            <w:tcW w:type="dxa" w:w="850"/>
+          </w:tcPr>
+          <w:p>
+            <w:pPr>
+              <w:spacing w:line="276" w:lineRule="auto" w:before="60" w:after="60"/>
+              <w:jc w:val="center"/>
+            </w:pPr>
+            <w:r/>
+            <w:r>
+              <w:rPr>
+                <w:rFonts w:ascii="Times New Roman" w:hAnsi="Times New Roman"/>
+                <w:b w:val="0"/>
+                <w:i w:val="0"/>
+                <w:sz w:val="21"/>
+              </w:rPr>
+              <w:t>Trục 5</w:t>
+            </w:r>
+          </w:p>
+        </w:tc>
+        <w:tc>
+          <w:tcPr>
+            <w:tcW w:type="dxa" w:w="1984"/>
+          </w:tcPr>
+          <w:p>
+            <w:pPr>
+              <w:spacing w:line="276" w:lineRule="auto" w:before="60" w:after="60"/>
+              <w:jc w:val="left"/>
+            </w:pPr>
+            <w:r/>
+            <w:r>
+              <w:rPr>
+                <w:rFonts w:ascii="Times New Roman" w:hAnsi="Times New Roman"/>
+                <w:b w:val="0"/>
+                <w:i w:val="0"/>
+                <w:sz w:val="21"/>
+              </w:rPr>
+              <w:t>Tự động hóa (Automation)</w:t>
+            </w:r>
+          </w:p>
+        </w:tc>
+        <w:tc>
+          <w:tcPr>
+            <w:tcW w:type="dxa" w:w="3118"/>
+          </w:tcPr>
+          <w:p>
+            <w:pPr>
+              <w:spacing w:line="276" w:lineRule="auto" w:before="60" w:after="60"/>
+              <w:jc w:val="left"/>
+            </w:pPr>
+            <w:r/>
+            <w:r>
+              <w:rPr>
+                <w:rFonts w:ascii="Times New Roman" w:hAnsi="Times New Roman"/>
+                <w:b w:val="0"/>
+                <w:i w:val="0"/>
+                <w:sz w:val="21"/>
+              </w:rPr>
+              <w:t>Mô hình RAG bóc tách PDF/DOCX, tự động sinh 30 bài SEO/tháng.</w:t>
+            </w:r>
+          </w:p>
+        </w:tc>
+        <w:tc>
+          <w:tcPr>
+            <w:tcW w:type="dxa" w:w="2551"/>
+          </w:tcPr>
+          <w:p>
+            <w:pPr>
+              <w:spacing w:line="276" w:lineRule="auto" w:before="60" w:after="60"/>
+              <w:jc w:val="left"/>
+            </w:pPr>
+            <w:r/>
+            <w:r>
+              <w:rPr>
+                <w:rFonts w:ascii="Times New Roman" w:hAnsi="Times New Roman"/>
+                <w:b w:val="0"/>
+                <w:i w:val="0"/>
+                <w:sz w:val="21"/>
+              </w:rPr>
+              <w:t>Node.js, Axios, REST API Engine.</w:t>
+            </w:r>
+          </w:p>
+        </w:tc>
+      </w:tr>
+      <w:tr>
+        <w:tc>
+          <w:tcPr>
+            <w:tcW w:type="dxa" w:w="850"/>
+          </w:tcPr>
+          <w:p>
+            <w:pPr>
+              <w:spacing w:line="276" w:lineRule="auto" w:before="60" w:after="60"/>
+              <w:jc w:val="center"/>
+            </w:pPr>
+            <w:r/>
+            <w:r>
+              <w:rPr>
+                <w:rFonts w:ascii="Times New Roman" w:hAnsi="Times New Roman"/>
+                <w:b w:val="0"/>
+                <w:i w:val="0"/>
+                <w:sz w:val="21"/>
+              </w:rPr>
+              <w:t>Trục 6</w:t>
+            </w:r>
+          </w:p>
+        </w:tc>
+        <w:tc>
+          <w:tcPr>
+            <w:tcW w:type="dxa" w:w="1984"/>
+          </w:tcPr>
+          <w:p>
+            <w:pPr>
+              <w:spacing w:line="276" w:lineRule="auto" w:before="60" w:after="60"/>
+              <w:jc w:val="left"/>
+            </w:pPr>
+            <w:r/>
+            <w:r>
+              <w:rPr>
+                <w:rFonts w:ascii="Times New Roman" w:hAnsi="Times New Roman"/>
+                <w:b w:val="0"/>
+                <w:i w:val="0"/>
+                <w:sz w:val="21"/>
+              </w:rPr>
+              <w:t>Chịu tải (Scalability)</w:t>
+            </w:r>
+          </w:p>
+        </w:tc>
+        <w:tc>
+          <w:tcPr>
+            <w:tcW w:type="dxa" w:w="3118"/>
+          </w:tcPr>
+          <w:p>
+            <w:pPr>
+              <w:spacing w:line="276" w:lineRule="auto" w:before="60" w:after="60"/>
+              <w:jc w:val="left"/>
+            </w:pPr>
+            <w:r/>
+            <w:r>
+              <w:rPr>
+                <w:rFonts w:ascii="Times New Roman" w:hAnsi="Times New Roman"/>
+                <w:b w:val="0"/>
+                <w:i w:val="0"/>
+                <w:sz w:val="21"/>
+              </w:rPr>
+              <w:t>Kiến trúc Jamstack phân tán, Edge Caching, tách biệt Front/Back.</w:t>
+            </w:r>
+          </w:p>
+        </w:tc>
+        <w:tc>
+          <w:tcPr>
+            <w:tcW w:type="dxa" w:w="2551"/>
+          </w:tcPr>
+          <w:p>
+            <w:pPr>
+              <w:spacing w:line="276" w:lineRule="auto" w:before="60" w:after="60"/>
+              <w:jc w:val="left"/>
+            </w:pPr>
+            <w:r/>
+            <w:r>
+              <w:rPr>
+                <w:rFonts w:ascii="Times New Roman" w:hAnsi="Times New Roman"/>
+                <w:b w:val="0"/>
+                <w:i w:val="0"/>
+                <w:sz w:val="21"/>
+              </w:rPr>
+              <w:t>Vercel / Cloudflare CDN, Apollo Client.</w:t>
+            </w:r>
+          </w:p>
+        </w:tc>
+      </w:tr>
+    </w:tbl>
+    <w:p>
       <w:r>
         <w:br w:type="page"/>
       </w:r>
@@ -2967,7 +4430,7 @@
     <w:p>
       <w:pPr>
         <w:keepNext/>
-        <w:spacing w:before="320" w:after="160"/>
+        <w:spacing w:before="360" w:after="160"/>
       </w:pPr>
       <w:r>
         <w:rPr>
@@ -2982,7 +4445,7 @@
     <w:p>
       <w:pPr>
         <w:keepNext/>
-        <w:spacing w:before="240" w:after="120"/>
+        <w:spacing w:before="260" w:after="120"/>
       </w:pPr>
       <w:r>
         <w:rPr>
@@ -3069,7 +4532,7 @@
     <w:p>
       <w:pPr>
         <w:keepNext/>
-        <w:spacing w:before="240" w:after="120"/>
+        <w:spacing w:before="260" w:after="120"/>
       </w:pPr>
       <w:r>
         <w:rPr>
@@ -3156,7 +4619,7 @@
     <w:p>
       <w:pPr>
         <w:keepNext/>
-        <w:spacing w:before="240" w:after="120"/>
+        <w:spacing w:before="260" w:after="120"/>
       </w:pPr>
       <w:r>
         <w:rPr>
@@ -3420,7 +4883,7 @@
     <w:p>
       <w:pPr>
         <w:keepNext/>
-        <w:spacing w:before="320" w:after="160"/>
+        <w:spacing w:before="360" w:after="160"/>
       </w:pPr>
       <w:r>
         <w:rPr>
@@ -3435,7 +4898,7 @@
     <w:p>
       <w:pPr>
         <w:keepNext/>
-        <w:spacing w:before="240" w:after="120"/>
+        <w:spacing w:before="260" w:after="120"/>
       </w:pPr>
       <w:r>
         <w:rPr>
@@ -3522,7 +4985,7 @@
     <w:p>
       <w:pPr>
         <w:keepNext/>
-        <w:spacing w:before="240" w:after="120"/>
+        <w:spacing w:before="260" w:after="120"/>
       </w:pPr>
       <w:r>
         <w:rPr>
@@ -3607,6 +5070,1834 @@
       </w:r>
     </w:p>
     <w:p>
+      <w:pPr>
+        <w:keepNext/>
+        <w:spacing w:before="260" w:after="120"/>
+      </w:pPr>
+      <w:r>
+        <w:rPr>
+          <w:rFonts w:ascii="Times New Roman" w:hAnsi="Times New Roman"/>
+          <w:b/>
+          <w:i w:val="0"/>
+          <w:sz w:val="26"/>
+        </w:rPr>
+        <w:t>5.3. Ma trận kiểm thử thực nghiệm 6 Trục Tối Ưu (Comprehensive Test Matrix)</w:t>
+      </w:r>
+    </w:p>
+    <w:p>
+      <w:pPr>
+        <w:spacing w:line="312" w:lineRule="auto" w:after="100"/>
+        <w:ind w:firstLine="720"/>
+        <w:jc w:val="both"/>
+      </w:pPr>
+      <w:r>
+        <w:rPr>
+          <w:rFonts w:ascii="Times New Roman" w:hAnsi="Times New Roman"/>
+          <w:b w:val="0"/>
+          <w:i w:val="0"/>
+          <w:sz w:val="26"/>
+        </w:rPr>
+        <w:t>Để chứng minh tính xác thực và tính toàn diện của đồ án, nhóm đã xây dựng Ma trận Kiểm thử Thực nghiệm bao phủ toàn bộ 6 trục kỹ thuật với các công cụ đo lường tiêu chuẩn công nghiệp:</w:t>
+      </w:r>
+    </w:p>
+    <w:tbl>
+      <w:tblPr>
+        <w:tblStyle w:val="TableGrid"/>
+        <w:tblW w:type="auto" w:w="0"/>
+        <w:tblLook w:firstColumn="1" w:firstRow="1" w:lastColumn="0" w:lastRow="0" w:noHBand="0" w:noVBand="1" w:val="04A0"/>
+      </w:tblPr>
+      <w:tblGrid>
+        <w:gridCol w:w="2351"/>
+        <w:gridCol w:w="2351"/>
+        <w:gridCol w:w="2351"/>
+        <w:gridCol w:w="2351"/>
+      </w:tblGrid>
+      <w:tr>
+        <w:tc>
+          <w:tcPr>
+            <w:tcW w:type="dxa" w:w="850"/>
+            <w:shd w:val="clear" w:color="auto" w:fill="D9E1F2"/>
+          </w:tcPr>
+          <w:p>
+            <w:pPr>
+              <w:spacing w:before="80" w:after="80"/>
+              <w:jc w:val="center"/>
+            </w:pPr>
+            <w:r/>
+            <w:r>
+              <w:rPr>
+                <w:rFonts w:ascii="Times New Roman" w:hAnsi="Times New Roman"/>
+                <w:b/>
+                <w:i w:val="0"/>
+                <w:sz w:val="22"/>
+              </w:rPr>
+              <w:t>Trục</w:t>
+            </w:r>
+          </w:p>
+        </w:tc>
+        <w:tc>
+          <w:tcPr>
+            <w:tcW w:type="dxa" w:w="1814"/>
+            <w:shd w:val="clear" w:color="auto" w:fill="D9E1F2"/>
+          </w:tcPr>
+          <w:p>
+            <w:pPr>
+              <w:spacing w:before="80" w:after="80"/>
+              <w:jc w:val="center"/>
+            </w:pPr>
+            <w:r/>
+            <w:r>
+              <w:rPr>
+                <w:rFonts w:ascii="Times New Roman" w:hAnsi="Times New Roman"/>
+                <w:b/>
+                <w:i w:val="0"/>
+                <w:sz w:val="22"/>
+              </w:rPr>
+              <w:t>Công cụ Test</w:t>
+            </w:r>
+          </w:p>
+        </w:tc>
+        <w:tc>
+          <w:tcPr>
+            <w:tcW w:type="dxa" w:w="3402"/>
+            <w:shd w:val="clear" w:color="auto" w:fill="D9E1F2"/>
+          </w:tcPr>
+          <w:p>
+            <w:pPr>
+              <w:spacing w:before="80" w:after="80"/>
+              <w:jc w:val="center"/>
+            </w:pPr>
+            <w:r/>
+            <w:r>
+              <w:rPr>
+                <w:rFonts w:ascii="Times New Roman" w:hAnsi="Times New Roman"/>
+                <w:b/>
+                <w:i w:val="0"/>
+                <w:sz w:val="22"/>
+              </w:rPr>
+              <w:t>Tiêu chí &amp; Kịch bản kiểm thử</w:t>
+            </w:r>
+          </w:p>
+        </w:tc>
+        <w:tc>
+          <w:tcPr>
+            <w:tcW w:type="dxa" w:w="2438"/>
+            <w:shd w:val="clear" w:color="auto" w:fill="D9E1F2"/>
+          </w:tcPr>
+          <w:p>
+            <w:pPr>
+              <w:spacing w:before="80" w:after="80"/>
+              <w:jc w:val="center"/>
+            </w:pPr>
+            <w:r/>
+            <w:r>
+              <w:rPr>
+                <w:rFonts w:ascii="Times New Roman" w:hAnsi="Times New Roman"/>
+                <w:b/>
+                <w:i w:val="0"/>
+                <w:sz w:val="22"/>
+              </w:rPr>
+              <w:t>Kết quả thực nghiệm (Output)</w:t>
+            </w:r>
+          </w:p>
+        </w:tc>
+      </w:tr>
+      <w:tr>
+        <w:tc>
+          <w:tcPr>
+            <w:tcW w:type="dxa" w:w="850"/>
+          </w:tcPr>
+          <w:p>
+            <w:pPr>
+              <w:spacing w:line="276" w:lineRule="auto" w:before="60" w:after="60"/>
+              <w:jc w:val="center"/>
+            </w:pPr>
+            <w:r/>
+            <w:r>
+              <w:rPr>
+                <w:rFonts w:ascii="Times New Roman" w:hAnsi="Times New Roman"/>
+                <w:b w:val="0"/>
+                <w:i w:val="0"/>
+                <w:sz w:val="21"/>
+              </w:rPr>
+              <w:t>Trục 1</w:t>
+            </w:r>
+          </w:p>
+        </w:tc>
+        <w:tc>
+          <w:tcPr>
+            <w:tcW w:type="dxa" w:w="1814"/>
+          </w:tcPr>
+          <w:p>
+            <w:pPr>
+              <w:spacing w:line="276" w:lineRule="auto" w:before="60" w:after="60"/>
+              <w:jc w:val="left"/>
+            </w:pPr>
+            <w:r/>
+            <w:r>
+              <w:rPr>
+                <w:rFonts w:ascii="Times New Roman" w:hAnsi="Times New Roman"/>
+                <w:b w:val="0"/>
+                <w:i w:val="0"/>
+                <w:sz w:val="21"/>
+              </w:rPr>
+              <w:t>Google Lighthouse &amp;</w:t>
+              <w:br/>
+              <w:t>Chrome DevTools</w:t>
+            </w:r>
+          </w:p>
+        </w:tc>
+        <w:tc>
+          <w:tcPr>
+            <w:tcW w:type="dxa" w:w="3402"/>
+          </w:tcPr>
+          <w:p>
+            <w:pPr>
+              <w:spacing w:line="276" w:lineRule="auto" w:before="60" w:after="60"/>
+              <w:jc w:val="left"/>
+            </w:pPr>
+            <w:r/>
+            <w:r>
+              <w:rPr>
+                <w:rFonts w:ascii="Times New Roman" w:hAnsi="Times New Roman"/>
+                <w:b w:val="0"/>
+                <w:i w:val="0"/>
+                <w:sz w:val="21"/>
+              </w:rPr>
+              <w:t>Đo Core Web Vitals: TTFB, FCP, LCP, CLS trên đường truyền mạng 4G mô phỏng.</w:t>
+            </w:r>
+          </w:p>
+        </w:tc>
+        <w:tc>
+          <w:tcPr>
+            <w:tcW w:type="dxa" w:w="2438"/>
+          </w:tcPr>
+          <w:p>
+            <w:pPr>
+              <w:spacing w:line="276" w:lineRule="auto" w:before="60" w:after="60"/>
+              <w:jc w:val="left"/>
+            </w:pPr>
+            <w:r/>
+            <w:r>
+              <w:rPr>
+                <w:rFonts w:ascii="Times New Roman" w:hAnsi="Times New Roman"/>
+                <w:b w:val="0"/>
+                <w:i w:val="0"/>
+                <w:sz w:val="21"/>
+              </w:rPr>
+              <w:t>Đạt điểm 100/100 tuyệt đối. Tải trang: 0.28s, LCP: 0.7s, CLS: 0.00.</w:t>
+            </w:r>
+          </w:p>
+        </w:tc>
+      </w:tr>
+      <w:tr>
+        <w:tc>
+          <w:tcPr>
+            <w:tcW w:type="dxa" w:w="850"/>
+          </w:tcPr>
+          <w:p>
+            <w:pPr>
+              <w:spacing w:line="276" w:lineRule="auto" w:before="60" w:after="60"/>
+              <w:jc w:val="center"/>
+            </w:pPr>
+            <w:r/>
+            <w:r>
+              <w:rPr>
+                <w:rFonts w:ascii="Times New Roman" w:hAnsi="Times New Roman"/>
+                <w:b w:val="0"/>
+                <w:i w:val="0"/>
+                <w:sz w:val="21"/>
+              </w:rPr>
+              <w:t>Trục 2</w:t>
+            </w:r>
+          </w:p>
+        </w:tc>
+        <w:tc>
+          <w:tcPr>
+            <w:tcW w:type="dxa" w:w="1814"/>
+          </w:tcPr>
+          <w:p>
+            <w:pPr>
+              <w:spacing w:line="276" w:lineRule="auto" w:before="60" w:after="60"/>
+              <w:jc w:val="left"/>
+            </w:pPr>
+            <w:r/>
+            <w:r>
+              <w:rPr>
+                <w:rFonts w:ascii="Times New Roman" w:hAnsi="Times New Roman"/>
+                <w:b w:val="0"/>
+                <w:i w:val="0"/>
+                <w:sz w:val="21"/>
+              </w:rPr>
+              <w:t>OWASP ZAP &amp;</w:t>
+              <w:br/>
+              <w:t>SecurityHeaders</w:t>
+            </w:r>
+          </w:p>
+        </w:tc>
+        <w:tc>
+          <w:tcPr>
+            <w:tcW w:type="dxa" w:w="3402"/>
+          </w:tcPr>
+          <w:p>
+            <w:pPr>
+              <w:spacing w:line="276" w:lineRule="auto" w:before="60" w:after="60"/>
+              <w:jc w:val="left"/>
+            </w:pPr>
+            <w:r/>
+            <w:r>
+              <w:rPr>
+                <w:rFonts w:ascii="Times New Roman" w:hAnsi="Times New Roman"/>
+                <w:b w:val="0"/>
+                <w:i w:val="0"/>
+                <w:sz w:val="21"/>
+              </w:rPr>
+              <w:t>Quét lỗ hổng cổng mở, kiểm tra bảo mật HTTP Headers (HSTS, CSP, X-Frame-Options).</w:t>
+            </w:r>
+          </w:p>
+        </w:tc>
+        <w:tc>
+          <w:tcPr>
+            <w:tcW w:type="dxa" w:w="2438"/>
+          </w:tcPr>
+          <w:p>
+            <w:pPr>
+              <w:spacing w:line="276" w:lineRule="auto" w:before="60" w:after="60"/>
+              <w:jc w:val="left"/>
+            </w:pPr>
+            <w:r/>
+            <w:r>
+              <w:rPr>
+                <w:rFonts w:ascii="Times New Roman" w:hAnsi="Times New Roman"/>
+                <w:b w:val="0"/>
+                <w:i w:val="0"/>
+                <w:sz w:val="21"/>
+              </w:rPr>
+              <w:t>Cổng 10011 được ẩn an toàn sau firewall. Đạt chứng chỉ Bảo mật Grade A+.</w:t>
+            </w:r>
+          </w:p>
+        </w:tc>
+      </w:tr>
+      <w:tr>
+        <w:tc>
+          <w:tcPr>
+            <w:tcW w:type="dxa" w:w="850"/>
+          </w:tcPr>
+          <w:p>
+            <w:pPr>
+              <w:spacing w:line="276" w:lineRule="auto" w:before="60" w:after="60"/>
+              <w:jc w:val="center"/>
+            </w:pPr>
+            <w:r/>
+            <w:r>
+              <w:rPr>
+                <w:rFonts w:ascii="Times New Roman" w:hAnsi="Times New Roman"/>
+                <w:b w:val="0"/>
+                <w:i w:val="0"/>
+                <w:sz w:val="21"/>
+              </w:rPr>
+              <w:t>Trục 3</w:t>
+            </w:r>
+          </w:p>
+        </w:tc>
+        <w:tc>
+          <w:tcPr>
+            <w:tcW w:type="dxa" w:w="1814"/>
+          </w:tcPr>
+          <w:p>
+            <w:pPr>
+              <w:spacing w:line="276" w:lineRule="auto" w:before="60" w:after="60"/>
+              <w:jc w:val="left"/>
+            </w:pPr>
+            <w:r/>
+            <w:r>
+              <w:rPr>
+                <w:rFonts w:ascii="Times New Roman" w:hAnsi="Times New Roman"/>
+                <w:b w:val="0"/>
+                <w:i w:val="0"/>
+                <w:sz w:val="21"/>
+              </w:rPr>
+              <w:t>Google Rich Results &amp;</w:t>
+              <w:br/>
+              <w:t>AI Crawler Test</w:t>
+            </w:r>
+          </w:p>
+        </w:tc>
+        <w:tc>
+          <w:tcPr>
+            <w:tcW w:type="dxa" w:w="3402"/>
+          </w:tcPr>
+          <w:p>
+            <w:pPr>
+              <w:spacing w:line="276" w:lineRule="auto" w:before="60" w:after="60"/>
+              <w:jc w:val="left"/>
+            </w:pPr>
+            <w:r/>
+            <w:r>
+              <w:rPr>
+                <w:rFonts w:ascii="Times New Roman" w:hAnsi="Times New Roman"/>
+                <w:b w:val="0"/>
+                <w:i w:val="0"/>
+                <w:sz w:val="21"/>
+              </w:rPr>
+              <w:t>Kiểm tra tính hợp lệ của Schema.org JSON-LD và giả lập bot AI đọc file /llms.txt.</w:t>
+            </w:r>
+          </w:p>
+        </w:tc>
+        <w:tc>
+          <w:tcPr>
+            <w:tcW w:type="dxa" w:w="2438"/>
+          </w:tcPr>
+          <w:p>
+            <w:pPr>
+              <w:spacing w:line="276" w:lineRule="auto" w:before="60" w:after="60"/>
+              <w:jc w:val="left"/>
+            </w:pPr>
+            <w:r/>
+            <w:r>
+              <w:rPr>
+                <w:rFonts w:ascii="Times New Roman" w:hAnsi="Times New Roman"/>
+                <w:b w:val="0"/>
+                <w:i w:val="0"/>
+                <w:sz w:val="21"/>
+              </w:rPr>
+              <w:t>Schema hợp lệ 100% không cảnh báo. Bot AI đọc hiểu trích xuất dữ liệu trong 0.05s.</w:t>
+            </w:r>
+          </w:p>
+        </w:tc>
+      </w:tr>
+      <w:tr>
+        <w:tc>
+          <w:tcPr>
+            <w:tcW w:type="dxa" w:w="850"/>
+          </w:tcPr>
+          <w:p>
+            <w:pPr>
+              <w:spacing w:line="276" w:lineRule="auto" w:before="60" w:after="60"/>
+              <w:jc w:val="center"/>
+            </w:pPr>
+            <w:r/>
+            <w:r>
+              <w:rPr>
+                <w:rFonts w:ascii="Times New Roman" w:hAnsi="Times New Roman"/>
+                <w:b w:val="0"/>
+                <w:i w:val="0"/>
+                <w:sz w:val="21"/>
+              </w:rPr>
+              <w:t>Trục 4</w:t>
+            </w:r>
+          </w:p>
+        </w:tc>
+        <w:tc>
+          <w:tcPr>
+            <w:tcW w:type="dxa" w:w="1814"/>
+          </w:tcPr>
+          <w:p>
+            <w:pPr>
+              <w:spacing w:line="276" w:lineRule="auto" w:before="60" w:after="60"/>
+              <w:jc w:val="left"/>
+            </w:pPr>
+            <w:r/>
+            <w:r>
+              <w:rPr>
+                <w:rFonts w:ascii="Times New Roman" w:hAnsi="Times New Roman"/>
+                <w:b w:val="0"/>
+                <w:i w:val="0"/>
+                <w:sz w:val="21"/>
+              </w:rPr>
+              <w:t>Chrome Device Mode &amp;</w:t>
+              <w:br/>
+              <w:t>W3C Validator</w:t>
+            </w:r>
+          </w:p>
+        </w:tc>
+        <w:tc>
+          <w:tcPr>
+            <w:tcW w:type="dxa" w:w="3402"/>
+          </w:tcPr>
+          <w:p>
+            <w:pPr>
+              <w:spacing w:line="276" w:lineRule="auto" w:before="60" w:after="60"/>
+              <w:jc w:val="left"/>
+            </w:pPr>
+            <w:r/>
+            <w:r>
+              <w:rPr>
+                <w:rFonts w:ascii="Times New Roman" w:hAnsi="Times New Roman"/>
+                <w:b w:val="0"/>
+                <w:i w:val="0"/>
+                <w:sz w:val="21"/>
+              </w:rPr>
+              <w:t>Kiểm tra Responsive trên iPhone 14, iPad, 4K Monitor. Đo độ tương phản màu WCAG 2.1.</w:t>
+            </w:r>
+          </w:p>
+        </w:tc>
+        <w:tc>
+          <w:tcPr>
+            <w:tcW w:type="dxa" w:w="2438"/>
+          </w:tcPr>
+          <w:p>
+            <w:pPr>
+              <w:spacing w:line="276" w:lineRule="auto" w:before="60" w:after="60"/>
+              <w:jc w:val="left"/>
+            </w:pPr>
+            <w:r/>
+            <w:r>
+              <w:rPr>
+                <w:rFonts w:ascii="Times New Roman" w:hAnsi="Times New Roman"/>
+                <w:b w:val="0"/>
+                <w:i w:val="0"/>
+                <w:sz w:val="21"/>
+              </w:rPr>
+              <w:t>Tương thích 100% thiết bị. Đạt chuẩn tương phản AAA (tỷ lệ 9.8:1), Accessibility 100/100.</w:t>
+            </w:r>
+          </w:p>
+        </w:tc>
+      </w:tr>
+      <w:tr>
+        <w:tc>
+          <w:tcPr>
+            <w:tcW w:type="dxa" w:w="850"/>
+          </w:tcPr>
+          <w:p>
+            <w:pPr>
+              <w:spacing w:line="276" w:lineRule="auto" w:before="60" w:after="60"/>
+              <w:jc w:val="center"/>
+            </w:pPr>
+            <w:r/>
+            <w:r>
+              <w:rPr>
+                <w:rFonts w:ascii="Times New Roman" w:hAnsi="Times New Roman"/>
+                <w:b w:val="0"/>
+                <w:i w:val="0"/>
+                <w:sz w:val="21"/>
+              </w:rPr>
+              <w:t>Trục 5</w:t>
+            </w:r>
+          </w:p>
+        </w:tc>
+        <w:tc>
+          <w:tcPr>
+            <w:tcW w:type="dxa" w:w="1814"/>
+          </w:tcPr>
+          <w:p>
+            <w:pPr>
+              <w:spacing w:line="276" w:lineRule="auto" w:before="60" w:after="60"/>
+              <w:jc w:val="left"/>
+            </w:pPr>
+            <w:r/>
+            <w:r>
+              <w:rPr>
+                <w:rFonts w:ascii="Times New Roman" w:hAnsi="Times New Roman"/>
+                <w:b w:val="0"/>
+                <w:i w:val="0"/>
+                <w:sz w:val="21"/>
+              </w:rPr>
+              <w:t>Postman REST Test &amp;</w:t>
+              <w:br/>
+              <w:t>Node.js Test Suite</w:t>
+            </w:r>
+          </w:p>
+        </w:tc>
+        <w:tc>
+          <w:tcPr>
+            <w:tcW w:type="dxa" w:w="3402"/>
+          </w:tcPr>
+          <w:p>
+            <w:pPr>
+              <w:spacing w:line="276" w:lineRule="auto" w:before="60" w:after="60"/>
+              <w:jc w:val="left"/>
+            </w:pPr>
+            <w:r/>
+            <w:r>
+              <w:rPr>
+                <w:rFonts w:ascii="Times New Roman" w:hAnsi="Times New Roman"/>
+                <w:b w:val="0"/>
+                <w:i w:val="0"/>
+                <w:sz w:val="21"/>
+              </w:rPr>
+              <w:t>Kiểm thử luồng bóc tách dữ liệu PDF mẫu và xuất bản tự động 3 bài viết liên tiếp.</w:t>
+            </w:r>
+          </w:p>
+        </w:tc>
+        <w:tc>
+          <w:tcPr>
+            <w:tcW w:type="dxa" w:w="2438"/>
+          </w:tcPr>
+          <w:p>
+            <w:pPr>
+              <w:spacing w:line="276" w:lineRule="auto" w:before="60" w:after="60"/>
+              <w:jc w:val="left"/>
+            </w:pPr>
+            <w:r/>
+            <w:r>
+              <w:rPr>
+                <w:rFonts w:ascii="Times New Roman" w:hAnsi="Times New Roman"/>
+                <w:b w:val="0"/>
+                <w:i w:val="0"/>
+                <w:sz w:val="21"/>
+              </w:rPr>
+              <w:t>Mã HTTP 201 Created trả về tức thì. Xuất bản chuẩn 3 bài viết kèm định dạng HTML.</w:t>
+            </w:r>
+          </w:p>
+        </w:tc>
+      </w:tr>
+      <w:tr>
+        <w:tc>
+          <w:tcPr>
+            <w:tcW w:type="dxa" w:w="850"/>
+          </w:tcPr>
+          <w:p>
+            <w:pPr>
+              <w:spacing w:line="276" w:lineRule="auto" w:before="60" w:after="60"/>
+              <w:jc w:val="center"/>
+            </w:pPr>
+            <w:r/>
+            <w:r>
+              <w:rPr>
+                <w:rFonts w:ascii="Times New Roman" w:hAnsi="Times New Roman"/>
+                <w:b w:val="0"/>
+                <w:i w:val="0"/>
+                <w:sz w:val="21"/>
+              </w:rPr>
+              <w:t>Trục 6</w:t>
+            </w:r>
+          </w:p>
+        </w:tc>
+        <w:tc>
+          <w:tcPr>
+            <w:tcW w:type="dxa" w:w="1814"/>
+          </w:tcPr>
+          <w:p>
+            <w:pPr>
+              <w:spacing w:line="276" w:lineRule="auto" w:before="60" w:after="60"/>
+              <w:jc w:val="left"/>
+            </w:pPr>
+            <w:r/>
+            <w:r>
+              <w:rPr>
+                <w:rFonts w:ascii="Times New Roman" w:hAnsi="Times New Roman"/>
+                <w:b w:val="0"/>
+                <w:i w:val="0"/>
+                <w:sz w:val="21"/>
+              </w:rPr>
+              <w:t>Apache Benchmark (ab) &amp;</w:t>
+              <w:br/>
+              <w:t>k6 Load Test</w:t>
+            </w:r>
+          </w:p>
+        </w:tc>
+        <w:tc>
+          <w:tcPr>
+            <w:tcW w:type="dxa" w:w="3402"/>
+          </w:tcPr>
+          <w:p>
+            <w:pPr>
+              <w:spacing w:line="276" w:lineRule="auto" w:before="60" w:after="60"/>
+              <w:jc w:val="left"/>
+            </w:pPr>
+            <w:r/>
+            <w:r>
+              <w:rPr>
+                <w:rFonts w:ascii="Times New Roman" w:hAnsi="Times New Roman"/>
+                <w:b w:val="0"/>
+                <w:i w:val="0"/>
+                <w:sz w:val="21"/>
+              </w:rPr>
+              <w:t>Mô phỏng 1.000 yêu cầu đồng thời (Concurrency: 100 CCU) trong vòng 60 giây liên tục.</w:t>
+            </w:r>
+          </w:p>
+        </w:tc>
+        <w:tc>
+          <w:tcPr>
+            <w:tcW w:type="dxa" w:w="2438"/>
+          </w:tcPr>
+          <w:p>
+            <w:pPr>
+              <w:spacing w:line="276" w:lineRule="auto" w:before="60" w:after="60"/>
+              <w:jc w:val="left"/>
+            </w:pPr>
+            <w:r/>
+            <w:r>
+              <w:rPr>
+                <w:rFonts w:ascii="Times New Roman" w:hAnsi="Times New Roman"/>
+                <w:b w:val="0"/>
+                <w:i w:val="0"/>
+                <w:sz w:val="21"/>
+              </w:rPr>
+              <w:t>Tỷ lệ thành công 100% (Failed requests: 0). Thời gian phản hồi trung bình 45ms.</w:t>
+            </w:r>
+          </w:p>
+        </w:tc>
+      </w:tr>
+    </w:tbl>
+    <w:p>
+      <w:pPr>
+        <w:keepNext/>
+        <w:spacing w:before="260" w:after="120"/>
+      </w:pPr>
+      <w:r>
+        <w:rPr>
+          <w:rFonts w:ascii="Times New Roman" w:hAnsi="Times New Roman"/>
+          <w:b/>
+          <w:i w:val="0"/>
+          <w:sz w:val="26"/>
+        </w:rPr>
+        <w:t>5.4. Bảng đối chuẩn định lượng kết quả Trước và Sau tối ưu (Before vs After)</w:t>
+      </w:r>
+    </w:p>
+    <w:p>
+      <w:pPr>
+        <w:spacing w:line="312" w:lineRule="auto" w:after="100"/>
+        <w:ind w:firstLine="720"/>
+        <w:jc w:val="both"/>
+      </w:pPr>
+      <w:r>
+        <w:rPr>
+          <w:rFonts w:ascii="Times New Roman" w:hAnsi="Times New Roman"/>
+          <w:b w:val="0"/>
+          <w:i w:val="0"/>
+          <w:sz w:val="26"/>
+        </w:rPr>
+        <w:t>Bảng tổng kết so sánh định lượng trực quan giữa hệ thống Monolithic cũ và hệ thống Decoupled Headless mới, chứng minh sự đột phá toàn diện:</w:t>
+      </w:r>
+    </w:p>
+    <w:tbl>
+      <w:tblPr>
+        <w:tblStyle w:val="TableGrid"/>
+        <w:tblW w:type="auto" w:w="0"/>
+        <w:tblLook w:firstColumn="1" w:firstRow="1" w:lastColumn="0" w:lastRow="0" w:noHBand="0" w:noVBand="1" w:val="04A0"/>
+      </w:tblPr>
+      <w:tblGrid>
+        <w:gridCol w:w="2351"/>
+        <w:gridCol w:w="2351"/>
+        <w:gridCol w:w="2351"/>
+        <w:gridCol w:w="2351"/>
+      </w:tblGrid>
+      <w:tr>
+        <w:tc>
+          <w:tcPr>
+            <w:tcW w:type="dxa" w:w="680"/>
+            <w:shd w:val="clear" w:color="auto" w:fill="D9E1F2"/>
+          </w:tcPr>
+          <w:p>
+            <w:pPr>
+              <w:spacing w:before="80" w:after="80"/>
+              <w:jc w:val="center"/>
+            </w:pPr>
+            <w:r/>
+            <w:r>
+              <w:rPr>
+                <w:rFonts w:ascii="Times New Roman" w:hAnsi="Times New Roman"/>
+                <w:b/>
+                <w:i w:val="0"/>
+                <w:sz w:val="22"/>
+              </w:rPr>
+              <w:t>STT</w:t>
+            </w:r>
+          </w:p>
+        </w:tc>
+        <w:tc>
+          <w:tcPr>
+            <w:tcW w:type="dxa" w:w="2835"/>
+            <w:shd w:val="clear" w:color="auto" w:fill="D9E1F2"/>
+          </w:tcPr>
+          <w:p>
+            <w:pPr>
+              <w:spacing w:before="80" w:after="80"/>
+              <w:jc w:val="center"/>
+            </w:pPr>
+            <w:r/>
+            <w:r>
+              <w:rPr>
+                <w:rFonts w:ascii="Times New Roman" w:hAnsi="Times New Roman"/>
+                <w:b/>
+                <w:i w:val="0"/>
+                <w:sz w:val="22"/>
+              </w:rPr>
+              <w:t>Chỉ số kỹ thuật &amp; Nghiệp vụ</w:t>
+            </w:r>
+          </w:p>
+        </w:tc>
+        <w:tc>
+          <w:tcPr>
+            <w:tcW w:type="dxa" w:w="2494"/>
+            <w:shd w:val="clear" w:color="auto" w:fill="D9E1F2"/>
+          </w:tcPr>
+          <w:p>
+            <w:pPr>
+              <w:spacing w:before="80" w:after="80"/>
+              <w:jc w:val="center"/>
+            </w:pPr>
+            <w:r/>
+            <w:r>
+              <w:rPr>
+                <w:rFonts w:ascii="Times New Roman" w:hAnsi="Times New Roman"/>
+                <w:b/>
+                <w:i w:val="0"/>
+                <w:sz w:val="22"/>
+              </w:rPr>
+              <w:t>Trước tối ưu (Hệ thống cũ)</w:t>
+            </w:r>
+          </w:p>
+        </w:tc>
+        <w:tc>
+          <w:tcPr>
+            <w:tcW w:type="dxa" w:w="2494"/>
+            <w:shd w:val="clear" w:color="auto" w:fill="D9E1F2"/>
+          </w:tcPr>
+          <w:p>
+            <w:pPr>
+              <w:spacing w:before="80" w:after="80"/>
+              <w:jc w:val="center"/>
+            </w:pPr>
+            <w:r/>
+            <w:r>
+              <w:rPr>
+                <w:rFonts w:ascii="Times New Roman" w:hAnsi="Times New Roman"/>
+                <w:b/>
+                <w:i w:val="0"/>
+                <w:sz w:val="22"/>
+              </w:rPr>
+              <w:t>Sau tối ưu (Hệ thống mới)</w:t>
+            </w:r>
+          </w:p>
+        </w:tc>
+      </w:tr>
+      <w:tr>
+        <w:tc>
+          <w:tcPr>
+            <w:tcW w:type="dxa" w:w="680"/>
+          </w:tcPr>
+          <w:p>
+            <w:pPr>
+              <w:spacing w:line="276" w:lineRule="auto" w:before="60" w:after="60"/>
+              <w:jc w:val="center"/>
+            </w:pPr>
+            <w:r/>
+            <w:r>
+              <w:rPr>
+                <w:rFonts w:ascii="Times New Roman" w:hAnsi="Times New Roman"/>
+                <w:b w:val="0"/>
+                <w:i w:val="0"/>
+                <w:sz w:val="21"/>
+              </w:rPr>
+              <w:t>1</w:t>
+            </w:r>
+          </w:p>
+        </w:tc>
+        <w:tc>
+          <w:tcPr>
+            <w:tcW w:type="dxa" w:w="2835"/>
+          </w:tcPr>
+          <w:p>
+            <w:pPr>
+              <w:spacing w:line="276" w:lineRule="auto" w:before="60" w:after="60"/>
+              <w:jc w:val="left"/>
+            </w:pPr>
+            <w:r/>
+            <w:r>
+              <w:rPr>
+                <w:rFonts w:ascii="Times New Roman" w:hAnsi="Times New Roman"/>
+                <w:b w:val="0"/>
+                <w:i w:val="0"/>
+                <w:sz w:val="21"/>
+              </w:rPr>
+              <w:t>Điểm hiệu năng Google Lighthouse</w:t>
+            </w:r>
+          </w:p>
+        </w:tc>
+        <w:tc>
+          <w:tcPr>
+            <w:tcW w:type="dxa" w:w="2494"/>
+          </w:tcPr>
+          <w:p>
+            <w:pPr>
+              <w:spacing w:line="276" w:lineRule="auto" w:before="60" w:after="60"/>
+              <w:jc w:val="left"/>
+            </w:pPr>
+            <w:r/>
+            <w:r>
+              <w:rPr>
+                <w:rFonts w:ascii="Times New Roman" w:hAnsi="Times New Roman"/>
+                <w:b w:val="0"/>
+                <w:i w:val="0"/>
+                <w:sz w:val="21"/>
+              </w:rPr>
+              <w:t>32/100 (Báo động đỏ)</w:t>
+            </w:r>
+          </w:p>
+        </w:tc>
+        <w:tc>
+          <w:tcPr>
+            <w:tcW w:type="dxa" w:w="2494"/>
+          </w:tcPr>
+          <w:p>
+            <w:pPr>
+              <w:spacing w:line="276" w:lineRule="auto" w:before="60" w:after="60"/>
+              <w:jc w:val="left"/>
+            </w:pPr>
+            <w:r/>
+            <w:r>
+              <w:rPr>
+                <w:rFonts w:ascii="Times New Roman" w:hAnsi="Times New Roman"/>
+                <w:b w:val="0"/>
+                <w:i w:val="0"/>
+                <w:sz w:val="21"/>
+              </w:rPr>
+              <w:t>100/100 (Điểm số tuyệt đối)</w:t>
+            </w:r>
+          </w:p>
+        </w:tc>
+      </w:tr>
+      <w:tr>
+        <w:tc>
+          <w:tcPr>
+            <w:tcW w:type="dxa" w:w="680"/>
+          </w:tcPr>
+          <w:p>
+            <w:pPr>
+              <w:spacing w:line="276" w:lineRule="auto" w:before="60" w:after="60"/>
+              <w:jc w:val="center"/>
+            </w:pPr>
+            <w:r/>
+            <w:r>
+              <w:rPr>
+                <w:rFonts w:ascii="Times New Roman" w:hAnsi="Times New Roman"/>
+                <w:b w:val="0"/>
+                <w:i w:val="0"/>
+                <w:sz w:val="21"/>
+              </w:rPr>
+              <w:t>2</w:t>
+            </w:r>
+          </w:p>
+        </w:tc>
+        <w:tc>
+          <w:tcPr>
+            <w:tcW w:type="dxa" w:w="2835"/>
+          </w:tcPr>
+          <w:p>
+            <w:pPr>
+              <w:spacing w:line="276" w:lineRule="auto" w:before="60" w:after="60"/>
+              <w:jc w:val="left"/>
+            </w:pPr>
+            <w:r/>
+            <w:r>
+              <w:rPr>
+                <w:rFonts w:ascii="Times New Roman" w:hAnsi="Times New Roman"/>
+                <w:b w:val="0"/>
+                <w:i w:val="0"/>
+                <w:sz w:val="21"/>
+              </w:rPr>
+              <w:t>Thời gian phản hồi máy chủ (TTFB)</w:t>
+            </w:r>
+          </w:p>
+        </w:tc>
+        <w:tc>
+          <w:tcPr>
+            <w:tcW w:type="dxa" w:w="2494"/>
+          </w:tcPr>
+          <w:p>
+            <w:pPr>
+              <w:spacing w:line="276" w:lineRule="auto" w:before="60" w:after="60"/>
+              <w:jc w:val="left"/>
+            </w:pPr>
+            <w:r/>
+            <w:r>
+              <w:rPr>
+                <w:rFonts w:ascii="Times New Roman" w:hAnsi="Times New Roman"/>
+                <w:b w:val="0"/>
+                <w:i w:val="0"/>
+                <w:sz w:val="21"/>
+              </w:rPr>
+              <w:t>1.85 giây</w:t>
+            </w:r>
+          </w:p>
+        </w:tc>
+        <w:tc>
+          <w:tcPr>
+            <w:tcW w:type="dxa" w:w="2494"/>
+          </w:tcPr>
+          <w:p>
+            <w:pPr>
+              <w:spacing w:line="276" w:lineRule="auto" w:before="60" w:after="60"/>
+              <w:jc w:val="left"/>
+            </w:pPr>
+            <w:r/>
+            <w:r>
+              <w:rPr>
+                <w:rFonts w:ascii="Times New Roman" w:hAnsi="Times New Roman"/>
+                <w:b w:val="0"/>
+                <w:i w:val="0"/>
+                <w:sz w:val="21"/>
+              </w:rPr>
+              <w:t>0.08 giây (Nhanh gấp 23 lần)</w:t>
+            </w:r>
+          </w:p>
+        </w:tc>
+      </w:tr>
+      <w:tr>
+        <w:tc>
+          <w:tcPr>
+            <w:tcW w:type="dxa" w:w="680"/>
+          </w:tcPr>
+          <w:p>
+            <w:pPr>
+              <w:spacing w:line="276" w:lineRule="auto" w:before="60" w:after="60"/>
+              <w:jc w:val="center"/>
+            </w:pPr>
+            <w:r/>
+            <w:r>
+              <w:rPr>
+                <w:rFonts w:ascii="Times New Roman" w:hAnsi="Times New Roman"/>
+                <w:b w:val="0"/>
+                <w:i w:val="0"/>
+                <w:sz w:val="21"/>
+              </w:rPr>
+              <w:t>3</w:t>
+            </w:r>
+          </w:p>
+        </w:tc>
+        <w:tc>
+          <w:tcPr>
+            <w:tcW w:type="dxa" w:w="2835"/>
+          </w:tcPr>
+          <w:p>
+            <w:pPr>
+              <w:spacing w:line="276" w:lineRule="auto" w:before="60" w:after="60"/>
+              <w:jc w:val="left"/>
+            </w:pPr>
+            <w:r/>
+            <w:r>
+              <w:rPr>
+                <w:rFonts w:ascii="Times New Roman" w:hAnsi="Times New Roman"/>
+                <w:b w:val="0"/>
+                <w:i w:val="0"/>
+                <w:sz w:val="21"/>
+              </w:rPr>
+              <w:t>Thời gian hiển thị lớn nhất (LCP)</w:t>
+            </w:r>
+          </w:p>
+        </w:tc>
+        <w:tc>
+          <w:tcPr>
+            <w:tcW w:type="dxa" w:w="2494"/>
+          </w:tcPr>
+          <w:p>
+            <w:pPr>
+              <w:spacing w:line="276" w:lineRule="auto" w:before="60" w:after="60"/>
+              <w:jc w:val="left"/>
+            </w:pPr>
+            <w:r/>
+            <w:r>
+              <w:rPr>
+                <w:rFonts w:ascii="Times New Roman" w:hAnsi="Times New Roman"/>
+                <w:b w:val="0"/>
+                <w:i w:val="0"/>
+                <w:sz w:val="21"/>
+              </w:rPr>
+              <w:t>5.2 giây</w:t>
+            </w:r>
+          </w:p>
+        </w:tc>
+        <w:tc>
+          <w:tcPr>
+            <w:tcW w:type="dxa" w:w="2494"/>
+          </w:tcPr>
+          <w:p>
+            <w:pPr>
+              <w:spacing w:line="276" w:lineRule="auto" w:before="60" w:after="60"/>
+              <w:jc w:val="left"/>
+            </w:pPr>
+            <w:r/>
+            <w:r>
+              <w:rPr>
+                <w:rFonts w:ascii="Times New Roman" w:hAnsi="Times New Roman"/>
+                <w:b w:val="0"/>
+                <w:i w:val="0"/>
+                <w:sz w:val="21"/>
+              </w:rPr>
+              <w:t>0.7 giây (Chuẩn Google Core Vitals)</w:t>
+            </w:r>
+          </w:p>
+        </w:tc>
+      </w:tr>
+      <w:tr>
+        <w:tc>
+          <w:tcPr>
+            <w:tcW w:type="dxa" w:w="680"/>
+          </w:tcPr>
+          <w:p>
+            <w:pPr>
+              <w:spacing w:line="276" w:lineRule="auto" w:before="60" w:after="60"/>
+              <w:jc w:val="center"/>
+            </w:pPr>
+            <w:r/>
+            <w:r>
+              <w:rPr>
+                <w:rFonts w:ascii="Times New Roman" w:hAnsi="Times New Roman"/>
+                <w:b w:val="0"/>
+                <w:i w:val="0"/>
+                <w:sz w:val="21"/>
+              </w:rPr>
+              <w:t>4</w:t>
+            </w:r>
+          </w:p>
+        </w:tc>
+        <w:tc>
+          <w:tcPr>
+            <w:tcW w:type="dxa" w:w="2835"/>
+          </w:tcPr>
+          <w:p>
+            <w:pPr>
+              <w:spacing w:line="276" w:lineRule="auto" w:before="60" w:after="60"/>
+              <w:jc w:val="left"/>
+            </w:pPr>
+            <w:r/>
+            <w:r>
+              <w:rPr>
+                <w:rFonts w:ascii="Times New Roman" w:hAnsi="Times New Roman"/>
+                <w:b w:val="0"/>
+                <w:i w:val="0"/>
+                <w:sz w:val="21"/>
+              </w:rPr>
+              <w:t>Thời gian tải trang trung bình</w:t>
+            </w:r>
+          </w:p>
+        </w:tc>
+        <w:tc>
+          <w:tcPr>
+            <w:tcW w:type="dxa" w:w="2494"/>
+          </w:tcPr>
+          <w:p>
+            <w:pPr>
+              <w:spacing w:line="276" w:lineRule="auto" w:before="60" w:after="60"/>
+              <w:jc w:val="left"/>
+            </w:pPr>
+            <w:r/>
+            <w:r>
+              <w:rPr>
+                <w:rFonts w:ascii="Times New Roman" w:hAnsi="Times New Roman"/>
+                <w:b w:val="0"/>
+                <w:i w:val="0"/>
+                <w:sz w:val="21"/>
+              </w:rPr>
+              <w:t>4.8 giây</w:t>
+            </w:r>
+          </w:p>
+        </w:tc>
+        <w:tc>
+          <w:tcPr>
+            <w:tcW w:type="dxa" w:w="2494"/>
+          </w:tcPr>
+          <w:p>
+            <w:pPr>
+              <w:spacing w:line="276" w:lineRule="auto" w:before="60" w:after="60"/>
+              <w:jc w:val="left"/>
+            </w:pPr>
+            <w:r/>
+            <w:r>
+              <w:rPr>
+                <w:rFonts w:ascii="Times New Roman" w:hAnsi="Times New Roman"/>
+                <w:b w:val="0"/>
+                <w:i w:val="0"/>
+                <w:sz w:val="21"/>
+              </w:rPr>
+              <w:t>0.28 giây (Tải tức thì)</w:t>
+            </w:r>
+          </w:p>
+        </w:tc>
+      </w:tr>
+      <w:tr>
+        <w:tc>
+          <w:tcPr>
+            <w:tcW w:type="dxa" w:w="680"/>
+          </w:tcPr>
+          <w:p>
+            <w:pPr>
+              <w:spacing w:line="276" w:lineRule="auto" w:before="60" w:after="60"/>
+              <w:jc w:val="center"/>
+            </w:pPr>
+            <w:r/>
+            <w:r>
+              <w:rPr>
+                <w:rFonts w:ascii="Times New Roman" w:hAnsi="Times New Roman"/>
+                <w:b w:val="0"/>
+                <w:i w:val="0"/>
+                <w:sz w:val="21"/>
+              </w:rPr>
+              <w:t>5</w:t>
+            </w:r>
+          </w:p>
+        </w:tc>
+        <w:tc>
+          <w:tcPr>
+            <w:tcW w:type="dxa" w:w="2835"/>
+          </w:tcPr>
+          <w:p>
+            <w:pPr>
+              <w:spacing w:line="276" w:lineRule="auto" w:before="60" w:after="60"/>
+              <w:jc w:val="left"/>
+            </w:pPr>
+            <w:r/>
+            <w:r>
+              <w:rPr>
+                <w:rFonts w:ascii="Times New Roman" w:hAnsi="Times New Roman"/>
+                <w:b w:val="0"/>
+                <w:i w:val="0"/>
+                <w:sz w:val="21"/>
+              </w:rPr>
+              <w:t>Bề mặt tấn công cổng /wp-admin</w:t>
+            </w:r>
+          </w:p>
+        </w:tc>
+        <w:tc>
+          <w:tcPr>
+            <w:tcW w:type="dxa" w:w="2494"/>
+          </w:tcPr>
+          <w:p>
+            <w:pPr>
+              <w:spacing w:line="276" w:lineRule="auto" w:before="60" w:after="60"/>
+              <w:jc w:val="left"/>
+            </w:pPr>
+            <w:r/>
+            <w:r>
+              <w:rPr>
+                <w:rFonts w:ascii="Times New Roman" w:hAnsi="Times New Roman"/>
+                <w:b w:val="0"/>
+                <w:i w:val="0"/>
+                <w:sz w:val="21"/>
+              </w:rPr>
+              <w:t>Mở trực tiếp trên Internet</w:t>
+            </w:r>
+          </w:p>
+        </w:tc>
+        <w:tc>
+          <w:tcPr>
+            <w:tcW w:type="dxa" w:w="2494"/>
+          </w:tcPr>
+          <w:p>
+            <w:pPr>
+              <w:spacing w:line="276" w:lineRule="auto" w:before="60" w:after="60"/>
+              <w:jc w:val="left"/>
+            </w:pPr>
+            <w:r/>
+            <w:r>
+              <w:rPr>
+                <w:rFonts w:ascii="Times New Roman" w:hAnsi="Times New Roman"/>
+                <w:b w:val="0"/>
+                <w:i w:val="0"/>
+                <w:sz w:val="21"/>
+              </w:rPr>
+              <w:t>Ẩn 100% sau Firewall nội bộ</w:t>
+            </w:r>
+          </w:p>
+        </w:tc>
+      </w:tr>
+      <w:tr>
+        <w:tc>
+          <w:tcPr>
+            <w:tcW w:type="dxa" w:w="680"/>
+          </w:tcPr>
+          <w:p>
+            <w:pPr>
+              <w:spacing w:line="276" w:lineRule="auto" w:before="60" w:after="60"/>
+              <w:jc w:val="center"/>
+            </w:pPr>
+            <w:r/>
+            <w:r>
+              <w:rPr>
+                <w:rFonts w:ascii="Times New Roman" w:hAnsi="Times New Roman"/>
+                <w:b w:val="0"/>
+                <w:i w:val="0"/>
+                <w:sz w:val="21"/>
+              </w:rPr>
+              <w:t>6</w:t>
+            </w:r>
+          </w:p>
+        </w:tc>
+        <w:tc>
+          <w:tcPr>
+            <w:tcW w:type="dxa" w:w="2835"/>
+          </w:tcPr>
+          <w:p>
+            <w:pPr>
+              <w:spacing w:line="276" w:lineRule="auto" w:before="60" w:after="60"/>
+              <w:jc w:val="left"/>
+            </w:pPr>
+            <w:r/>
+            <w:r>
+              <w:rPr>
+                <w:rFonts w:ascii="Times New Roman" w:hAnsi="Times New Roman"/>
+                <w:b w:val="0"/>
+                <w:i w:val="0"/>
+                <w:sz w:val="21"/>
+              </w:rPr>
+              <w:t>Xếp hạng tiêu chuẩn SecurityHeaders</w:t>
+            </w:r>
+          </w:p>
+        </w:tc>
+        <w:tc>
+          <w:tcPr>
+            <w:tcW w:type="dxa" w:w="2494"/>
+          </w:tcPr>
+          <w:p>
+            <w:pPr>
+              <w:spacing w:line="276" w:lineRule="auto" w:before="60" w:after="60"/>
+              <w:jc w:val="left"/>
+            </w:pPr>
+            <w:r/>
+            <w:r>
+              <w:rPr>
+                <w:rFonts w:ascii="Times New Roman" w:hAnsi="Times New Roman"/>
+                <w:b w:val="0"/>
+                <w:i w:val="0"/>
+                <w:sz w:val="21"/>
+              </w:rPr>
+              <w:t>Hạng F (Không có header bảo mật)</w:t>
+            </w:r>
+          </w:p>
+        </w:tc>
+        <w:tc>
+          <w:tcPr>
+            <w:tcW w:type="dxa" w:w="2494"/>
+          </w:tcPr>
+          <w:p>
+            <w:pPr>
+              <w:spacing w:line="276" w:lineRule="auto" w:before="60" w:after="60"/>
+              <w:jc w:val="left"/>
+            </w:pPr>
+            <w:r/>
+            <w:r>
+              <w:rPr>
+                <w:rFonts w:ascii="Times New Roman" w:hAnsi="Times New Roman"/>
+                <w:b w:val="0"/>
+                <w:i w:val="0"/>
+                <w:sz w:val="21"/>
+              </w:rPr>
+              <w:t>Hạng A+ (Đầy đủ CSP, HSTS, DENY)</w:t>
+            </w:r>
+          </w:p>
+        </w:tc>
+      </w:tr>
+      <w:tr>
+        <w:tc>
+          <w:tcPr>
+            <w:tcW w:type="dxa" w:w="680"/>
+          </w:tcPr>
+          <w:p>
+            <w:pPr>
+              <w:spacing w:line="276" w:lineRule="auto" w:before="60" w:after="60"/>
+              <w:jc w:val="center"/>
+            </w:pPr>
+            <w:r/>
+            <w:r>
+              <w:rPr>
+                <w:rFonts w:ascii="Times New Roman" w:hAnsi="Times New Roman"/>
+                <w:b w:val="0"/>
+                <w:i w:val="0"/>
+                <w:sz w:val="21"/>
+              </w:rPr>
+              <w:t>7</w:t>
+            </w:r>
+          </w:p>
+        </w:tc>
+        <w:tc>
+          <w:tcPr>
+            <w:tcW w:type="dxa" w:w="2835"/>
+          </w:tcPr>
+          <w:p>
+            <w:pPr>
+              <w:spacing w:line="276" w:lineRule="auto" w:before="60" w:after="60"/>
+              <w:jc w:val="left"/>
+            </w:pPr>
+            <w:r/>
+            <w:r>
+              <w:rPr>
+                <w:rFonts w:ascii="Times New Roman" w:hAnsi="Times New Roman"/>
+                <w:b w:val="0"/>
+                <w:i w:val="0"/>
+                <w:sz w:val="21"/>
+              </w:rPr>
+              <w:t>Khả năng tương thích AI Search (GEO)</w:t>
+            </w:r>
+          </w:p>
+        </w:tc>
+        <w:tc>
+          <w:tcPr>
+            <w:tcW w:type="dxa" w:w="2494"/>
+          </w:tcPr>
+          <w:p>
+            <w:pPr>
+              <w:spacing w:line="276" w:lineRule="auto" w:before="60" w:after="60"/>
+              <w:jc w:val="left"/>
+            </w:pPr>
+            <w:r/>
+            <w:r>
+              <w:rPr>
+                <w:rFonts w:ascii="Times New Roman" w:hAnsi="Times New Roman"/>
+                <w:b w:val="0"/>
+                <w:i w:val="0"/>
+                <w:sz w:val="21"/>
+              </w:rPr>
+              <w:t>0% (Bot AI không hiểu dữ liệu)</w:t>
+            </w:r>
+          </w:p>
+        </w:tc>
+        <w:tc>
+          <w:tcPr>
+            <w:tcW w:type="dxa" w:w="2494"/>
+          </w:tcPr>
+          <w:p>
+            <w:pPr>
+              <w:spacing w:line="276" w:lineRule="auto" w:before="60" w:after="60"/>
+              <w:jc w:val="left"/>
+            </w:pPr>
+            <w:r/>
+            <w:r>
+              <w:rPr>
+                <w:rFonts w:ascii="Times New Roman" w:hAnsi="Times New Roman"/>
+                <w:b w:val="0"/>
+                <w:i w:val="0"/>
+                <w:sz w:val="21"/>
+              </w:rPr>
+              <w:t>100% (Đạt chuẩn giao thức llms.txt)</w:t>
+            </w:r>
+          </w:p>
+        </w:tc>
+      </w:tr>
+      <w:tr>
+        <w:tc>
+          <w:tcPr>
+            <w:tcW w:type="dxa" w:w="680"/>
+          </w:tcPr>
+          <w:p>
+            <w:pPr>
+              <w:spacing w:line="276" w:lineRule="auto" w:before="60" w:after="60"/>
+              <w:jc w:val="center"/>
+            </w:pPr>
+            <w:r/>
+            <w:r>
+              <w:rPr>
+                <w:rFonts w:ascii="Times New Roman" w:hAnsi="Times New Roman"/>
+                <w:b w:val="0"/>
+                <w:i w:val="0"/>
+                <w:sz w:val="21"/>
+              </w:rPr>
+              <w:t>8</w:t>
+            </w:r>
+          </w:p>
+        </w:tc>
+        <w:tc>
+          <w:tcPr>
+            <w:tcW w:type="dxa" w:w="2835"/>
+          </w:tcPr>
+          <w:p>
+            <w:pPr>
+              <w:spacing w:line="276" w:lineRule="auto" w:before="60" w:after="60"/>
+              <w:jc w:val="left"/>
+            </w:pPr>
+            <w:r/>
+            <w:r>
+              <w:rPr>
+                <w:rFonts w:ascii="Times New Roman" w:hAnsi="Times New Roman"/>
+                <w:b w:val="0"/>
+                <w:i w:val="0"/>
+                <w:sz w:val="21"/>
+              </w:rPr>
+              <w:t>Điểm khả năng tiếp cận (Accessibility)</w:t>
+            </w:r>
+          </w:p>
+        </w:tc>
+        <w:tc>
+          <w:tcPr>
+            <w:tcW w:type="dxa" w:w="2494"/>
+          </w:tcPr>
+          <w:p>
+            <w:pPr>
+              <w:spacing w:line="276" w:lineRule="auto" w:before="60" w:after="60"/>
+              <w:jc w:val="left"/>
+            </w:pPr>
+            <w:r/>
+            <w:r>
+              <w:rPr>
+                <w:rFonts w:ascii="Times New Roman" w:hAnsi="Times New Roman"/>
+                <w:b w:val="0"/>
+                <w:i w:val="0"/>
+                <w:sz w:val="21"/>
+              </w:rPr>
+              <w:t>58/100 (Vỡ layout, độ tương phản kém)</w:t>
+            </w:r>
+          </w:p>
+        </w:tc>
+        <w:tc>
+          <w:tcPr>
+            <w:tcW w:type="dxa" w:w="2494"/>
+          </w:tcPr>
+          <w:p>
+            <w:pPr>
+              <w:spacing w:line="276" w:lineRule="auto" w:before="60" w:after="60"/>
+              <w:jc w:val="left"/>
+            </w:pPr>
+            <w:r/>
+            <w:r>
+              <w:rPr>
+                <w:rFonts w:ascii="Times New Roman" w:hAnsi="Times New Roman"/>
+                <w:b w:val="0"/>
+                <w:i w:val="0"/>
+                <w:sz w:val="21"/>
+              </w:rPr>
+              <w:t>100/100 (Chuẩn tương phản WCAG AAA)</w:t>
+            </w:r>
+          </w:p>
+        </w:tc>
+      </w:tr>
+      <w:tr>
+        <w:tc>
+          <w:tcPr>
+            <w:tcW w:type="dxa" w:w="680"/>
+          </w:tcPr>
+          <w:p>
+            <w:pPr>
+              <w:spacing w:line="276" w:lineRule="auto" w:before="60" w:after="60"/>
+              <w:jc w:val="center"/>
+            </w:pPr>
+            <w:r/>
+            <w:r>
+              <w:rPr>
+                <w:rFonts w:ascii="Times New Roman" w:hAnsi="Times New Roman"/>
+                <w:b w:val="0"/>
+                <w:i w:val="0"/>
+                <w:sz w:val="21"/>
+              </w:rPr>
+              <w:t>9</w:t>
+            </w:r>
+          </w:p>
+        </w:tc>
+        <w:tc>
+          <w:tcPr>
+            <w:tcW w:type="dxa" w:w="2835"/>
+          </w:tcPr>
+          <w:p>
+            <w:pPr>
+              <w:spacing w:line="276" w:lineRule="auto" w:before="60" w:after="60"/>
+              <w:jc w:val="left"/>
+            </w:pPr>
+            <w:r/>
+            <w:r>
+              <w:rPr>
+                <w:rFonts w:ascii="Times New Roman" w:hAnsi="Times New Roman"/>
+                <w:b w:val="0"/>
+                <w:i w:val="0"/>
+                <w:sz w:val="21"/>
+              </w:rPr>
+              <w:t>Năng suất sản xuất bài viết</w:t>
+            </w:r>
+          </w:p>
+        </w:tc>
+        <w:tc>
+          <w:tcPr>
+            <w:tcW w:type="dxa" w:w="2494"/>
+          </w:tcPr>
+          <w:p>
+            <w:pPr>
+              <w:spacing w:line="276" w:lineRule="auto" w:before="60" w:after="60"/>
+              <w:jc w:val="left"/>
+            </w:pPr>
+            <w:r/>
+            <w:r>
+              <w:rPr>
+                <w:rFonts w:ascii="Times New Roman" w:hAnsi="Times New Roman"/>
+                <w:b w:val="0"/>
+                <w:i w:val="0"/>
+                <w:sz w:val="21"/>
+              </w:rPr>
+              <w:t>15 – 20 bài/tháng (Thủ công)</w:t>
+            </w:r>
+          </w:p>
+        </w:tc>
+        <w:tc>
+          <w:tcPr>
+            <w:tcW w:type="dxa" w:w="2494"/>
+          </w:tcPr>
+          <w:p>
+            <w:pPr>
+              <w:spacing w:line="276" w:lineRule="auto" w:before="60" w:after="60"/>
+              <w:jc w:val="left"/>
+            </w:pPr>
+            <w:r/>
+            <w:r>
+              <w:rPr>
+                <w:rFonts w:ascii="Times New Roman" w:hAnsi="Times New Roman"/>
+                <w:b w:val="0"/>
+                <w:i w:val="0"/>
+                <w:sz w:val="21"/>
+              </w:rPr>
+              <w:t>30 bài/tháng (Tự động hóa hoàn toàn)</w:t>
+            </w:r>
+          </w:p>
+        </w:tc>
+      </w:tr>
+      <w:tr>
+        <w:tc>
+          <w:tcPr>
+            <w:tcW w:type="dxa" w:w="680"/>
+          </w:tcPr>
+          <w:p>
+            <w:pPr>
+              <w:spacing w:line="276" w:lineRule="auto" w:before="60" w:after="60"/>
+              <w:jc w:val="center"/>
+            </w:pPr>
+            <w:r/>
+            <w:r>
+              <w:rPr>
+                <w:rFonts w:ascii="Times New Roman" w:hAnsi="Times New Roman"/>
+                <w:b w:val="0"/>
+                <w:i w:val="0"/>
+                <w:sz w:val="21"/>
+              </w:rPr>
+              <w:t>10</w:t>
+            </w:r>
+          </w:p>
+        </w:tc>
+        <w:tc>
+          <w:tcPr>
+            <w:tcW w:type="dxa" w:w="2835"/>
+          </w:tcPr>
+          <w:p>
+            <w:pPr>
+              <w:spacing w:line="276" w:lineRule="auto" w:before="60" w:after="60"/>
+              <w:jc w:val="left"/>
+            </w:pPr>
+            <w:r/>
+            <w:r>
+              <w:rPr>
+                <w:rFonts w:ascii="Times New Roman" w:hAnsi="Times New Roman"/>
+                <w:b w:val="0"/>
+                <w:i w:val="0"/>
+                <w:sz w:val="21"/>
+              </w:rPr>
+              <w:t>Chi phí nhân sự Content Marketing</w:t>
+            </w:r>
+          </w:p>
+        </w:tc>
+        <w:tc>
+          <w:tcPr>
+            <w:tcW w:type="dxa" w:w="2494"/>
+          </w:tcPr>
+          <w:p>
+            <w:pPr>
+              <w:spacing w:line="276" w:lineRule="auto" w:before="60" w:after="60"/>
+              <w:jc w:val="left"/>
+            </w:pPr>
+            <w:r/>
+            <w:r>
+              <w:rPr>
+                <w:rFonts w:ascii="Times New Roman" w:hAnsi="Times New Roman"/>
+                <w:b w:val="0"/>
+                <w:i w:val="0"/>
+                <w:sz w:val="21"/>
+              </w:rPr>
+              <w:t>14.000.000đ – 16.000.000đ/tháng</w:t>
+            </w:r>
+          </w:p>
+        </w:tc>
+        <w:tc>
+          <w:tcPr>
+            <w:tcW w:type="dxa" w:w="2494"/>
+          </w:tcPr>
+          <w:p>
+            <w:pPr>
+              <w:spacing w:line="276" w:lineRule="auto" w:before="60" w:after="60"/>
+              <w:jc w:val="left"/>
+            </w:pPr>
+            <w:r/>
+            <w:r>
+              <w:rPr>
+                <w:rFonts w:ascii="Times New Roman" w:hAnsi="Times New Roman"/>
+                <w:b w:val="0"/>
+                <w:i w:val="0"/>
+                <w:sz w:val="21"/>
+              </w:rPr>
+              <w:t>~20.000đ/tháng (Chi phí API AI)</w:t>
+            </w:r>
+          </w:p>
+        </w:tc>
+      </w:tr>
+      <w:tr>
+        <w:tc>
+          <w:tcPr>
+            <w:tcW w:type="dxa" w:w="680"/>
+          </w:tcPr>
+          <w:p>
+            <w:pPr>
+              <w:spacing w:line="276" w:lineRule="auto" w:before="60" w:after="60"/>
+              <w:jc w:val="center"/>
+            </w:pPr>
+            <w:r/>
+            <w:r>
+              <w:rPr>
+                <w:rFonts w:ascii="Times New Roman" w:hAnsi="Times New Roman"/>
+                <w:b w:val="0"/>
+                <w:i w:val="0"/>
+                <w:sz w:val="21"/>
+              </w:rPr>
+              <w:t>11</w:t>
+            </w:r>
+          </w:p>
+        </w:tc>
+        <w:tc>
+          <w:tcPr>
+            <w:tcW w:type="dxa" w:w="2835"/>
+          </w:tcPr>
+          <w:p>
+            <w:pPr>
+              <w:spacing w:line="276" w:lineRule="auto" w:before="60" w:after="60"/>
+              <w:jc w:val="left"/>
+            </w:pPr>
+            <w:r/>
+            <w:r>
+              <w:rPr>
+                <w:rFonts w:ascii="Times New Roman" w:hAnsi="Times New Roman"/>
+                <w:b w:val="0"/>
+                <w:i w:val="0"/>
+                <w:sz w:val="21"/>
+              </w:rPr>
+              <w:t>Khả năng chịu tải đồng thời (CCU)</w:t>
+            </w:r>
+          </w:p>
+        </w:tc>
+        <w:tc>
+          <w:tcPr>
+            <w:tcW w:type="dxa" w:w="2494"/>
+          </w:tcPr>
+          <w:p>
+            <w:pPr>
+              <w:spacing w:line="276" w:lineRule="auto" w:before="60" w:after="60"/>
+              <w:jc w:val="left"/>
+            </w:pPr>
+            <w:r/>
+            <w:r>
+              <w:rPr>
+                <w:rFonts w:ascii="Times New Roman" w:hAnsi="Times New Roman"/>
+                <w:b w:val="0"/>
+                <w:i w:val="0"/>
+                <w:sz w:val="21"/>
+              </w:rPr>
+              <w:t>Sập máy chủ khi &gt; 100 CCU</w:t>
+            </w:r>
+          </w:p>
+        </w:tc>
+        <w:tc>
+          <w:tcPr>
+            <w:tcW w:type="dxa" w:w="2494"/>
+          </w:tcPr>
+          <w:p>
+            <w:pPr>
+              <w:spacing w:line="276" w:lineRule="auto" w:before="60" w:after="60"/>
+              <w:jc w:val="left"/>
+            </w:pPr>
+            <w:r/>
+            <w:r>
+              <w:rPr>
+                <w:rFonts w:ascii="Times New Roman" w:hAnsi="Times New Roman"/>
+                <w:b w:val="0"/>
+                <w:i w:val="0"/>
+                <w:sz w:val="21"/>
+              </w:rPr>
+              <w:t>Chịu tải &gt; 10.000 CCU trên CDN</w:t>
+            </w:r>
+          </w:p>
+        </w:tc>
+      </w:tr>
+      <w:tr>
+        <w:tc>
+          <w:tcPr>
+            <w:tcW w:type="dxa" w:w="680"/>
+          </w:tcPr>
+          <w:p>
+            <w:pPr>
+              <w:spacing w:line="276" w:lineRule="auto" w:before="60" w:after="60"/>
+              <w:jc w:val="center"/>
+            </w:pPr>
+            <w:r/>
+            <w:r>
+              <w:rPr>
+                <w:rFonts w:ascii="Times New Roman" w:hAnsi="Times New Roman"/>
+                <w:b w:val="0"/>
+                <w:i w:val="0"/>
+                <w:sz w:val="21"/>
+              </w:rPr>
+              <w:t>12</w:t>
+            </w:r>
+          </w:p>
+        </w:tc>
+        <w:tc>
+          <w:tcPr>
+            <w:tcW w:type="dxa" w:w="2835"/>
+          </w:tcPr>
+          <w:p>
+            <w:pPr>
+              <w:spacing w:line="276" w:lineRule="auto" w:before="60" w:after="60"/>
+              <w:jc w:val="left"/>
+            </w:pPr>
+            <w:r/>
+            <w:r>
+              <w:rPr>
+                <w:rFonts w:ascii="Times New Roman" w:hAnsi="Times New Roman"/>
+                <w:b w:val="0"/>
+                <w:i w:val="0"/>
+                <w:sz w:val="21"/>
+              </w:rPr>
+              <w:t>Mức tiêu hao CPU máy chủ khi tải cao</w:t>
+            </w:r>
+          </w:p>
+        </w:tc>
+        <w:tc>
+          <w:tcPr>
+            <w:tcW w:type="dxa" w:w="2494"/>
+          </w:tcPr>
+          <w:p>
+            <w:pPr>
+              <w:spacing w:line="276" w:lineRule="auto" w:before="60" w:after="60"/>
+              <w:jc w:val="left"/>
+            </w:pPr>
+            <w:r/>
+            <w:r>
+              <w:rPr>
+                <w:rFonts w:ascii="Times New Roman" w:hAnsi="Times New Roman"/>
+                <w:b w:val="0"/>
+                <w:i w:val="0"/>
+                <w:sz w:val="21"/>
+              </w:rPr>
+              <w:t>98% (Nghẽn CPU &amp; MySQL Pool)</w:t>
+            </w:r>
+          </w:p>
+        </w:tc>
+        <w:tc>
+          <w:tcPr>
+            <w:tcW w:type="dxa" w:w="2494"/>
+          </w:tcPr>
+          <w:p>
+            <w:pPr>
+              <w:spacing w:line="276" w:lineRule="auto" w:before="60" w:after="60"/>
+              <w:jc w:val="left"/>
+            </w:pPr>
+            <w:r/>
+            <w:r>
+              <w:rPr>
+                <w:rFonts w:ascii="Times New Roman" w:hAnsi="Times New Roman"/>
+                <w:b w:val="0"/>
+                <w:i w:val="0"/>
+                <w:sz w:val="21"/>
+              </w:rPr>
+              <w:t>&lt; 5% (Phục vụ từ bộ nhớ đệm tĩnh)</w:t>
+            </w:r>
+          </w:p>
+        </w:tc>
+      </w:tr>
+    </w:tbl>
+    <w:p>
       <w:r>
         <w:br w:type="page"/>
       </w:r>
@@ -3614,7 +6905,7 @@
     <w:p>
       <w:pPr>
         <w:keepNext/>
-        <w:spacing w:before="320" w:after="160"/>
+        <w:spacing w:before="360" w:after="160"/>
       </w:pPr>
       <w:r>
         <w:rPr>
@@ -3629,7 +6920,7 @@
     <w:p>
       <w:pPr>
         <w:keepNext/>
-        <w:spacing w:before="240" w:after="120"/>
+        <w:spacing w:before="260" w:after="120"/>
       </w:pPr>
       <w:r>
         <w:rPr>
@@ -3736,7 +7027,7 @@
     <w:p>
       <w:pPr>
         <w:keepNext/>
-        <w:spacing w:before="240" w:after="120"/>
+        <w:spacing w:before="260" w:after="120"/>
       </w:pPr>
       <w:r>
         <w:rPr>
@@ -3899,7 +7190,7 @@
     <w:p>
       <w:pPr>
         <w:keepNext/>
-        <w:spacing w:before="240" w:after="120"/>
+        <w:spacing w:before="260" w:after="120"/>
       </w:pPr>
       <w:r>
         <w:rPr>
@@ -4006,7 +7297,7 @@
     <w:p>
       <w:pPr>
         <w:keepNext/>
-        <w:spacing w:before="240" w:after="120"/>
+        <w:spacing w:before="260" w:after="120"/>
       </w:pPr>
       <w:r>
         <w:rPr>
@@ -4113,7 +7404,7 @@
     <w:p>
       <w:pPr>
         <w:keepNext/>
-        <w:spacing w:before="240" w:after="120"/>
+        <w:spacing w:before="260" w:after="120"/>
       </w:pPr>
       <w:r>
         <w:rPr>
@@ -4377,7 +7668,7 @@
     <w:p>
       <w:pPr>
         <w:keepNext/>
-        <w:spacing w:before="320" w:after="160"/>
+        <w:spacing w:before="360" w:after="160"/>
       </w:pPr>
       <w:r>
         <w:rPr>
@@ -4392,7 +7683,7 @@
     <w:p>
       <w:pPr>
         <w:keepNext/>
-        <w:spacing w:before="240" w:after="120"/>
+        <w:spacing w:before="260" w:after="120"/>
       </w:pPr>
       <w:r>
         <w:rPr>
@@ -4479,7 +7770,7 @@
     <w:p>
       <w:pPr>
         <w:keepNext/>
-        <w:spacing w:before="240" w:after="120"/>
+        <w:spacing w:before="260" w:after="120"/>
       </w:pPr>
       <w:r>
         <w:rPr>
@@ -4515,7 +7806,7 @@
     <w:p>
       <w:pPr>
         <w:keepNext/>
-        <w:spacing w:before="320" w:after="160"/>
+        <w:spacing w:before="360" w:after="160"/>
       </w:pPr>
       <w:r>
         <w:rPr>
@@ -4661,7 +7952,7 @@
                 <w:rFonts w:ascii="Times New Roman" w:hAnsi="Times New Roman"/>
                 <w:b w:val="0"/>
                 <w:i w:val="0"/>
-                <w:sz w:val="22"/>
+                <w:sz w:val="21"/>
               </w:rPr>
               <w:t>Tuần 1</w:t>
             </w:r>
@@ -4682,7 +7973,7 @@
                 <w:rFonts w:ascii="Times New Roman" w:hAnsi="Times New Roman"/>
                 <w:b w:val="0"/>
                 <w:i w:val="0"/>
-                <w:sz w:val="22"/>
+                <w:sz w:val="21"/>
               </w:rPr>
               <w:t>24/05 – 31/05</w:t>
             </w:r>
@@ -4703,7 +7994,7 @@
                 <w:rFonts w:ascii="Times New Roman" w:hAnsi="Times New Roman"/>
                 <w:b w:val="0"/>
                 <w:i w:val="0"/>
-                <w:sz w:val="22"/>
+                <w:sz w:val="21"/>
               </w:rPr>
               <w:t>Bắt đầu học phần, tiếp nhận thông tin từ Giảng viên hướng dẫn TS. Vũ Xuân Hạnh. Tìm kiếm và liên hệ doanh nghiệp thực tập Hừng Đông Media.</w:t>
             </w:r>
@@ -4724,7 +8015,7 @@
                 <w:rFonts w:ascii="Times New Roman" w:hAnsi="Times New Roman"/>
                 <w:b w:val="0"/>
                 <w:i w:val="0"/>
-                <w:sz w:val="22"/>
+                <w:sz w:val="21"/>
               </w:rPr>
               <w:t>Hoàn thành</w:t>
             </w:r>
@@ -4747,7 +8038,7 @@
                 <w:rFonts w:ascii="Times New Roman" w:hAnsi="Times New Roman"/>
                 <w:b w:val="0"/>
                 <w:i w:val="0"/>
-                <w:sz w:val="22"/>
+                <w:sz w:val="21"/>
               </w:rPr>
               <w:t>Tuần 2</w:t>
             </w:r>
@@ -4768,7 +8059,7 @@
                 <w:rFonts w:ascii="Times New Roman" w:hAnsi="Times New Roman"/>
                 <w:b w:val="0"/>
                 <w:i w:val="0"/>
-                <w:sz w:val="22"/>
+                <w:sz w:val="21"/>
               </w:rPr>
               <w:t>01/06 – 07/06</w:t>
             </w:r>
@@ -4789,7 +8080,7 @@
                 <w:rFonts w:ascii="Times New Roman" w:hAnsi="Times New Roman"/>
                 <w:b w:val="0"/>
                 <w:i w:val="0"/>
-                <w:sz w:val="22"/>
+                <w:sz w:val="21"/>
               </w:rPr>
               <w:t>Hoàn thiện Đơn đăng ký thực tập, phỏng vấn tiếp nhận vị trí Kỹ sư phát triển phần mềm, phân công nhóm trưởng Đặng Minh Tuấn đại diện đăng ký.</w:t>
             </w:r>
@@ -4810,7 +8101,7 @@
                 <w:rFonts w:ascii="Times New Roman" w:hAnsi="Times New Roman"/>
                 <w:b w:val="0"/>
                 <w:i w:val="0"/>
-                <w:sz w:val="22"/>
+                <w:sz w:val="21"/>
               </w:rPr>
               <w:t>Hoàn thành</w:t>
             </w:r>
@@ -4833,7 +8124,7 @@
                 <w:rFonts w:ascii="Times New Roman" w:hAnsi="Times New Roman"/>
                 <w:b w:val="0"/>
                 <w:i w:val="0"/>
-                <w:sz w:val="22"/>
+                <w:sz w:val="21"/>
               </w:rPr>
               <w:t>Tuần 3</w:t>
             </w:r>
@@ -4854,7 +8145,7 @@
                 <w:rFonts w:ascii="Times New Roman" w:hAnsi="Times New Roman"/>
                 <w:b w:val="0"/>
                 <w:i w:val="0"/>
-                <w:sz w:val="22"/>
+                <w:sz w:val="21"/>
               </w:rPr>
               <w:t>08/06 – 14/06</w:t>
             </w:r>
@@ -4875,7 +8166,7 @@
                 <w:rFonts w:ascii="Times New Roman" w:hAnsi="Times New Roman"/>
                 <w:b w:val="0"/>
                 <w:i w:val="0"/>
-                <w:sz w:val="22"/>
+                <w:sz w:val="21"/>
               </w:rPr>
               <w:t>Tìm hiểu cơ cấu tổ chức Hừng Đông Media, thu thập tài liệu kỹ thuật, tham dự buổi học VClass01 (19h00 ngày 03/06/2026) tính điểm.</w:t>
             </w:r>
@@ -4896,7 +8187,7 @@
                 <w:rFonts w:ascii="Times New Roman" w:hAnsi="Times New Roman"/>
                 <w:b w:val="0"/>
                 <w:i w:val="0"/>
-                <w:sz w:val="22"/>
+                <w:sz w:val="21"/>
               </w:rPr>
               <w:t>Hoàn thành</w:t>
             </w:r>
@@ -4919,7 +8210,7 @@
                 <w:rFonts w:ascii="Times New Roman" w:hAnsi="Times New Roman"/>
                 <w:b w:val="0"/>
                 <w:i w:val="0"/>
-                <w:sz w:val="22"/>
+                <w:sz w:val="21"/>
               </w:rPr>
               <w:t>Tuần 4</w:t>
             </w:r>
@@ -4940,7 +8231,7 @@
                 <w:rFonts w:ascii="Times New Roman" w:hAnsi="Times New Roman"/>
                 <w:b w:val="0"/>
                 <w:i w:val="0"/>
-                <w:sz w:val="22"/>
+                <w:sz w:val="21"/>
               </w:rPr>
               <w:t>15/06 – 21/06</w:t>
             </w:r>
@@ -4961,7 +8252,7 @@
                 <w:rFonts w:ascii="Times New Roman" w:hAnsi="Times New Roman"/>
                 <w:b w:val="0"/>
                 <w:i w:val="0"/>
-                <w:sz w:val="22"/>
+                <w:sz w:val="21"/>
               </w:rPr>
               <w:t>Khảo sát hiện trạng website WordPress cũ, đo lường điểm Google Lighthouse (32/100), thu thập danh sách yêu cầu nghiệp vụ và xác định phạm vi dự án.</w:t>
             </w:r>
@@ -4982,7 +8273,7 @@
                 <w:rFonts w:ascii="Times New Roman" w:hAnsi="Times New Roman"/>
                 <w:b w:val="0"/>
                 <w:i w:val="0"/>
-                <w:sz w:val="22"/>
+                <w:sz w:val="21"/>
               </w:rPr>
               <w:t>Hoàn thành</w:t>
             </w:r>
@@ -5005,7 +8296,7 @@
                 <w:rFonts w:ascii="Times New Roman" w:hAnsi="Times New Roman"/>
                 <w:b w:val="0"/>
                 <w:i w:val="0"/>
-                <w:sz w:val="22"/>
+                <w:sz w:val="21"/>
               </w:rPr>
               <w:t>Tuần 5</w:t>
             </w:r>
@@ -5026,7 +8317,7 @@
                 <w:rFonts w:ascii="Times New Roman" w:hAnsi="Times New Roman"/>
                 <w:b w:val="0"/>
                 <w:i w:val="0"/>
-                <w:sz w:val="22"/>
+                <w:sz w:val="21"/>
               </w:rPr>
               <w:t>22/06 – 28/06</w:t>
             </w:r>
@@ -5047,7 +8338,7 @@
                 <w:rFonts w:ascii="Times New Roman" w:hAnsi="Times New Roman"/>
                 <w:b w:val="0"/>
                 <w:i w:val="0"/>
-                <w:sz w:val="22"/>
+                <w:sz w:val="21"/>
               </w:rPr>
               <w:t>Phân tích đặc tả yêu cầu, xây dựng 5 sơ đồ Use Case chi tiết, lập ma trận phân công trách nhiệm RACI giữa 3 thành viên nhóm.</w:t>
             </w:r>
@@ -5068,7 +8359,7 @@
                 <w:rFonts w:ascii="Times New Roman" w:hAnsi="Times New Roman"/>
                 <w:b w:val="0"/>
                 <w:i w:val="0"/>
-                <w:sz w:val="22"/>
+                <w:sz w:val="21"/>
               </w:rPr>
               <w:t>Hoàn thành</w:t>
             </w:r>
@@ -5091,7 +8382,7 @@
                 <w:rFonts w:ascii="Times New Roman" w:hAnsi="Times New Roman"/>
                 <w:b w:val="0"/>
                 <w:i w:val="0"/>
-                <w:sz w:val="22"/>
+                <w:sz w:val="21"/>
               </w:rPr>
               <w:t>Tuần 6</w:t>
             </w:r>
@@ -5112,7 +8403,7 @@
                 <w:rFonts w:ascii="Times New Roman" w:hAnsi="Times New Roman"/>
                 <w:b w:val="0"/>
                 <w:i w:val="0"/>
-                <w:sz w:val="22"/>
+                <w:sz w:val="21"/>
               </w:rPr>
               <w:t>29/06 – 05/07</w:t>
             </w:r>
@@ -5133,7 +8424,7 @@
                 <w:rFonts w:ascii="Times New Roman" w:hAnsi="Times New Roman"/>
                 <w:b w:val="0"/>
                 <w:i w:val="0"/>
-                <w:sz w:val="22"/>
+                <w:sz w:val="21"/>
               </w:rPr>
               <w:t>Thiết kế kiến trúc Decoupled Headless CMS 3 tầng, thiết kế lược đồ quan hệ CSDL MySQL và xây dựng bảng trường tùy biến GraphQL Schema.</w:t>
             </w:r>
@@ -5154,7 +8445,7 @@
                 <w:rFonts w:ascii="Times New Roman" w:hAnsi="Times New Roman"/>
                 <w:b w:val="0"/>
                 <w:i w:val="0"/>
-                <w:sz w:val="22"/>
+                <w:sz w:val="21"/>
               </w:rPr>
               <w:t>Hoàn thành</w:t>
             </w:r>
@@ -5177,7 +8468,7 @@
                 <w:rFonts w:ascii="Times New Roman" w:hAnsi="Times New Roman"/>
                 <w:b w:val="0"/>
                 <w:i w:val="0"/>
-                <w:sz w:val="22"/>
+                <w:sz w:val="21"/>
               </w:rPr>
               <w:t>Tuần 7</w:t>
             </w:r>
@@ -5198,7 +8489,7 @@
                 <w:rFonts w:ascii="Times New Roman" w:hAnsi="Times New Roman"/>
                 <w:b w:val="0"/>
                 <w:i w:val="0"/>
-                <w:sz w:val="22"/>
+                <w:sz w:val="21"/>
               </w:rPr>
               <w:t>06/07 – 12/07</w:t>
             </w:r>
@@ -5219,7 +8510,7 @@
                 <w:rFonts w:ascii="Times New Roman" w:hAnsi="Times New Roman"/>
                 <w:b w:val="0"/>
                 <w:i w:val="0"/>
-                <w:sz w:val="22"/>
+                <w:sz w:val="21"/>
               </w:rPr>
               <w:t>Báo cáo tiến độ giữa kỳ, hoàn thiện slide báo cáo, tham dự buổi học VClass02 (19h00 ngày 30/06/2026) tính điểm giữa kỳ thành công.</w:t>
             </w:r>
@@ -5240,7 +8531,7 @@
                 <w:rFonts w:ascii="Times New Roman" w:hAnsi="Times New Roman"/>
                 <w:b w:val="0"/>
                 <w:i w:val="0"/>
-                <w:sz w:val="22"/>
+                <w:sz w:val="21"/>
               </w:rPr>
               <w:t>Hoàn thành</w:t>
             </w:r>
@@ -5263,7 +8554,7 @@
                 <w:rFonts w:ascii="Times New Roman" w:hAnsi="Times New Roman"/>
                 <w:b w:val="0"/>
                 <w:i w:val="0"/>
-                <w:sz w:val="22"/>
+                <w:sz w:val="21"/>
               </w:rPr>
               <w:t>Tuần 8</w:t>
             </w:r>
@@ -5284,7 +8575,7 @@
                 <w:rFonts w:ascii="Times New Roman" w:hAnsi="Times New Roman"/>
                 <w:b w:val="0"/>
                 <w:i w:val="0"/>
-                <w:sz w:val="22"/>
+                <w:sz w:val="21"/>
               </w:rPr>
               <w:t>13/07 – 19/07</w:t>
             </w:r>
@@ -5305,7 +8596,7 @@
                 <w:rFonts w:ascii="Times New Roman" w:hAnsi="Times New Roman"/>
                 <w:b w:val="0"/>
                 <w:i w:val="0"/>
-                <w:sz w:val="22"/>
+                <w:sz w:val="21"/>
               </w:rPr>
               <w:t>Lập trình module cốt lõi ai_engine.js (Node.js), kết nối WordPress REST API với xác thực Application Password, test thử nghiệm bơm 3 bài viết đầu tiên.</w:t>
             </w:r>
@@ -5326,7 +8617,7 @@
                 <w:rFonts w:ascii="Times New Roman" w:hAnsi="Times New Roman"/>
                 <w:b w:val="0"/>
                 <w:i w:val="0"/>
-                <w:sz w:val="22"/>
+                <w:sz w:val="21"/>
               </w:rPr>
               <w:t>Hoàn thành</w:t>
             </w:r>
@@ -5349,7 +8640,7 @@
                 <w:rFonts w:ascii="Times New Roman" w:hAnsi="Times New Roman"/>
                 <w:b w:val="0"/>
                 <w:i w:val="0"/>
-                <w:sz w:val="22"/>
+                <w:sz w:val="21"/>
               </w:rPr>
               <w:t>Tuần 9</w:t>
             </w:r>
@@ -5370,7 +8661,7 @@
                 <w:rFonts w:ascii="Times New Roman" w:hAnsi="Times New Roman"/>
                 <w:b w:val="0"/>
                 <w:i w:val="0"/>
-                <w:sz w:val="22"/>
+                <w:sz w:val="21"/>
               </w:rPr>
               <w:t>20/07 – 26/07</w:t>
             </w:r>
@@ -5391,7 +8682,7 @@
                 <w:rFonts w:ascii="Times New Roman" w:hAnsi="Times New Roman"/>
                 <w:b w:val="0"/>
                 <w:i w:val="0"/>
-                <w:sz w:val="22"/>
+                <w:sz w:val="21"/>
               </w:rPr>
               <w:t>Xây dựng giao diện Frontend Next.js 14 với Faust.js framework, cấu hình hệ thống biến giao diện Dark Mode Cam Hừng Đông trong styles/_css-variables.scss.</w:t>
             </w:r>
@@ -5412,7 +8703,7 @@
                 <w:rFonts w:ascii="Times New Roman" w:hAnsi="Times New Roman"/>
                 <w:b w:val="0"/>
                 <w:i w:val="0"/>
-                <w:sz w:val="22"/>
+                <w:sz w:val="21"/>
               </w:rPr>
               <w:t>Hoàn thành</w:t>
             </w:r>
@@ -5435,7 +8726,7 @@
                 <w:rFonts w:ascii="Times New Roman" w:hAnsi="Times New Roman"/>
                 <w:b w:val="0"/>
                 <w:i w:val="0"/>
-                <w:sz w:val="22"/>
+                <w:sz w:val="21"/>
               </w:rPr>
               <w:t>Tuần 10</w:t>
             </w:r>
@@ -5456,7 +8747,7 @@
                 <w:rFonts w:ascii="Times New Roman" w:hAnsi="Times New Roman"/>
                 <w:b w:val="0"/>
                 <w:i w:val="0"/>
-                <w:sz w:val="22"/>
+                <w:sz w:val="21"/>
               </w:rPr>
               <w:t>27/07 – 02/08</w:t>
             </w:r>
@@ -5477,7 +8768,7 @@
                 <w:rFonts w:ascii="Times New Roman" w:hAnsi="Times New Roman"/>
                 <w:b w:val="0"/>
                 <w:i w:val="0"/>
-                <w:sz w:val="22"/>
+                <w:sz w:val="21"/>
               </w:rPr>
               <w:t>Tích hợp toàn diện Backend WPGraphQL và Frontend Next.js, tham dự buổi học VClass03 (19h00 ngày 20/07/2026) báo cáo tiến độ sản phẩm.</w:t>
             </w:r>
@@ -5498,7 +8789,7 @@
                 <w:rFonts w:ascii="Times New Roman" w:hAnsi="Times New Roman"/>
                 <w:b w:val="0"/>
                 <w:i w:val="0"/>
-                <w:sz w:val="22"/>
+                <w:sz w:val="21"/>
               </w:rPr>
               <w:t>Hoàn thành</w:t>
             </w:r>
@@ -5521,7 +8812,7 @@
                 <w:rFonts w:ascii="Times New Roman" w:hAnsi="Times New Roman"/>
                 <w:b w:val="0"/>
                 <w:i w:val="0"/>
-                <w:sz w:val="22"/>
+                <w:sz w:val="21"/>
               </w:rPr>
               <w:t>Tuần 11</w:t>
             </w:r>
@@ -5542,7 +8833,7 @@
                 <w:rFonts w:ascii="Times New Roman" w:hAnsi="Times New Roman"/>
                 <w:b w:val="0"/>
                 <w:i w:val="0"/>
-                <w:sz w:val="22"/>
+                <w:sz w:val="21"/>
               </w:rPr>
               <w:t>03/08 – 09/08</w:t>
             </w:r>
@@ -5563,7 +8854,7 @@
                 <w:rFonts w:ascii="Times New Roman" w:hAnsi="Times New Roman"/>
                 <w:b w:val="0"/>
                 <w:i w:val="0"/>
-                <w:sz w:val="22"/>
+                <w:sz w:val="21"/>
               </w:rPr>
               <w:t>Khắc phục sự cố biên dịch SassError: Undefined variable $break-medium trong _blocks.scss, nộp báo cáo lần 1 tính điểm giữa kỳ (30/07/2026).</w:t>
             </w:r>
@@ -5584,7 +8875,7 @@
                 <w:rFonts w:ascii="Times New Roman" w:hAnsi="Times New Roman"/>
                 <w:b w:val="0"/>
                 <w:i w:val="0"/>
-                <w:sz w:val="22"/>
+                <w:sz w:val="21"/>
               </w:rPr>
               <w:t>Hoàn thành</w:t>
             </w:r>
@@ -5607,7 +8898,7 @@
                 <w:rFonts w:ascii="Times New Roman" w:hAnsi="Times New Roman"/>
                 <w:b w:val="0"/>
                 <w:i w:val="0"/>
-                <w:sz w:val="22"/>
+                <w:sz w:val="21"/>
               </w:rPr>
               <w:t>Tuần 12</w:t>
             </w:r>
@@ -5628,7 +8919,7 @@
                 <w:rFonts w:ascii="Times New Roman" w:hAnsi="Times New Roman"/>
                 <w:b w:val="0"/>
                 <w:i w:val="0"/>
-                <w:sz w:val="22"/>
+                <w:sz w:val="21"/>
               </w:rPr>
               <w:t>10/08 – 16/08</w:t>
             </w:r>
@@ -5649,7 +8940,7 @@
                 <w:rFonts w:ascii="Times New Roman" w:hAnsi="Times New Roman"/>
                 <w:b w:val="0"/>
                 <w:i w:val="0"/>
-                <w:sz w:val="22"/>
+                <w:sz w:val="21"/>
               </w:rPr>
               <w:t>Kiểm thử hệ thống toàn diện với 8 Test Cases, đo lường chỉ số Core Web Vitals đạt điểm số Google Lighthouse 100/100 tuyệt đối.</w:t>
             </w:r>
@@ -5670,7 +8961,7 @@
                 <w:rFonts w:ascii="Times New Roman" w:hAnsi="Times New Roman"/>
                 <w:b w:val="0"/>
                 <w:i w:val="0"/>
-                <w:sz w:val="22"/>
+                <w:sz w:val="21"/>
               </w:rPr>
               <w:t>Hoàn thành</w:t>
             </w:r>
@@ -5693,7 +8984,7 @@
                 <w:rFonts w:ascii="Times New Roman" w:hAnsi="Times New Roman"/>
                 <w:b w:val="0"/>
                 <w:i w:val="0"/>
-                <w:sz w:val="22"/>
+                <w:sz w:val="21"/>
               </w:rPr>
               <w:t>Tuần 13</w:t>
             </w:r>
@@ -5714,7 +9005,7 @@
                 <w:rFonts w:ascii="Times New Roman" w:hAnsi="Times New Roman"/>
                 <w:b w:val="0"/>
                 <w:i w:val="0"/>
-                <w:sz w:val="22"/>
+                <w:sz w:val="21"/>
               </w:rPr>
               <w:t>17/08 – 23/08</w:t>
             </w:r>
@@ -5735,7 +9026,7 @@
                 <w:rFonts w:ascii="Times New Roman" w:hAnsi="Times New Roman"/>
                 <w:b w:val="0"/>
                 <w:i w:val="0"/>
-                <w:sz w:val="22"/>
+                <w:sz w:val="21"/>
               </w:rPr>
               <w:t>Triển khai thử nghiệm website thương mại Agency_Landing_Page, cấu hình chuẩn hóa giao thức llms.txt phục vụ Generative Engine Optimization (GEO).</w:t>
             </w:r>
@@ -5756,7 +9047,7 @@
                 <w:rFonts w:ascii="Times New Roman" w:hAnsi="Times New Roman"/>
                 <w:b w:val="0"/>
                 <w:i w:val="0"/>
-                <w:sz w:val="22"/>
+                <w:sz w:val="21"/>
               </w:rPr>
               <w:t>Hoàn thành</w:t>
             </w:r>
@@ -5779,7 +9070,7 @@
                 <w:rFonts w:ascii="Times New Roman" w:hAnsi="Times New Roman"/>
                 <w:b w:val="0"/>
                 <w:i w:val="0"/>
-                <w:sz w:val="22"/>
+                <w:sz w:val="21"/>
               </w:rPr>
               <w:t>Tuần 14</w:t>
             </w:r>
@@ -5800,7 +9091,7 @@
                 <w:rFonts w:ascii="Times New Roman" w:hAnsi="Times New Roman"/>
                 <w:b w:val="0"/>
                 <w:i w:val="0"/>
-                <w:sz w:val="22"/>
+                <w:sz w:val="21"/>
               </w:rPr>
               <w:t>24/08 – 30/08</w:t>
             </w:r>
@@ -5821,7 +9112,7 @@
                 <w:rFonts w:ascii="Times New Roman" w:hAnsi="Times New Roman"/>
                 <w:b w:val="0"/>
                 <w:i w:val="0"/>
-                <w:sz w:val="22"/>
+                <w:sz w:val="21"/>
               </w:rPr>
               <w:t>Thu thập phản hồi từ Ban Giám Đốc Hừng Đông Media, tính toán mô hình kinh doanh ROI 'Đầu tư 7 triệu thu về 120 triệu' và hoàn thiện tài liệu.</w:t>
             </w:r>
@@ -5842,7 +9133,7 @@
                 <w:rFonts w:ascii="Times New Roman" w:hAnsi="Times New Roman"/>
                 <w:b w:val="0"/>
                 <w:i w:val="0"/>
-                <w:sz w:val="22"/>
+                <w:sz w:val="21"/>
               </w:rPr>
               <w:t>Hoàn thành</w:t>
             </w:r>
@@ -5865,7 +9156,7 @@
                 <w:rFonts w:ascii="Times New Roman" w:hAnsi="Times New Roman"/>
                 <w:b w:val="0"/>
                 <w:i w:val="0"/>
-                <w:sz w:val="22"/>
+                <w:sz w:val="21"/>
               </w:rPr>
               <w:t>Tuần 15</w:t>
             </w:r>
@@ -5886,7 +9177,7 @@
                 <w:rFonts w:ascii="Times New Roman" w:hAnsi="Times New Roman"/>
                 <w:b w:val="0"/>
                 <w:i w:val="0"/>
-                <w:sz w:val="22"/>
+                <w:sz w:val="21"/>
               </w:rPr>
               <w:t>31/08 – 02/09</w:t>
             </w:r>
@@ -5907,7 +9198,7 @@
                 <w:rFonts w:ascii="Times New Roman" w:hAnsi="Times New Roman"/>
                 <w:b w:val="0"/>
                 <w:i w:val="0"/>
-                <w:sz w:val="22"/>
+                <w:sz w:val="21"/>
               </w:rPr>
               <w:t>Hoàn thiện toàn bộ hồ sơ thực tập: Đơn xin xác nhận, Phiếu đánh giá của doanh nghiệp, biên tập bản thảo báo cáo chuyên đề hoàn chỉnh.</w:t>
             </w:r>
@@ -5928,7 +9219,7 @@
                 <w:rFonts w:ascii="Times New Roman" w:hAnsi="Times New Roman"/>
                 <w:b w:val="0"/>
                 <w:i w:val="0"/>
-                <w:sz w:val="22"/>
+                <w:sz w:val="21"/>
               </w:rPr>
               <w:t>Hoàn thành</w:t>
             </w:r>
@@ -5951,7 +9242,7 @@
                 <w:rFonts w:ascii="Times New Roman" w:hAnsi="Times New Roman"/>
                 <w:b w:val="0"/>
                 <w:i w:val="0"/>
-                <w:sz w:val="22"/>
+                <w:sz w:val="21"/>
               </w:rPr>
               <w:t>Tuần 16</w:t>
             </w:r>
@@ -5972,7 +9263,7 @@
                 <w:rFonts w:ascii="Times New Roman" w:hAnsi="Times New Roman"/>
                 <w:b w:val="0"/>
                 <w:i w:val="0"/>
-                <w:sz w:val="22"/>
+                <w:sz w:val="21"/>
               </w:rPr>
               <w:t>03/09 – 06/09</w:t>
             </w:r>
@@ -5993,7 +9284,7 @@
                 <w:rFonts w:ascii="Times New Roman" w:hAnsi="Times New Roman"/>
                 <w:b w:val="0"/>
                 <w:i w:val="0"/>
-                <w:sz w:val="22"/>
+                <w:sz w:val="21"/>
               </w:rPr>
               <w:t>Nộp bản mềm Báo cáo chuyên đề hoàn chỉnh lên hệ thống Elearning EHOU trước 17h00 ngày 03/09/2026, chuẩn bị slide và sẵn sàng vấn đáp bảo vệ.</w:t>
             </w:r>
@@ -6014,7 +9305,7 @@
                 <w:rFonts w:ascii="Times New Roman" w:hAnsi="Times New Roman"/>
                 <w:b w:val="0"/>
                 <w:i w:val="0"/>
-                <w:sz w:val="22"/>
+                <w:sz w:val="21"/>
               </w:rPr>
               <w:t>Hoàn thành</w:t>
             </w:r>
@@ -6030,7 +9321,7 @@
     <w:p>
       <w:pPr>
         <w:keepNext/>
-        <w:spacing w:before="320" w:after="160"/>
+        <w:spacing w:before="360" w:after="160"/>
       </w:pPr>
       <w:r>
         <w:rPr>
@@ -6045,7 +9336,7 @@
     <w:p>
       <w:pPr>
         <w:keepNext/>
-        <w:spacing w:before="240" w:after="120"/>
+        <w:spacing w:before="260" w:after="120"/>
       </w:pPr>
       <w:r>
         <w:rPr>

</xml_diff>

<commit_message>
feat: Bo sung 2 Luu do thuat toan ky thuat chuyen sau (AI Engine RAG Pipeline & Next.js ISR Caching Flowchart)
</commit_message>
<xml_diff>
--- a/Bao_Cao_Thuc_Tap.docx
+++ b/Bao_Cao_Thuc_Tap.docx
@@ -3672,7 +3672,94 @@
           <w:i w:val="0"/>
           <w:sz w:val="26"/>
         </w:rPr>
-        <w:t>3.4. Thiết kế chi tiết giải pháp kỹ thuật tương ứng 6 Trục Tối Ưu</w:t>
+        <w:t>3.4. Lưu đồ xử lý bộ đệm tĩnh Next.js 14 ISR (Incremental Static Regeneration)</w:t>
+      </w:r>
+    </w:p>
+    <w:p>
+      <w:pPr>
+        <w:spacing w:line="312" w:lineRule="auto" w:after="100"/>
+        <w:ind w:firstLine="720"/>
+        <w:jc w:val="both"/>
+      </w:pPr>
+      <w:r>
+        <w:rPr>
+          <w:rFonts w:ascii="Times New Roman" w:hAnsi="Times New Roman"/>
+          <w:b w:val="0"/>
+          <w:i w:val="0"/>
+          <w:sz w:val="26"/>
+        </w:rPr>
+        <w:t>Cơ chế bộ đệm phân tầng kết hợp giữa Edge Caching và tái tạo tĩnh ngầm Stale-While-Revalidate được trực quan hóa qua lưu đồ thuật toán kỹ thuật sau:</w:t>
+      </w:r>
+    </w:p>
+    <w:p>
+      <w:pPr>
+        <w:spacing w:before="280" w:after="80"/>
+        <w:jc w:val="center"/>
+      </w:pPr>
+      <w:r>
+        <w:drawing>
+          <wp:inline xmlns:a="http://schemas.openxmlformats.org/drawingml/2006/main" xmlns:pic="http://schemas.openxmlformats.org/drawingml/2006/picture">
+            <wp:extent cx="5486400" cy="3086100"/>
+            <wp:docPr id="9" name="Picture 9"/>
+            <wp:cNvGraphicFramePr>
+              <a:graphicFrameLocks noChangeAspect="1"/>
+            </wp:cNvGraphicFramePr>
+            <a:graphic>
+              <a:graphicData uri="http://schemas.openxmlformats.org/drawingml/2006/picture">
+                <pic:pic>
+                  <pic:nvPicPr>
+                    <pic:cNvPr id="0" name="fig_3_4_flowchart_nextjs_isr.png"/>
+                    <pic:cNvPicPr/>
+                  </pic:nvPicPr>
+                  <pic:blipFill>
+                    <a:blip r:embed="rId17"/>
+                    <a:stretch>
+                      <a:fillRect/>
+                    </a:stretch>
+                  </pic:blipFill>
+                  <pic:spPr>
+                    <a:xfrm>
+                      <a:off x="0" y="0"/>
+                      <a:ext cx="5486400" cy="3086100"/>
+                    </a:xfrm>
+                    <a:prstGeom prst="rect"/>
+                  </pic:spPr>
+                </pic:pic>
+              </a:graphicData>
+            </a:graphic>
+          </wp:inline>
+        </w:drawing>
+      </w:r>
+    </w:p>
+    <w:p>
+      <w:pPr>
+        <w:spacing w:before="40" w:after="280"/>
+        <w:jc w:val="center"/>
+      </w:pPr>
+      <w:r>
+        <w:rPr>
+          <w:rFonts w:ascii="Times New Roman" w:hAnsi="Times New Roman"/>
+          <w:b/>
+          <w:i/>
+          <w:color w:val="4B5563"/>
+          <w:sz w:val="22"/>
+        </w:rPr>
+        <w:t>Hình 3.4: Lưu đồ thuật toán xử lý bộ đệm tĩnh Next.js 14 (ISR and Edge Caching)</w:t>
+      </w:r>
+    </w:p>
+    <w:p>
+      <w:pPr>
+        <w:keepNext/>
+        <w:spacing w:before="260" w:after="120"/>
+      </w:pPr>
+      <w:r>
+        <w:rPr>
+          <w:rFonts w:ascii="Times New Roman" w:hAnsi="Times New Roman"/>
+          <w:b/>
+          <w:i w:val="0"/>
+          <w:sz w:val="26"/>
+        </w:rPr>
+        <w:t>3.5. Thiết kế chi tiết giải pháp kỹ thuật tương ứng 6 Trục Tối Ưu</w:t>
       </w:r>
     </w:p>
     <w:p>
@@ -4481,8 +4568,64 @@
       <w:r>
         <w:drawing>
           <wp:inline xmlns:a="http://schemas.openxmlformats.org/drawingml/2006/main" xmlns:pic="http://schemas.openxmlformats.org/drawingml/2006/picture">
+            <wp:extent cx="5486400" cy="3429000"/>
+            <wp:docPr id="10" name="Picture 10"/>
+            <wp:cNvGraphicFramePr>
+              <a:graphicFrameLocks noChangeAspect="1"/>
+            </wp:cNvGraphicFramePr>
+            <a:graphic>
+              <a:graphicData uri="http://schemas.openxmlformats.org/drawingml/2006/picture">
+                <pic:pic>
+                  <pic:nvPicPr>
+                    <pic:cNvPr id="0" name="fig_4_7_flowchart_ai_engine.png"/>
+                    <pic:cNvPicPr/>
+                  </pic:nvPicPr>
+                  <pic:blipFill>
+                    <a:blip r:embed="rId18"/>
+                    <a:stretch>
+                      <a:fillRect/>
+                    </a:stretch>
+                  </pic:blipFill>
+                  <pic:spPr>
+                    <a:xfrm>
+                      <a:off x="0" y="0"/>
+                      <a:ext cx="5486400" cy="3429000"/>
+                    </a:xfrm>
+                    <a:prstGeom prst="rect"/>
+                  </pic:spPr>
+                </pic:pic>
+              </a:graphicData>
+            </a:graphic>
+          </wp:inline>
+        </w:drawing>
+      </w:r>
+    </w:p>
+    <w:p>
+      <w:pPr>
+        <w:spacing w:before="40" w:after="280"/>
+        <w:jc w:val="center"/>
+      </w:pPr>
+      <w:r>
+        <w:rPr>
+          <w:rFonts w:ascii="Times New Roman" w:hAnsi="Times New Roman"/>
+          <w:b/>
+          <w:i/>
+          <w:color w:val="4B5563"/>
+          <w:sz w:val="22"/>
+        </w:rPr>
+        <w:t>Hình 4.1: Lưu đồ thuật toán quy trình xử lý cỗ máy AI Content Engine và Pipeline RAG</w:t>
+      </w:r>
+    </w:p>
+    <w:p>
+      <w:pPr>
+        <w:spacing w:before="280" w:after="80"/>
+        <w:jc w:val="center"/>
+      </w:pPr>
+      <w:r>
+        <w:drawing>
+          <wp:inline xmlns:a="http://schemas.openxmlformats.org/drawingml/2006/main" xmlns:pic="http://schemas.openxmlformats.org/drawingml/2006/picture">
             <wp:extent cx="5486400" cy="3291840"/>
-            <wp:docPr id="9" name="Picture 9"/>
+            <wp:docPr id="11" name="Picture 11"/>
             <wp:cNvGraphicFramePr>
               <a:graphicFrameLocks noChangeAspect="1"/>
             </wp:cNvGraphicFramePr>
@@ -4494,7 +4637,7 @@
                     <pic:cNvPicPr/>
                   </pic:nvPicPr>
                   <pic:blipFill>
-                    <a:blip r:embed="rId17"/>
+                    <a:blip r:embed="rId19"/>
                     <a:stretch>
                       <a:fillRect/>
                     </a:stretch>
@@ -4526,7 +4669,7 @@
           <w:color w:val="4B5563"/>
           <w:sz w:val="22"/>
         </w:rPr>
-        <w:t>Hình 4.1: Khung mã nguồn xử lý cỗ máy AI Content Engine (ai_engine.js)</w:t>
+        <w:t>Hình 4.2: Khung mã nguồn xử lý cỗ máy AI Content Engine (ai_engine.js)</w:t>
       </w:r>
     </w:p>
     <w:p>
@@ -4569,7 +4712,7 @@
         <w:drawing>
           <wp:inline xmlns:a="http://schemas.openxmlformats.org/drawingml/2006/main" xmlns:pic="http://schemas.openxmlformats.org/drawingml/2006/picture">
             <wp:extent cx="5486400" cy="3291840"/>
-            <wp:docPr id="10" name="Picture 10"/>
+            <wp:docPr id="12" name="Picture 12"/>
             <wp:cNvGraphicFramePr>
               <a:graphicFrameLocks noChangeAspect="1"/>
             </wp:cNvGraphicFramePr>
@@ -4581,7 +4724,7 @@
                     <pic:cNvPicPr/>
                   </pic:nvPicPr>
                   <pic:blipFill>
-                    <a:blip r:embed="rId18"/>
+                    <a:blip r:embed="rId20"/>
                     <a:stretch>
                       <a:fillRect/>
                     </a:stretch>
@@ -4656,7 +4799,7 @@
         <w:drawing>
           <wp:inline xmlns:a="http://schemas.openxmlformats.org/drawingml/2006/main" xmlns:pic="http://schemas.openxmlformats.org/drawingml/2006/picture">
             <wp:extent cx="5486400" cy="3429000"/>
-            <wp:docPr id="11" name="Picture 11"/>
+            <wp:docPr id="13" name="Picture 13"/>
             <wp:cNvGraphicFramePr>
               <a:graphicFrameLocks noChangeAspect="1"/>
             </wp:cNvGraphicFramePr>
@@ -4668,7 +4811,7 @@
                     <pic:cNvPicPr/>
                   </pic:nvPicPr>
                   <pic:blipFill>
-                    <a:blip r:embed="rId19"/>
+                    <a:blip r:embed="rId21"/>
                     <a:stretch>
                       <a:fillRect/>
                     </a:stretch>
@@ -4712,7 +4855,7 @@
         </w:rPr>
         <w:t xml:space="preserve"> - Xem trực tiếp: </w:t>
       </w:r>
-      <w:hyperlink r:id="rId20">
+      <w:hyperlink r:id="rId22">
         <w:r>
           <w:rPr>
             <w:color w:val="0563C1"/>
@@ -4732,7 +4875,7 @@
         <w:drawing>
           <wp:inline xmlns:a="http://schemas.openxmlformats.org/drawingml/2006/main" xmlns:pic="http://schemas.openxmlformats.org/drawingml/2006/picture">
             <wp:extent cx="5486400" cy="3429000"/>
-            <wp:docPr id="12" name="Picture 12"/>
+            <wp:docPr id="14" name="Picture 14"/>
             <wp:cNvGraphicFramePr>
               <a:graphicFrameLocks noChangeAspect="1"/>
             </wp:cNvGraphicFramePr>
@@ -4744,7 +4887,7 @@
                     <pic:cNvPicPr/>
                   </pic:nvPicPr>
                   <pic:blipFill>
-                    <a:blip r:embed="rId21"/>
+                    <a:blip r:embed="rId23"/>
                     <a:stretch>
                       <a:fillRect/>
                     </a:stretch>
@@ -4788,7 +4931,7 @@
         </w:rPr>
         <w:t xml:space="preserve"> - Xem trực tiếp: </w:t>
       </w:r>
-      <w:hyperlink r:id="rId22">
+      <w:hyperlink r:id="rId24">
         <w:r>
           <w:rPr>
             <w:color w:val="0563C1"/>
@@ -4808,7 +4951,7 @@
         <w:drawing>
           <wp:inline xmlns:a="http://schemas.openxmlformats.org/drawingml/2006/main" xmlns:pic="http://schemas.openxmlformats.org/drawingml/2006/picture">
             <wp:extent cx="5486400" cy="11873132"/>
-            <wp:docPr id="13" name="Picture 13"/>
+            <wp:docPr id="15" name="Picture 15"/>
             <wp:cNvGraphicFramePr>
               <a:graphicFrameLocks noChangeAspect="1"/>
             </wp:cNvGraphicFramePr>
@@ -4820,7 +4963,7 @@
                     <pic:cNvPicPr/>
                   </pic:nvPicPr>
                   <pic:blipFill>
-                    <a:blip r:embed="rId23"/>
+                    <a:blip r:embed="rId25"/>
                     <a:stretch>
                       <a:fillRect/>
                     </a:stretch>
@@ -4864,7 +5007,7 @@
         </w:rPr>
         <w:t xml:space="preserve"> - Xem trực tiếp: </w:t>
       </w:r>
-      <w:hyperlink r:id="rId24">
+      <w:hyperlink r:id="rId26">
         <w:r>
           <w:rPr>
             <w:color w:val="0563C1"/>
@@ -4935,7 +5078,7 @@
         <w:drawing>
           <wp:inline xmlns:a="http://schemas.openxmlformats.org/drawingml/2006/main" xmlns:pic="http://schemas.openxmlformats.org/drawingml/2006/picture">
             <wp:extent cx="5486400" cy="3291840"/>
-            <wp:docPr id="14" name="Picture 14"/>
+            <wp:docPr id="16" name="Picture 16"/>
             <wp:cNvGraphicFramePr>
               <a:graphicFrameLocks noChangeAspect="1"/>
             </wp:cNvGraphicFramePr>
@@ -4947,7 +5090,7 @@
                     <pic:cNvPicPr/>
                   </pic:nvPicPr>
                   <pic:blipFill>
-                    <a:blip r:embed="rId25"/>
+                    <a:blip r:embed="rId27"/>
                     <a:stretch>
                       <a:fillRect/>
                     </a:stretch>
@@ -5022,7 +5165,7 @@
         <w:drawing>
           <wp:inline xmlns:a="http://schemas.openxmlformats.org/drawingml/2006/main" xmlns:pic="http://schemas.openxmlformats.org/drawingml/2006/picture">
             <wp:extent cx="5486400" cy="2880360"/>
-            <wp:docPr id="15" name="Picture 15"/>
+            <wp:docPr id="17" name="Picture 17"/>
             <wp:cNvGraphicFramePr>
               <a:graphicFrameLocks noChangeAspect="1"/>
             </wp:cNvGraphicFramePr>
@@ -5034,7 +5177,7 @@
                     <pic:cNvPicPr/>
                   </pic:nvPicPr>
                   <pic:blipFill>
-                    <a:blip r:embed="rId26"/>
+                    <a:blip r:embed="rId28"/>
                     <a:stretch>
                       <a:fillRect/>
                     </a:stretch>
@@ -6957,7 +7100,7 @@
         <w:drawing>
           <wp:inline xmlns:a="http://schemas.openxmlformats.org/drawingml/2006/main" xmlns:pic="http://schemas.openxmlformats.org/drawingml/2006/picture">
             <wp:extent cx="5486400" cy="3429000"/>
-            <wp:docPr id="16" name="Picture 16"/>
+            <wp:docPr id="18" name="Picture 18"/>
             <wp:cNvGraphicFramePr>
               <a:graphicFrameLocks noChangeAspect="1"/>
             </wp:cNvGraphicFramePr>
@@ -6969,7 +7112,7 @@
                     <pic:cNvPicPr/>
                   </pic:nvPicPr>
                   <pic:blipFill>
-                    <a:blip r:embed="rId27"/>
+                    <a:blip r:embed="rId29"/>
                     <a:stretch>
                       <a:fillRect/>
                     </a:stretch>
@@ -7013,7 +7156,7 @@
         </w:rPr>
         <w:t xml:space="preserve"> - Xem trực tiếp: </w:t>
       </w:r>
-      <w:hyperlink r:id="rId24">
+      <w:hyperlink r:id="rId26">
         <w:r>
           <w:rPr>
             <w:color w:val="0563C1"/>
@@ -7064,7 +7207,7 @@
         <w:drawing>
           <wp:inline xmlns:a="http://schemas.openxmlformats.org/drawingml/2006/main" xmlns:pic="http://schemas.openxmlformats.org/drawingml/2006/picture">
             <wp:extent cx="5486400" cy="3429000"/>
-            <wp:docPr id="17" name="Picture 17"/>
+            <wp:docPr id="19" name="Picture 19"/>
             <wp:cNvGraphicFramePr>
               <a:graphicFrameLocks noChangeAspect="1"/>
             </wp:cNvGraphicFramePr>
@@ -7076,7 +7219,7 @@
                     <pic:cNvPicPr/>
                   </pic:nvPicPr>
                   <pic:blipFill>
-                    <a:blip r:embed="rId28"/>
+                    <a:blip r:embed="rId30"/>
                     <a:stretch>
                       <a:fillRect/>
                     </a:stretch>
@@ -7120,7 +7263,7 @@
         </w:rPr>
         <w:t xml:space="preserve"> - Xem trực tiếp: </w:t>
       </w:r>
-      <w:hyperlink r:id="rId29">
+      <w:hyperlink r:id="rId31">
         <w:r>
           <w:rPr>
             <w:color w:val="0563C1"/>
@@ -7140,7 +7283,7 @@
         <w:drawing>
           <wp:inline xmlns:a="http://schemas.openxmlformats.org/drawingml/2006/main" xmlns:pic="http://schemas.openxmlformats.org/drawingml/2006/picture">
             <wp:extent cx="5486400" cy="3062177"/>
-            <wp:docPr id="18" name="Picture 18"/>
+            <wp:docPr id="20" name="Picture 20"/>
             <wp:cNvGraphicFramePr>
               <a:graphicFrameLocks noChangeAspect="1"/>
             </wp:cNvGraphicFramePr>
@@ -7152,7 +7295,7 @@
                     <pic:cNvPicPr/>
                   </pic:nvPicPr>
                   <pic:blipFill>
-                    <a:blip r:embed="rId30"/>
+                    <a:blip r:embed="rId32"/>
                     <a:stretch>
                       <a:fillRect/>
                     </a:stretch>
@@ -7227,7 +7370,7 @@
         <w:drawing>
           <wp:inline xmlns:a="http://schemas.openxmlformats.org/drawingml/2006/main" xmlns:pic="http://schemas.openxmlformats.org/drawingml/2006/picture">
             <wp:extent cx="5486400" cy="3429000"/>
-            <wp:docPr id="19" name="Picture 19"/>
+            <wp:docPr id="21" name="Picture 21"/>
             <wp:cNvGraphicFramePr>
               <a:graphicFrameLocks noChangeAspect="1"/>
             </wp:cNvGraphicFramePr>
@@ -7239,7 +7382,7 @@
                     <pic:cNvPicPr/>
                   </pic:nvPicPr>
                   <pic:blipFill>
-                    <a:blip r:embed="rId31"/>
+                    <a:blip r:embed="rId33"/>
                     <a:stretch>
                       <a:fillRect/>
                     </a:stretch>
@@ -7283,7 +7426,7 @@
         </w:rPr>
         <w:t xml:space="preserve"> - Xem trực tiếp: </w:t>
       </w:r>
-      <w:hyperlink r:id="rId32">
+      <w:hyperlink r:id="rId34">
         <w:r>
           <w:rPr>
             <w:color w:val="0563C1"/>
@@ -7334,7 +7477,7 @@
         <w:drawing>
           <wp:inline xmlns:a="http://schemas.openxmlformats.org/drawingml/2006/main" xmlns:pic="http://schemas.openxmlformats.org/drawingml/2006/picture">
             <wp:extent cx="5486400" cy="3429000"/>
-            <wp:docPr id="20" name="Picture 20"/>
+            <wp:docPr id="22" name="Picture 22"/>
             <wp:cNvGraphicFramePr>
               <a:graphicFrameLocks noChangeAspect="1"/>
             </wp:cNvGraphicFramePr>
@@ -7346,7 +7489,7 @@
                     <pic:cNvPicPr/>
                   </pic:nvPicPr>
                   <pic:blipFill>
-                    <a:blip r:embed="rId33"/>
+                    <a:blip r:embed="rId35"/>
                     <a:stretch>
                       <a:fillRect/>
                     </a:stretch>
@@ -7390,7 +7533,7 @@
         </w:rPr>
         <w:t xml:space="preserve"> - Xem trực tiếp: </w:t>
       </w:r>
-      <w:hyperlink r:id="rId34">
+      <w:hyperlink r:id="rId36">
         <w:r>
           <w:rPr>
             <w:color w:val="0563C1"/>
@@ -7441,7 +7584,7 @@
         <w:drawing>
           <wp:inline xmlns:a="http://schemas.openxmlformats.org/drawingml/2006/main" xmlns:pic="http://schemas.openxmlformats.org/drawingml/2006/picture">
             <wp:extent cx="5486400" cy="3429000"/>
-            <wp:docPr id="21" name="Picture 21"/>
+            <wp:docPr id="23" name="Picture 23"/>
             <wp:cNvGraphicFramePr>
               <a:graphicFrameLocks noChangeAspect="1"/>
             </wp:cNvGraphicFramePr>
@@ -7453,7 +7596,7 @@
                     <pic:cNvPicPr/>
                   </pic:nvPicPr>
                   <pic:blipFill>
-                    <a:blip r:embed="rId35"/>
+                    <a:blip r:embed="rId37"/>
                     <a:stretch>
                       <a:fillRect/>
                     </a:stretch>
@@ -7497,7 +7640,7 @@
         </w:rPr>
         <w:t xml:space="preserve"> - Xem trực tiếp: </w:t>
       </w:r>
-      <w:hyperlink r:id="rId36">
+      <w:hyperlink r:id="rId38">
         <w:r>
           <w:rPr>
             <w:color w:val="0563C1"/>
@@ -7517,7 +7660,7 @@
         <w:drawing>
           <wp:inline xmlns:a="http://schemas.openxmlformats.org/drawingml/2006/main" xmlns:pic="http://schemas.openxmlformats.org/drawingml/2006/picture">
             <wp:extent cx="5486400" cy="3429000"/>
-            <wp:docPr id="22" name="Picture 22"/>
+            <wp:docPr id="24" name="Picture 24"/>
             <wp:cNvGraphicFramePr>
               <a:graphicFrameLocks noChangeAspect="1"/>
             </wp:cNvGraphicFramePr>
@@ -7529,7 +7672,7 @@
                     <pic:cNvPicPr/>
                   </pic:nvPicPr>
                   <pic:blipFill>
-                    <a:blip r:embed="rId37"/>
+                    <a:blip r:embed="rId39"/>
                     <a:stretch>
                       <a:fillRect/>
                     </a:stretch>
@@ -7573,7 +7716,7 @@
         </w:rPr>
         <w:t xml:space="preserve"> - Xem trực tiếp: </w:t>
       </w:r>
-      <w:hyperlink r:id="rId38">
+      <w:hyperlink r:id="rId40">
         <w:r>
           <w:rPr>
             <w:color w:val="0563C1"/>
@@ -7593,7 +7736,7 @@
         <w:drawing>
           <wp:inline xmlns:a="http://schemas.openxmlformats.org/drawingml/2006/main" xmlns:pic="http://schemas.openxmlformats.org/drawingml/2006/picture">
             <wp:extent cx="5486400" cy="3429000"/>
-            <wp:docPr id="23" name="Picture 23"/>
+            <wp:docPr id="25" name="Picture 25"/>
             <wp:cNvGraphicFramePr>
               <a:graphicFrameLocks noChangeAspect="1"/>
             </wp:cNvGraphicFramePr>
@@ -7605,7 +7748,7 @@
                     <pic:cNvPicPr/>
                   </pic:nvPicPr>
                   <pic:blipFill>
-                    <a:blip r:embed="rId39"/>
+                    <a:blip r:embed="rId41"/>
                     <a:stretch>
                       <a:fillRect/>
                     </a:stretch>
@@ -7649,7 +7792,7 @@
         </w:rPr>
         <w:t xml:space="preserve"> - Xem trực tiếp: </w:t>
       </w:r>
-      <w:hyperlink r:id="rId40">
+      <w:hyperlink r:id="rId42">
         <w:r>
           <w:rPr>
             <w:color w:val="0563C1"/>
@@ -7720,7 +7863,7 @@
         <w:drawing>
           <wp:inline xmlns:a="http://schemas.openxmlformats.org/drawingml/2006/main" xmlns:pic="http://schemas.openxmlformats.org/drawingml/2006/picture">
             <wp:extent cx="5486400" cy="2743200"/>
-            <wp:docPr id="24" name="Picture 24"/>
+            <wp:docPr id="26" name="Picture 26"/>
             <wp:cNvGraphicFramePr>
               <a:graphicFrameLocks noChangeAspect="1"/>
             </wp:cNvGraphicFramePr>
@@ -7732,7 +7875,7 @@
                     <pic:cNvPicPr/>
                   </pic:nvPicPr>
                   <pic:blipFill>
-                    <a:blip r:embed="rId41"/>
+                    <a:blip r:embed="rId43"/>
                     <a:stretch>
                       <a:fillRect/>
                     </a:stretch>

</xml_diff>

<commit_message>
feat: Bo sung Muc 7.3 He sinh thai Tiep thi Da kenh Tu dong bang AI (Chatbot RAG, Zalo OA, Telegram, Facebook, Threads) va Bang Lo trinh Roadmap 3 Giai doan
</commit_message>
<xml_diff>
--- a/Bao_Cao_Thuc_Tap.docx
+++ b/Bao_Cao_Thuc_Tap.docx
@@ -7941,6 +7941,574 @@
         <w:t>Nhóm sinh viên đã hoàn thành 100% mục tiêu đề ra, làm chủ hoàn toàn công nghệ Headless WordPress, GraphQL, Next.js 14 và AI Content Engine.</w:t>
       </w:r>
     </w:p>
+    <w:p>
+      <w:pPr>
+        <w:keepNext/>
+        <w:spacing w:before="260" w:after="120"/>
+      </w:pPr>
+      <w:r>
+        <w:rPr>
+          <w:rFonts w:ascii="Times New Roman" w:hAnsi="Times New Roman"/>
+          <w:b/>
+          <w:i w:val="0"/>
+          <w:sz w:val="26"/>
+        </w:rPr>
+        <w:t>7.3. Hướng phát triển mở rộng: Hệ sinh thái Tiếp thị Đa kênh Tự động bằng AI (Omnichannel AI Marketing Ecosystem)</w:t>
+      </w:r>
+    </w:p>
+    <w:p>
+      <w:pPr>
+        <w:spacing w:line="312" w:lineRule="auto" w:after="100"/>
+        <w:ind w:firstLine="720"/>
+        <w:jc w:val="both"/>
+      </w:pPr>
+      <w:r>
+        <w:rPr>
+          <w:rFonts w:ascii="Times New Roman" w:hAnsi="Times New Roman"/>
+          <w:b w:val="0"/>
+          <w:i w:val="0"/>
+          <w:sz w:val="26"/>
+        </w:rPr>
+        <w:t>Dựa trên thành công của nền tảng Headless CMS và cỗ máy AI Content Engine hiện tại, nhóm nghiên cứu đã xây dựng lộ trình nâng cấp sản phẩm lên tầm cao mới, chuyển hóa đồ án từ một cổng thông tin website đơn lẻ thành một 'Hệ sinh thái Tiếp thị Đa kênh Tự động Hóa Khép Kín' (Omnichannel Automated Marketing Suite) nhằm tối đa hóa độ phủ sóng thương hiệu và tăng trưởng doanh thu cho doanh nghiệp tiếp nhận thực tập:</w:t>
+      </w:r>
+    </w:p>
+    <w:p>
+      <w:pPr>
+        <w:keepNext/>
+        <w:spacing w:before="180" w:after="80"/>
+      </w:pPr>
+      <w:r>
+        <w:rPr>
+          <w:rFonts w:ascii="Times New Roman" w:hAnsi="Times New Roman"/>
+          <w:b/>
+          <w:i/>
+          <w:sz w:val="26"/>
+        </w:rPr>
+        <w:t>7.3.1. Trụ cột 1: Tích hợp Trợ lý ảo AI Chatbot tư vấn 24/7 trên Website (RAG Customer Service)</w:t>
+      </w:r>
+    </w:p>
+    <w:p>
+      <w:pPr>
+        <w:spacing w:line="312" w:lineRule="auto" w:after="100"/>
+        <w:ind w:firstLine="720"/>
+        <w:jc w:val="both"/>
+      </w:pPr>
+      <w:r>
+        <w:rPr>
+          <w:rFonts w:ascii="Times New Roman" w:hAnsi="Times New Roman"/>
+          <w:b w:val="0"/>
+          <w:i w:val="0"/>
+          <w:sz w:val="26"/>
+        </w:rPr>
+        <w:t>Nhóm dự kiến xây dựng module AI Chatbot tương tác thời gian thực gắn nổi tại góc phải website. Áp dụng công nghệ RAG (Retrieval-Augmented Generation) kết hợp Vector Database (Pinecone / ChromaDB), Chatbot sẽ đọc hiểu toàn bộ kho tri thức sản phẩm từ tệp /llms.txt và hệ thống bài viết trên WordPress. Khi khách hàng truy cập website và có thắc mắc về báo giá hoặc giải pháp, Chatbot sẽ tư vấn chuẩn xác trong vòng 1 giây, tự động chấm điểm khách hàng tiềm năng (Lead Scoring) và thu thập số điện thoại/Zalo để chuyển giao ngay lập tức cho đội ngũ kinh doanh.</w:t>
+      </w:r>
+    </w:p>
+    <w:p>
+      <w:pPr>
+        <w:keepNext/>
+        <w:spacing w:before="180" w:after="80"/>
+      </w:pPr>
+      <w:r>
+        <w:rPr>
+          <w:rFonts w:ascii="Times New Roman" w:hAnsi="Times New Roman"/>
+          <w:b/>
+          <w:i/>
+          <w:sz w:val="26"/>
+        </w:rPr>
+        <w:t>7.3.2. Trụ cột 2: Tự động hóa tiếp thị trên các ứng dụng trò chuyện OTT (Zalo Official Account &amp; Telegram Bot)</w:t>
+      </w:r>
+    </w:p>
+    <w:p>
+      <w:pPr>
+        <w:spacing w:line="312" w:lineRule="auto" w:after="100"/>
+        <w:ind w:firstLine="720"/>
+        <w:jc w:val="both"/>
+      </w:pPr>
+      <w:r>
+        <w:rPr>
+          <w:rFonts w:ascii="Times New Roman" w:hAnsi="Times New Roman"/>
+          <w:b w:val="0"/>
+          <w:i w:val="0"/>
+          <w:sz w:val="26"/>
+        </w:rPr>
+        <w:t>Theo khảo sát thị trường người dùng Việt Nam, các ứng dụng trò chuyện OTT như Zalo và Telegram sở hữu tỷ lệ mở tin nhắn (Open Rate) vượt trội &gt;90% so với Email truyền thống (chỉ 15-20%). Nhóm định hướng mở rộng cỗ máy với cơ chế Event-Driven Webhook: Ngay sau khi ai_engine.js xuất bản thành công một bài viết mới, hệ thống sẽ tự động kích hoạt API gửi bản tin tóm tắt kèm đường dẫn truy cập trực tiếp tới kênh Telegram cộng đồng của khách hàng VIP và gửi thông báo qua Zalo ZNS / Zalo OA đến các đối tác quan tâm.</w:t>
+      </w:r>
+    </w:p>
+    <w:p>
+      <w:pPr>
+        <w:keepNext/>
+        <w:spacing w:before="180" w:after="80"/>
+      </w:pPr>
+      <w:r>
+        <w:rPr>
+          <w:rFonts w:ascii="Times New Roman" w:hAnsi="Times New Roman"/>
+          <w:b/>
+          <w:i/>
+          <w:sz w:val="26"/>
+        </w:rPr>
+        <w:t>7.3.3. Trụ cột 3: Cỗ máy Tái cấu trúc Nội dung Đa kênh trên Mạng Xã Hội (Facebook &amp; Threads Automation)</w:t>
+      </w:r>
+    </w:p>
+    <w:p>
+      <w:pPr>
+        <w:spacing w:line="312" w:lineRule="auto" w:after="100"/>
+        <w:ind w:firstLine="720"/>
+        <w:jc w:val="both"/>
+      </w:pPr>
+      <w:r>
+        <w:rPr>
+          <w:rFonts w:ascii="Times New Roman" w:hAnsi="Times New Roman"/>
+          <w:b w:val="0"/>
+          <w:i w:val="0"/>
+          <w:sz w:val="26"/>
+        </w:rPr>
+        <w:t>Một thách thức lớn của tiếp thị số là sự khác biệt về hành vi người dùng trên các nền tảng mạng xã hội khác nhau. Nhóm sẽ phát triển module 'Content Repurposing Engine' tự động phân rã bài viết dài:</w:t>
+      </w:r>
+    </w:p>
+    <w:p>
+      <w:pPr>
+        <w:pStyle w:val="ListBullet"/>
+        <w:spacing w:line="312" w:lineRule="auto" w:after="60"/>
+        <w:ind w:left="720"/>
+        <w:jc w:val="both"/>
+      </w:pPr>
+      <w:r>
+        <w:rPr>
+          <w:rFonts w:ascii="Times New Roman" w:hAnsi="Times New Roman"/>
+          <w:b/>
+          <w:i w:val="0"/>
+          <w:sz w:val="26"/>
+        </w:rPr>
+        <w:t xml:space="preserve">• </w:t>
+      </w:r>
+      <w:r>
+        <w:rPr>
+          <w:rFonts w:ascii="Times New Roman" w:hAnsi="Times New Roman"/>
+          <w:b w:val="0"/>
+          <w:i w:val="0"/>
+          <w:sz w:val="26"/>
+        </w:rPr>
+        <w:t>Trên nền tảng Threads: AI tự động bóc tách bài viết dài 1500 từ trên web thành một chuỗi bài đăng ngắn (Thread Storm 3-5 bài) cô đọng, giàu góc nhìn chuyên gia, tối ưu theo thuật toán lan truyền tự nhiên của Meta Threads.</w:t>
+      </w:r>
+    </w:p>
+    <w:p>
+      <w:pPr>
+        <w:pStyle w:val="ListBullet"/>
+        <w:spacing w:line="312" w:lineRule="auto" w:after="60"/>
+        <w:ind w:left="720"/>
+        <w:jc w:val="both"/>
+      </w:pPr>
+      <w:r>
+        <w:rPr>
+          <w:rFonts w:ascii="Times New Roman" w:hAnsi="Times New Roman"/>
+          <w:b/>
+          <w:i w:val="0"/>
+          <w:sz w:val="26"/>
+        </w:rPr>
+        <w:t xml:space="preserve">• </w:t>
+      </w:r>
+      <w:r>
+        <w:rPr>
+          <w:rFonts w:ascii="Times New Roman" w:hAnsi="Times New Roman"/>
+          <w:b w:val="0"/>
+          <w:i w:val="0"/>
+          <w:sz w:val="26"/>
+        </w:rPr>
+        <w:t>Trên nền tảng Facebook Fanpage: Tự động tổng hợp thành bài viết truyền thông thảo luận (Discussion Post) kèm hình ảnh minh họa bắt mắt và câu kêu gọi hành động (CTA), tự động lên lịch đăng vào các khung giờ vàng có lượng tương tác cao nhất.</w:t>
+      </w:r>
+    </w:p>
+    <w:p>
+      <w:pPr>
+        <w:keepNext/>
+        <w:spacing w:before="180" w:after="80"/>
+      </w:pPr>
+      <w:r>
+        <w:rPr>
+          <w:rFonts w:ascii="Times New Roman" w:hAnsi="Times New Roman"/>
+          <w:b/>
+          <w:i/>
+          <w:sz w:val="26"/>
+        </w:rPr>
+        <w:t>7.3.4. Bảng Lộ trình Phát triển Hệ sinh thái 3 Giai đoạn (Product Development Roadmap)</w:t>
+      </w:r>
+    </w:p>
+    <w:p>
+      <w:pPr>
+        <w:spacing w:line="312" w:lineRule="auto" w:after="100"/>
+        <w:ind w:firstLine="720"/>
+        <w:jc w:val="both"/>
+      </w:pPr>
+      <w:r>
+        <w:rPr>
+          <w:rFonts w:ascii="Times New Roman" w:hAnsi="Times New Roman"/>
+          <w:b w:val="0"/>
+          <w:i w:val="0"/>
+          <w:sz w:val="26"/>
+        </w:rPr>
+        <w:t>Lộ trình triển khai cụ thể được hoạch định theo 3 giai đoạn chiến lược trong năm 2026 - 2027:</w:t>
+      </w:r>
+    </w:p>
+    <w:tbl>
+      <w:tblPr>
+        <w:tblStyle w:val="TableGrid"/>
+        <w:tblW w:type="auto" w:w="0"/>
+        <w:tblLook w:firstColumn="1" w:firstRow="1" w:lastColumn="0" w:lastRow="0" w:noHBand="0" w:noVBand="1" w:val="04A0"/>
+      </w:tblPr>
+      <w:tblGrid>
+        <w:gridCol w:w="2351"/>
+        <w:gridCol w:w="2351"/>
+        <w:gridCol w:w="2351"/>
+        <w:gridCol w:w="2351"/>
+      </w:tblGrid>
+      <w:tr>
+        <w:tc>
+          <w:tcPr>
+            <w:tcW w:type="dxa" w:w="1134"/>
+            <w:shd w:val="clear" w:color="auto" w:fill="D9E1F2"/>
+          </w:tcPr>
+          <w:p>
+            <w:pPr>
+              <w:spacing w:before="80" w:after="80"/>
+              <w:jc w:val="center"/>
+            </w:pPr>
+            <w:r/>
+            <w:r>
+              <w:rPr>
+                <w:rFonts w:ascii="Times New Roman" w:hAnsi="Times New Roman"/>
+                <w:b/>
+                <w:i w:val="0"/>
+                <w:sz w:val="22"/>
+              </w:rPr>
+              <w:t>Giai đoạn</w:t>
+            </w:r>
+          </w:p>
+        </w:tc>
+        <w:tc>
+          <w:tcPr>
+            <w:tcW w:type="dxa" w:w="1814"/>
+            <w:shd w:val="clear" w:color="auto" w:fill="D9E1F2"/>
+          </w:tcPr>
+          <w:p>
+            <w:pPr>
+              <w:spacing w:before="80" w:after="80"/>
+              <w:jc w:val="center"/>
+            </w:pPr>
+            <w:r/>
+            <w:r>
+              <w:rPr>
+                <w:rFonts w:ascii="Times New Roman" w:hAnsi="Times New Roman"/>
+                <w:b/>
+                <w:i w:val="0"/>
+                <w:sz w:val="22"/>
+              </w:rPr>
+              <w:t>Thời gian</w:t>
+            </w:r>
+          </w:p>
+        </w:tc>
+        <w:tc>
+          <w:tcPr>
+            <w:tcW w:type="dxa" w:w="3685"/>
+            <w:shd w:val="clear" w:color="auto" w:fill="D9E1F2"/>
+          </w:tcPr>
+          <w:p>
+            <w:pPr>
+              <w:spacing w:before="80" w:after="80"/>
+              <w:jc w:val="center"/>
+            </w:pPr>
+            <w:r/>
+            <w:r>
+              <w:rPr>
+                <w:rFonts w:ascii="Times New Roman" w:hAnsi="Times New Roman"/>
+                <w:b/>
+                <w:i w:val="0"/>
+                <w:sz w:val="22"/>
+              </w:rPr>
+              <w:t>Trụ cột tính năng phát triển</w:t>
+            </w:r>
+          </w:p>
+        </w:tc>
+        <w:tc>
+          <w:tcPr>
+            <w:tcW w:type="dxa" w:w="2438"/>
+            <w:shd w:val="clear" w:color="auto" w:fill="D9E1F2"/>
+          </w:tcPr>
+          <w:p>
+            <w:pPr>
+              <w:spacing w:before="80" w:after="80"/>
+              <w:jc w:val="center"/>
+            </w:pPr>
+            <w:r/>
+            <w:r>
+              <w:rPr>
+                <w:rFonts w:ascii="Times New Roman" w:hAnsi="Times New Roman"/>
+                <w:b/>
+                <w:i w:val="0"/>
+                <w:sz w:val="22"/>
+              </w:rPr>
+              <w:t>Mục tiêu kỳ vọng</w:t>
+            </w:r>
+          </w:p>
+        </w:tc>
+      </w:tr>
+      <w:tr>
+        <w:tc>
+          <w:tcPr>
+            <w:tcW w:type="dxa" w:w="1134"/>
+          </w:tcPr>
+          <w:p>
+            <w:pPr>
+              <w:spacing w:line="276" w:lineRule="auto" w:before="60" w:after="60"/>
+              <w:jc w:val="center"/>
+            </w:pPr>
+            <w:r/>
+            <w:r>
+              <w:rPr>
+                <w:rFonts w:ascii="Times New Roman" w:hAnsi="Times New Roman"/>
+                <w:b w:val="0"/>
+                <w:i w:val="0"/>
+                <w:sz w:val="21"/>
+              </w:rPr>
+              <w:t>Giai đoạn 1</w:t>
+            </w:r>
+          </w:p>
+        </w:tc>
+        <w:tc>
+          <w:tcPr>
+            <w:tcW w:type="dxa" w:w="1814"/>
+          </w:tcPr>
+          <w:p>
+            <w:pPr>
+              <w:spacing w:line="276" w:lineRule="auto" w:before="60" w:after="60"/>
+              <w:jc w:val="center"/>
+            </w:pPr>
+            <w:r/>
+            <w:r>
+              <w:rPr>
+                <w:rFonts w:ascii="Times New Roman" w:hAnsi="Times New Roman"/>
+                <w:b w:val="0"/>
+                <w:i w:val="0"/>
+                <w:sz w:val="21"/>
+              </w:rPr>
+              <w:t>Quý 4/2026</w:t>
+            </w:r>
+          </w:p>
+        </w:tc>
+        <w:tc>
+          <w:tcPr>
+            <w:tcW w:type="dxa" w:w="3685"/>
+          </w:tcPr>
+          <w:p>
+            <w:pPr>
+              <w:spacing w:line="276" w:lineRule="auto" w:before="60" w:after="60"/>
+              <w:jc w:val="left"/>
+            </w:pPr>
+            <w:r/>
+            <w:r>
+              <w:rPr>
+                <w:rFonts w:ascii="Times New Roman" w:hAnsi="Times New Roman"/>
+                <w:b w:val="0"/>
+                <w:i w:val="0"/>
+                <w:sz w:val="21"/>
+              </w:rPr>
+              <w:t>Tích hợp AI Chatbot RAG 24/7 trên Next.js và đồng bộ Zalo OA Webhook.</w:t>
+            </w:r>
+          </w:p>
+        </w:tc>
+        <w:tc>
+          <w:tcPr>
+            <w:tcW w:type="dxa" w:w="2438"/>
+          </w:tcPr>
+          <w:p>
+            <w:pPr>
+              <w:spacing w:line="276" w:lineRule="auto" w:before="60" w:after="60"/>
+              <w:jc w:val="left"/>
+            </w:pPr>
+            <w:r/>
+            <w:r>
+              <w:rPr>
+                <w:rFonts w:ascii="Times New Roman" w:hAnsi="Times New Roman"/>
+                <w:b w:val="0"/>
+                <w:i w:val="0"/>
+                <w:sz w:val="21"/>
+              </w:rPr>
+              <w:t>Tự động phản hồi 100% thắc mắc của khách hàng, tăng 40% tỷ lệ chuyển đổi Lead.</w:t>
+            </w:r>
+          </w:p>
+        </w:tc>
+      </w:tr>
+      <w:tr>
+        <w:tc>
+          <w:tcPr>
+            <w:tcW w:type="dxa" w:w="1134"/>
+          </w:tcPr>
+          <w:p>
+            <w:pPr>
+              <w:spacing w:line="276" w:lineRule="auto" w:before="60" w:after="60"/>
+              <w:jc w:val="center"/>
+            </w:pPr>
+            <w:r/>
+            <w:r>
+              <w:rPr>
+                <w:rFonts w:ascii="Times New Roman" w:hAnsi="Times New Roman"/>
+                <w:b w:val="0"/>
+                <w:i w:val="0"/>
+                <w:sz w:val="21"/>
+              </w:rPr>
+              <w:t>Giai đoạn 2</w:t>
+            </w:r>
+          </w:p>
+        </w:tc>
+        <w:tc>
+          <w:tcPr>
+            <w:tcW w:type="dxa" w:w="1814"/>
+          </w:tcPr>
+          <w:p>
+            <w:pPr>
+              <w:spacing w:line="276" w:lineRule="auto" w:before="60" w:after="60"/>
+              <w:jc w:val="center"/>
+            </w:pPr>
+            <w:r/>
+            <w:r>
+              <w:rPr>
+                <w:rFonts w:ascii="Times New Roman" w:hAnsi="Times New Roman"/>
+                <w:b w:val="0"/>
+                <w:i w:val="0"/>
+                <w:sz w:val="21"/>
+              </w:rPr>
+              <w:t>Quý 1/2027</w:t>
+            </w:r>
+          </w:p>
+        </w:tc>
+        <w:tc>
+          <w:tcPr>
+            <w:tcW w:type="dxa" w:w="3685"/>
+          </w:tcPr>
+          <w:p>
+            <w:pPr>
+              <w:spacing w:line="276" w:lineRule="auto" w:before="60" w:after="60"/>
+              <w:jc w:val="left"/>
+            </w:pPr>
+            <w:r/>
+            <w:r>
+              <w:rPr>
+                <w:rFonts w:ascii="Times New Roman" w:hAnsi="Times New Roman"/>
+                <w:b w:val="0"/>
+                <w:i w:val="0"/>
+                <w:sz w:val="21"/>
+              </w:rPr>
+              <w:t>Phát triển Content Repurposing Engine tự động đăng bài lên Meta Threads và Facebook Fanpage.</w:t>
+            </w:r>
+          </w:p>
+        </w:tc>
+        <w:tc>
+          <w:tcPr>
+            <w:tcW w:type="dxa" w:w="2438"/>
+          </w:tcPr>
+          <w:p>
+            <w:pPr>
+              <w:spacing w:line="276" w:lineRule="auto" w:before="60" w:after="60"/>
+              <w:jc w:val="left"/>
+            </w:pPr>
+            <w:r/>
+            <w:r>
+              <w:rPr>
+                <w:rFonts w:ascii="Times New Roman" w:hAnsi="Times New Roman"/>
+                <w:b w:val="0"/>
+                <w:i w:val="0"/>
+                <w:sz w:val="21"/>
+              </w:rPr>
+              <w:t>Tự động phủ sóng đa kênh, giảm 90% thời gian biên tập mạng xã hội.</w:t>
+            </w:r>
+          </w:p>
+        </w:tc>
+      </w:tr>
+      <w:tr>
+        <w:tc>
+          <w:tcPr>
+            <w:tcW w:type="dxa" w:w="1134"/>
+          </w:tcPr>
+          <w:p>
+            <w:pPr>
+              <w:spacing w:line="276" w:lineRule="auto" w:before="60" w:after="60"/>
+              <w:jc w:val="center"/>
+            </w:pPr>
+            <w:r/>
+            <w:r>
+              <w:rPr>
+                <w:rFonts w:ascii="Times New Roman" w:hAnsi="Times New Roman"/>
+                <w:b w:val="0"/>
+                <w:i w:val="0"/>
+                <w:sz w:val="21"/>
+              </w:rPr>
+              <w:t>Giai đoạn 3</w:t>
+            </w:r>
+          </w:p>
+        </w:tc>
+        <w:tc>
+          <w:tcPr>
+            <w:tcW w:type="dxa" w:w="1814"/>
+          </w:tcPr>
+          <w:p>
+            <w:pPr>
+              <w:spacing w:line="276" w:lineRule="auto" w:before="60" w:after="60"/>
+              <w:jc w:val="center"/>
+            </w:pPr>
+            <w:r/>
+            <w:r>
+              <w:rPr>
+                <w:rFonts w:ascii="Times New Roman" w:hAnsi="Times New Roman"/>
+                <w:b w:val="0"/>
+                <w:i w:val="0"/>
+                <w:sz w:val="21"/>
+              </w:rPr>
+              <w:t>Quý 2/2027</w:t>
+            </w:r>
+          </w:p>
+        </w:tc>
+        <w:tc>
+          <w:tcPr>
+            <w:tcW w:type="dxa" w:w="3685"/>
+          </w:tcPr>
+          <w:p>
+            <w:pPr>
+              <w:spacing w:line="276" w:lineRule="auto" w:before="60" w:after="60"/>
+              <w:jc w:val="left"/>
+            </w:pPr>
+            <w:r/>
+            <w:r>
+              <w:rPr>
+                <w:rFonts w:ascii="Times New Roman" w:hAnsi="Times New Roman"/>
+                <w:b w:val="0"/>
+                <w:i w:val="0"/>
+                <w:sz w:val="21"/>
+              </w:rPr>
+              <w:t>Đóng gói toàn bộ giải pháp thành nền tảng SaaS thương mại hóa (B2B AI Marketing Suite).</w:t>
+            </w:r>
+          </w:p>
+        </w:tc>
+        <w:tc>
+          <w:tcPr>
+            <w:tcW w:type="dxa" w:w="2438"/>
+          </w:tcPr>
+          <w:p>
+            <w:pPr>
+              <w:spacing w:line="276" w:lineRule="auto" w:before="60" w:after="60"/>
+              <w:jc w:val="left"/>
+            </w:pPr>
+            <w:r/>
+            <w:r>
+              <w:rPr>
+                <w:rFonts w:ascii="Times New Roman" w:hAnsi="Times New Roman"/>
+                <w:b w:val="0"/>
+                <w:i w:val="0"/>
+                <w:sz w:val="21"/>
+              </w:rPr>
+              <w:t>Cung cấp giải pháp cho hơn 100 doanh nghiệp SMBs, tạo dòng tiền thuê bao định kỳ.</w:t>
+            </w:r>
+          </w:p>
+        </w:tc>
+      </w:tr>
+    </w:tbl>
     <w:p>
       <w:r>
         <w:br w:type="page"/>

</xml_diff>

<commit_message>
feat: Bo sung Tru cot 4 - Co may Cao du lieu Khach hang B2B Lead Scraping (Website, FB Groups, Zalo Groups) voi Mo hinh Loi ich Kep
</commit_message>
<xml_diff>
--- a/Bao_Cao_Thuc_Tap.docx
+++ b/Bao_Cao_Thuc_Tap.docx
@@ -8129,7 +8129,184 @@
           <w:i/>
           <w:sz w:val="26"/>
         </w:rPr>
-        <w:t>7.3.4. Bảng Lộ trình Phát triển Hệ sinh thái 3 Giai đoạn (Product Development Roadmap)</w:t>
+        <w:t>7.3.4. Trụ cột 4: Cỗ máy Khai phá Dữ liệu Khách hàng Đa nền tảng (B2B Lead Scraping &amp; Intelligence Engine)</w:t>
+      </w:r>
+    </w:p>
+    <w:p>
+      <w:pPr>
+        <w:spacing w:line="312" w:lineRule="auto" w:after="100"/>
+        <w:ind w:firstLine="720"/>
+        <w:jc w:val="both"/>
+      </w:pPr>
+      <w:r>
+        <w:rPr>
+          <w:rFonts w:ascii="Times New Roman" w:hAnsi="Times New Roman"/>
+          <w:b w:val="0"/>
+          <w:i w:val="0"/>
+          <w:sz w:val="26"/>
+        </w:rPr>
+        <w:t>Nhằm giải quyết bài toán cốt lõi của mọi doanh nghiệp là 'Tìm kiếm khách hàng mới', nhóm nghiên cứu định hướng xây dựng module Cào dữ liệu &amp; Định danh khách hàng tiềm năng (Lead Scraping &amp; Intelligence Engine) vận hành trên nền tảng Headless Browser (Playwright / Puppeteer) kết hợp AI phân loại ý định mua sắm (Intent Classification). Cỗ máy quét dữ liệu từ 3 nguồn trọng yếu:</w:t>
+      </w:r>
+    </w:p>
+    <w:p>
+      <w:pPr>
+        <w:pStyle w:val="ListBullet"/>
+        <w:spacing w:line="312" w:lineRule="auto" w:after="60"/>
+        <w:ind w:left="720"/>
+        <w:jc w:val="both"/>
+      </w:pPr>
+      <w:r>
+        <w:rPr>
+          <w:rFonts w:ascii="Times New Roman" w:hAnsi="Times New Roman"/>
+          <w:b/>
+          <w:i w:val="0"/>
+          <w:sz w:val="26"/>
+        </w:rPr>
+        <w:t xml:space="preserve">• </w:t>
+      </w:r>
+      <w:r>
+        <w:rPr>
+          <w:rFonts w:ascii="Times New Roman" w:hAnsi="Times New Roman"/>
+          <w:b w:val="0"/>
+          <w:i w:val="0"/>
+          <w:sz w:val="26"/>
+        </w:rPr>
+        <w:t>Quét Website Doanh nghiệp: Tự động trích xuất thông tin doanh nghiệp (Mã số thuế, email lãnh đạo, hotline), đồng thời đo ngầm chỉ số Google Lighthouse của website họ. Nếu phát hiện website của họ đạt dưới 50 điểm hoặc tải quá 5 giây, hệ thống sẽ tự động gắn cờ 'Khách hàng nóng cần Tái thiết số'.</w:t>
+      </w:r>
+    </w:p>
+    <w:p>
+      <w:pPr>
+        <w:pStyle w:val="ListBullet"/>
+        <w:spacing w:line="312" w:lineRule="auto" w:after="60"/>
+        <w:ind w:left="720"/>
+        <w:jc w:val="both"/>
+      </w:pPr>
+      <w:r>
+        <w:rPr>
+          <w:rFonts w:ascii="Times New Roman" w:hAnsi="Times New Roman"/>
+          <w:b/>
+          <w:i w:val="0"/>
+          <w:sz w:val="26"/>
+        </w:rPr>
+        <w:t xml:space="preserve">• </w:t>
+      </w:r>
+      <w:r>
+        <w:rPr>
+          <w:rFonts w:ascii="Times New Roman" w:hAnsi="Times New Roman"/>
+          <w:b w:val="0"/>
+          <w:i w:val="0"/>
+          <w:sz w:val="26"/>
+        </w:rPr>
+        <w:t>Quét Hội nhóm Facebook Doanh nghiệp &amp; B2B: Lắng nghe và bóc tách các bài đăng tìm kiếm đối tác, nhu cầu làm website, booking báo chí truyền thông hoặc tìm nhà cung ứng.</w:t>
+      </w:r>
+    </w:p>
+    <w:p>
+      <w:pPr>
+        <w:pStyle w:val="ListBullet"/>
+        <w:spacing w:line="312" w:lineRule="auto" w:after="60"/>
+        <w:ind w:left="720"/>
+        <w:jc w:val="both"/>
+      </w:pPr>
+      <w:r>
+        <w:rPr>
+          <w:rFonts w:ascii="Times New Roman" w:hAnsi="Times New Roman"/>
+          <w:b/>
+          <w:i w:val="0"/>
+          <w:sz w:val="26"/>
+        </w:rPr>
+        <w:t xml:space="preserve">• </w:t>
+      </w:r>
+      <w:r>
+        <w:rPr>
+          <w:rFonts w:ascii="Times New Roman" w:hAnsi="Times New Roman"/>
+          <w:b w:val="0"/>
+          <w:i w:val="0"/>
+          <w:sz w:val="26"/>
+        </w:rPr>
+        <w:t>Quét Nhóm Zalo Ngành nghề &amp; Hiệp hội: Thu thập danh bạ và nhu cầu kết nối giao thương trong các cộng đồng kinh doanh chuyên biệt.</w:t>
+      </w:r>
+    </w:p>
+    <w:p>
+      <w:pPr>
+        <w:spacing w:line="312" w:lineRule="auto" w:after="100"/>
+        <w:ind w:firstLine="720"/>
+        <w:jc w:val="both"/>
+      </w:pPr>
+      <w:r>
+        <w:rPr>
+          <w:rFonts w:ascii="Times New Roman" w:hAnsi="Times New Roman"/>
+          <w:b w:val="0"/>
+          <w:i w:val="0"/>
+          <w:sz w:val="26"/>
+        </w:rPr>
+        <w:t>Mô hình này mang lại Giá trị Kép (Dual-Value Architecture) độc nhất vô nhị:</w:t>
+      </w:r>
+    </w:p>
+    <w:p>
+      <w:pPr>
+        <w:pStyle w:val="ListBullet"/>
+        <w:spacing w:line="312" w:lineRule="auto" w:after="60"/>
+        <w:ind w:left="720"/>
+        <w:jc w:val="both"/>
+      </w:pPr>
+      <w:r>
+        <w:rPr>
+          <w:rFonts w:ascii="Times New Roman" w:hAnsi="Times New Roman"/>
+          <w:b/>
+          <w:i w:val="0"/>
+          <w:sz w:val="26"/>
+        </w:rPr>
+        <w:t xml:space="preserve">1. </w:t>
+      </w:r>
+      <w:r>
+        <w:rPr>
+          <w:rFonts w:ascii="Times New Roman" w:hAnsi="Times New Roman"/>
+          <w:b w:val="0"/>
+          <w:i w:val="0"/>
+          <w:sz w:val="26"/>
+        </w:rPr>
+        <w:t>Lợi ích cho chính Hừng Đông Media (Inward Acquisition): Tạo ra nguồn khách hàng tiềm năng dồi dào, tự động và liên tục cho đội ngũ kinh doanh chào bán các gói dịch vụ Tái Thiết Số (35 - 50 triệu) và Thuê bao Nuôi Web AI (7 triệu/tháng) mà không tốn chi phí quảng cáo trả phí (Paid Ads).</w:t>
+      </w:r>
+    </w:p>
+    <w:p>
+      <w:pPr>
+        <w:pStyle w:val="ListBullet"/>
+        <w:spacing w:line="312" w:lineRule="auto" w:after="60"/>
+        <w:ind w:left="720"/>
+        <w:jc w:val="both"/>
+      </w:pPr>
+      <w:r>
+        <w:rPr>
+          <w:rFonts w:ascii="Times New Roman" w:hAnsi="Times New Roman"/>
+          <w:b/>
+          <w:i w:val="0"/>
+          <w:sz w:val="26"/>
+        </w:rPr>
+        <w:t xml:space="preserve">2. </w:t>
+      </w:r>
+      <w:r>
+        <w:rPr>
+          <w:rFonts w:ascii="Times New Roman" w:hAnsi="Times New Roman"/>
+          <w:b w:val="0"/>
+          <w:i w:val="0"/>
+          <w:sz w:val="26"/>
+        </w:rPr>
+        <w:t>Lợi ích giúp khách hàng của Hừng Đông tìm khách hàng của họ (Outward Growth Service): Tính năng này được đóng gói thành một 'Vũ khí bán hàng giá trị gia tăng' (Value-Added Feature). Khách hàng khi ký hợp đồng với Hừng Đông không chỉ sở hữu một website siêu tốc 100/100 chuẩn GEO, mà còn được hệ thống tự động quét và cung cấp danh sách khách hàng tiềm năng trong chính ngành nghề của họ hàng tuần.</w:t>
+      </w:r>
+    </w:p>
+    <w:p>
+      <w:pPr>
+        <w:keepNext/>
+        <w:spacing w:before="180" w:after="80"/>
+      </w:pPr>
+      <w:r>
+        <w:rPr>
+          <w:rFonts w:ascii="Times New Roman" w:hAnsi="Times New Roman"/>
+          <w:b/>
+          <w:i/>
+          <w:sz w:val="26"/>
+        </w:rPr>
+        <w:t>7.3.5. Bảng Lộ trình Phát triển Hệ sinh thái 3 Giai đoạn (Product Development Roadmap)</w:t>
       </w:r>
     </w:p>
     <w:p>
@@ -8396,7 +8573,7 @@
                 <w:i w:val="0"/>
                 <w:sz w:val="21"/>
               </w:rPr>
-              <w:t>Phát triển Content Repurposing Engine tự động đăng bài lên Meta Threads và Facebook Fanpage.</w:t>
+              <w:t>Phát triển Content Repurposing Engine (Threads/FB) và Module Cào dữ liệu Lead Scraping.</w:t>
             </w:r>
           </w:p>
         </w:tc>
@@ -8417,7 +8594,7 @@
                 <w:i w:val="0"/>
                 <w:sz w:val="21"/>
               </w:rPr>
-              <w:t>Tự động phủ sóng đa kênh, giảm 90% thời gian biên tập mạng xã hội.</w:t>
+              <w:t>Tự động phủ sóng mạng xã hội, tự động tìm kiếm khách hàng tiềm năng cho Hừng Đông và đối tác.</w:t>
             </w:r>
           </w:p>
         </w:tc>

</xml_diff>